<commit_message>
Update thesis finalization and review artifacts
</commit_message>
<xml_diff>
--- a/docs/generated/thesis_final.docx
+++ b/docs/generated/thesis_final.docx
@@ -836,14 +836,36 @@
     </w:p>
     <w:p>
       <w:pPr>
-        <w:spacing w:line="400" w:lineRule="exact"/>
+        <w:widowControl/>
+        <w:spacing w:line="400" w:lineRule="exact" w:before="0" w:after="0"/>
         <w:ind w:firstLine="482"/>
         <w:rPr>
           <w:sz w:val="24"/>
         </w:rPr>
       </w:pPr>
       <w:r>
+        <w:rPr>
+          <w:rFonts w:ascii="Times New Roman" w:hAnsi="Times New Roman" w:eastAsia="宋体"/>
+          <w:sz w:val="24"/>
+        </w:rPr>
         <w:t>本人声明所呈交的毕业论文（设计），题目 基于 Spring Boot 的校园社交匹配与可解释推荐系统的设计与实现 是本人在指导教师的指导下，独立进行研究工作所取得的成果。尽我所知，除了文中特别加以标注和致谢中所罗列的内容以外，论文中不包含其他人已经发表或撰写过的研究成果，也不包含为获得北京交通大学或其他教育机构的学位或证书而使用过的材料。</w:t>
+      </w:r>
+    </w:p>
+    <w:p>
+      <w:pPr>
+        <w:widowControl/>
+        <w:spacing w:line="400" w:lineRule="exact" w:before="0" w:after="0"/>
+        <w:ind w:firstLineChars="200" w:firstLine="480"/>
+        <w:rPr>
+          <w:sz w:val="24"/>
+        </w:rPr>
+      </w:pPr>
+      <w:r>
+        <w:rPr>
+          <w:rFonts w:hint="eastAsia" w:ascii="Times New Roman" w:hAnsi="Times New Roman" w:eastAsia="宋体"/>
+          <w:sz w:val="24"/>
+        </w:rPr>
+        <w:t>申请学位论文与资料若有不实之处，本人承担一切相关责任。</w:t>
       </w:r>
     </w:p>
     <w:p>
@@ -854,41 +876,26 @@
           <w:sz w:val="24"/>
         </w:rPr>
       </w:pPr>
-      <w:r>
-        <w:rPr>
-          <w:rFonts w:hint="eastAsia"/>
+    </w:p>
+    <w:p>
+      <w:pPr>
+        <w:widowControl/>
+        <w:spacing w:line="400" w:lineRule="exact" w:before="0" w:after="0"/>
+        <w:ind w:firstLineChars="200" w:firstLine="480"/>
+        <w:rPr>
           <w:sz w:val="24"/>
         </w:rPr>
-        <w:t>申请学位论文与资料若有不实之处，本人承担一切相关责任。</w:t>
-      </w:r>
-    </w:p>
-    <w:p>
-      <w:pPr>
-        <w:spacing w:line="400" w:lineRule="exact"/>
-        <w:ind w:firstLineChars="200" w:firstLine="480"/>
-        <w:rPr>
+      </w:pPr>
+      <w:r>
+        <w:rPr>
+          <w:rFonts w:hint="eastAsia" w:ascii="Times New Roman" w:hAnsi="Times New Roman" w:eastAsia="宋体"/>
           <w:sz w:val="24"/>
         </w:rPr>
-      </w:pPr>
-    </w:p>
-    <w:p>
-      <w:pPr>
-        <w:spacing w:line="400" w:lineRule="exact"/>
-        <w:ind w:firstLineChars="200" w:firstLine="480"/>
-        <w:rPr>
-          <w:sz w:val="24"/>
-        </w:rPr>
-      </w:pPr>
-      <w:r>
-        <w:rPr>
-          <w:rFonts w:hint="eastAsia"/>
-          <w:sz w:val="24"/>
-        </w:rPr>
         <w:t>本人签名：</w:t>
       </w:r>
       <w:r>
         <w:rPr>
-          <w:rFonts w:hint="eastAsia"/>
+          <w:rFonts w:hint="eastAsia" w:ascii="Times New Roman" w:hAnsi="Times New Roman" w:eastAsia="宋体"/>
           <w:sz w:val="24"/>
           <w:u w:val="single"/>
         </w:rPr>
@@ -896,21 +903,21 @@
       </w:r>
       <w:r>
         <w:rPr>
-          <w:rFonts w:hint="eastAsia"/>
+          <w:rFonts w:hint="eastAsia" w:ascii="Times New Roman" w:hAnsi="Times New Roman" w:eastAsia="宋体"/>
           <w:sz w:val="24"/>
         </w:rPr>
         <w:t xml:space="preserve">    </w:t>
       </w:r>
       <w:r>
         <w:rPr>
-          <w:rFonts w:hint="eastAsia"/>
+          <w:rFonts w:hint="eastAsia" w:ascii="Times New Roman" w:hAnsi="Times New Roman" w:eastAsia="宋体"/>
           <w:sz w:val="24"/>
         </w:rPr>
         <w:t>日期：</w:t>
       </w:r>
       <w:r>
         <w:rPr>
-          <w:rFonts w:hint="eastAsia"/>
+          <w:rFonts w:hint="eastAsia" w:ascii="Times New Roman" w:hAnsi="Times New Roman" w:eastAsia="宋体"/>
           <w:sz w:val="24"/>
           <w:u w:val="single"/>
         </w:rPr>
@@ -932,6 +939,7 @@
       </w:pPr>
     </w:p>
     <w:p>
+      <w:bookmarkStart w:id="1" w:name="_TocLCJ001"/>
       <w:pPr>
         <w:pStyle w:val="af0"/>
         <w:keepNext/>
@@ -948,6 +956,7 @@
         </w:rPr>
         <w:t>中文摘要</w:t>
       </w:r>
+      <w:bookmarkEnd w:id="1"/>
     </w:p>
     <w:p>
       <w:pPr>
@@ -997,7 +1006,7 @@
           <w:b w:val="0"/>
           <w:sz w:val="24"/>
         </w:rPr>
-        <w:t>测试结果表明，系统能够完成用户标签维护、画像生成、候选召回、排序重排、推荐解释和反馈更新的完整流程。功能测试覆盖用户与标签维护、画像构建与推荐生成、推荐解释、用户反馈与画像更新、透明链路与评估展示等需求；非功能测试覆盖响应可用性、解释可追溯性、模块边界和测试材料可复核性。在包含 18 个用户、18 个标签和 86 条用户标签关系的测试数据集上，系统能够稳定返回推荐结果，并保留推荐分数、匹配标签、规则命中、可信连接原因和解释文本。离线评估结果显示，最终采用的改进 TF-IDF + 场景规则重排方案能够在保持推荐结果可用的基础上提供更完整的覆盖、场景适配和解释证据，能够支撑小规模校园社交匹配场景下的推荐生成、解释展示和结果复核。</w:t>
+        <w:t>测试结果表明，系统能够完成用户标签维护、画像生成、候选召回、排序重排、推荐解释和反馈更新的完整流程。功能测试覆盖用户与标签维护、画像构建与推荐生成、推荐解释、用户反馈与画像更新、透明链路与评估展示等需求；非功能测试覆盖响应可用性、解释可追溯性、模块边界和测试材料可复核性。在包含 18 个用户、18 个标签和 86 条用户标签关系的演示数据集上，系统能够稳定返回推荐结果，并保留推荐分数、匹配标签、规则命中、可信连接原因和解释文本。系统还补充了固定种子的扩展评估数据生成与导出能力，在 100、300 和 500 用户规模下对推荐策略进行复核。离线评估结果显示，最终采用的改进 TF-IDF + 场景规则重排方案能够在保持推荐结果可用的基础上提供更完整的覆盖、场景适配和解释证据，能够支撑校园社交匹配场景下的推荐生成、解释展示和结果复核。</w:t>
       </w:r>
     </w:p>
     <w:p>
@@ -1030,7 +1039,7 @@
           <w:b w:val="0"/>
           <w:sz w:val="21"/>
         </w:rPr>
-        <w:t>图 21 幅，表 30 个，参考文献 31 篇。</w:t>
+        <w:t>图 21 幅，表 31 个，参考文献 31 篇。</w:t>
       </w:r>
     </w:p>
     <w:p>
@@ -1047,6 +1056,7 @@
       </w:pPr>
     </w:p>
     <w:p>
+      <w:bookmarkStart w:id="2" w:name="_TocLCJ002"/>
       <w:pPr>
         <w:pStyle w:val="af0"/>
         <w:keepNext/>
@@ -1063,6 +1073,7 @@
         </w:rPr>
         <w:t>Abstract</w:t>
       </w:r>
+      <w:bookmarkEnd w:id="2"/>
     </w:p>
     <w:p>
       <w:pPr>
@@ -1112,7 +1123,7 @@
           <w:b w:val="0"/>
           <w:sz w:val="24"/>
         </w:rPr>
-        <w:t>The test results show that the system can complete the full process of user tag maintenance, profile generation, candidate recall, ranking and reranking, recommendation explanation, and feedback update. Functional tests cover user and tag maintenance, profile construction and recommendation generation, recommendation explanation, user feedback and profile update, transparent pipeline display, and evaluation display. Non-functional tests cover response availability, explanation traceability, module boundaries, and reproducibility of test materials. On a test dataset with 18 users, 18 tags, and 86 user-tag relations, recommendation results are returned with scores, matched tags, rule hits, trust reasons, and explanation text. The offline evaluation shows that the final strategy, improved TF-IDF with scenario-rule reranking, provides more complete coverage, scenario adaptation, and explanation evidence while keeping recommendation results usable. The system can support recommendation generation, explanation display, and result verification in small-scale campus social matching scenarios.</w:t>
+        <w:t>The test results show that the system can complete the full process of user tag maintenance, profile generation, candidate recall, ranking and reranking, recommendation explanation, and feedback update. Functional tests cover user and tag maintenance, profile construction and recommendation generation, recommendation explanation, user feedback and profile update, transparent pipeline display, and evaluation display. Non-functional tests cover response availability, explanation traceability, module boundaries, and reproducibility of test materials. On a demonstration dataset with 18 users, 18 tags, and 86 user-tag relations, recommendation results are returned with scores, matched tags, rule hits, trust reasons, and explanation text. A fixed-seed extended evaluation dataset is also generated to verify recommendation strategies at user scales of 100, 300, and 500. The offline evaluation shows that the final strategy, improved TF-IDF with scenario-rule reranking, provides more complete coverage, scenario adaptation, and explanation evidence while keeping recommendation results usable. The system can support recommendation generation, explanation display, and result verification in campus social matching scenarios.</w:t>
       </w:r>
     </w:p>
     <w:p>
@@ -1145,6 +1156,7 @@
       </w:pPr>
     </w:p>
     <w:p>
+      <w:bookmarkStart w:id="3" w:name="_TocLCJ003"/>
       <w:pPr>
         <w:pStyle w:val="af0"/>
         <w:keepNext/>
@@ -1161,6 +1173,7 @@
         </w:rPr>
         <w:t>目    录</w:t>
       </w:r>
+      <w:bookmarkEnd w:id="3"/>
     </w:p>
     <w:p>
       <w:pPr>
@@ -1172,16 +1185,17 @@
         <w:jc w:val="left"/>
       </w:pPr>
       <w:r/>
-      <w:r>
-        <w:rPr>
-          <w:rFonts w:ascii="Times New Roman" w:hAnsi="Times New Roman" w:eastAsia="黑体"/>
-          <w:b w:val="0"/>
-          <w:sz w:val="24"/>
-        </w:rPr>
-        <w:t>中文摘要</w:t>
-        <w:tab/>
-        <w:t>i</w:t>
-      </w:r>
+      <w:hyperlink w:anchor="_TocLCJ001" w:history="1">
+        <w:r>
+          <w:rPr>
+            <w:rFonts w:eastAsia="黑体" w:ascii="Times New Roman" w:hAnsi="Times New Roman"/>
+            <w:sz w:val="24"/>
+          </w:rPr>
+          <w:t xml:space="preserve">中文摘要</w:t>
+          <w:tab/>
+          <w:t xml:space="preserve">i</w:t>
+        </w:r>
+      </w:hyperlink>
     </w:p>
     <w:p>
       <w:pPr>
@@ -1193,16 +1207,17 @@
         <w:jc w:val="left"/>
       </w:pPr>
       <w:r/>
-      <w:r>
-        <w:rPr>
-          <w:rFonts w:ascii="Times New Roman" w:hAnsi="Times New Roman" w:eastAsia="黑体"/>
-          <w:b w:val="0"/>
-          <w:sz w:val="24"/>
-        </w:rPr>
-        <w:t>ABSTRACT</w:t>
-        <w:tab/>
-        <w:t>ii</w:t>
-      </w:r>
+      <w:hyperlink w:anchor="_TocLCJ002" w:history="1">
+        <w:r>
+          <w:rPr>
+            <w:rFonts w:eastAsia="黑体" w:ascii="Times New Roman" w:hAnsi="Times New Roman"/>
+            <w:sz w:val="24"/>
+          </w:rPr>
+          <w:t xml:space="preserve">ABSTRACT</w:t>
+          <w:tab/>
+          <w:t xml:space="preserve">ii</w:t>
+        </w:r>
+      </w:hyperlink>
     </w:p>
     <w:p>
       <w:pPr>
@@ -1214,16 +1229,17 @@
         <w:jc w:val="left"/>
       </w:pPr>
       <w:r/>
-      <w:r>
-        <w:rPr>
-          <w:rFonts w:ascii="Times New Roman" w:hAnsi="Times New Roman" w:eastAsia="黑体"/>
-          <w:b w:val="0"/>
-          <w:sz w:val="24"/>
-        </w:rPr>
-        <w:t>目    录</w:t>
-        <w:tab/>
-        <w:t>iv</w:t>
-      </w:r>
+      <w:hyperlink w:anchor="_TocLCJ003" w:history="1">
+        <w:r>
+          <w:rPr>
+            <w:rFonts w:eastAsia="黑体" w:ascii="Times New Roman" w:hAnsi="Times New Roman"/>
+            <w:sz w:val="24"/>
+          </w:rPr>
+          <w:t xml:space="preserve">目    录</w:t>
+          <w:tab/>
+          <w:t xml:space="preserve">iv</w:t>
+        </w:r>
+      </w:hyperlink>
     </w:p>
     <w:p>
       <w:pPr>
@@ -1235,16 +1251,17 @@
         <w:jc w:val="left"/>
       </w:pPr>
       <w:r/>
-      <w:r>
-        <w:rPr>
-          <w:rFonts w:ascii="Times New Roman" w:hAnsi="Times New Roman" w:eastAsia="黑体"/>
-          <w:b w:val="0"/>
-          <w:sz w:val="24"/>
-        </w:rPr>
-        <w:t>1 引言</w:t>
-        <w:tab/>
-        <w:t>1</w:t>
-      </w:r>
+      <w:hyperlink w:anchor="_TocLCJ004" w:history="1">
+        <w:r>
+          <w:rPr>
+            <w:rFonts w:eastAsia="黑体" w:ascii="Times New Roman" w:hAnsi="Times New Roman"/>
+            <w:sz w:val="24"/>
+          </w:rPr>
+          <w:t xml:space="preserve">1 引言</w:t>
+          <w:tab/>
+          <w:t xml:space="preserve">1</w:t>
+        </w:r>
+      </w:hyperlink>
     </w:p>
     <w:p>
       <w:pPr>
@@ -1256,16 +1273,17 @@
         <w:jc w:val="left"/>
       </w:pPr>
       <w:r/>
-      <w:r>
-        <w:rPr>
-          <w:rFonts w:ascii="Times New Roman" w:hAnsi="Times New Roman" w:eastAsia="宋体"/>
-          <w:b w:val="0"/>
-          <w:sz w:val="24"/>
-        </w:rPr>
-        <w:t>1.1 项目背景与意义</w:t>
-        <w:tab/>
-        <w:t>1</w:t>
-      </w:r>
+      <w:hyperlink w:anchor="_TocLCJ005" w:history="1">
+        <w:r>
+          <w:rPr>
+            <w:rFonts w:eastAsia="宋体" w:ascii="Times New Roman" w:hAnsi="Times New Roman"/>
+            <w:sz w:val="24"/>
+          </w:rPr>
+          <w:t xml:space="preserve">1.1 项目背景与意义</w:t>
+          <w:tab/>
+          <w:t xml:space="preserve">1</w:t>
+        </w:r>
+      </w:hyperlink>
     </w:p>
     <w:p>
       <w:pPr>
@@ -1277,16 +1295,17 @@
         <w:jc w:val="left"/>
       </w:pPr>
       <w:r/>
-      <w:r>
-        <w:rPr>
-          <w:rFonts w:ascii="Times New Roman" w:hAnsi="Times New Roman" w:eastAsia="宋体"/>
-          <w:b w:val="0"/>
-          <w:sz w:val="24"/>
-        </w:rPr>
-        <w:t>1.2 国内外研究现状与同类方案分析</w:t>
-        <w:tab/>
-        <w:t>2</w:t>
-      </w:r>
+      <w:hyperlink w:anchor="_TocLCJ006" w:history="1">
+        <w:r>
+          <w:rPr>
+            <w:rFonts w:eastAsia="宋体" w:ascii="Times New Roman" w:hAnsi="Times New Roman"/>
+            <w:sz w:val="24"/>
+          </w:rPr>
+          <w:t xml:space="preserve">1.2 国内外研究现状与同类方案分析</w:t>
+          <w:tab/>
+          <w:t xml:space="preserve">2</w:t>
+        </w:r>
+      </w:hyperlink>
     </w:p>
     <w:p>
       <w:pPr>
@@ -1298,16 +1317,17 @@
         <w:jc w:val="left"/>
       </w:pPr>
       <w:r/>
-      <w:r>
-        <w:rPr>
-          <w:rFonts w:ascii="Times New Roman" w:hAnsi="Times New Roman" w:eastAsia="宋体"/>
-          <w:b w:val="0"/>
-          <w:sz w:val="24"/>
-        </w:rPr>
-        <w:t>1.3 本文主要工作内容</w:t>
-        <w:tab/>
-        <w:t>4</w:t>
-      </w:r>
+      <w:hyperlink w:anchor="_TocLCJ007" w:history="1">
+        <w:r>
+          <w:rPr>
+            <w:rFonts w:eastAsia="宋体" w:ascii="Times New Roman" w:hAnsi="Times New Roman"/>
+            <w:sz w:val="24"/>
+          </w:rPr>
+          <w:t xml:space="preserve">1.3 本文主要工作内容</w:t>
+          <w:tab/>
+          <w:t xml:space="preserve">4</w:t>
+        </w:r>
+      </w:hyperlink>
     </w:p>
     <w:p>
       <w:pPr>
@@ -1319,16 +1339,17 @@
         <w:jc w:val="left"/>
       </w:pPr>
       <w:r/>
-      <w:r>
-        <w:rPr>
-          <w:rFonts w:ascii="Times New Roman" w:hAnsi="Times New Roman" w:eastAsia="宋体"/>
-          <w:b w:val="0"/>
-          <w:sz w:val="24"/>
-        </w:rPr>
-        <w:t>1.4 本文组织结构</w:t>
-        <w:tab/>
-        <w:t>5</w:t>
-      </w:r>
+      <w:hyperlink w:anchor="_TocLCJ008" w:history="1">
+        <w:r>
+          <w:rPr>
+            <w:rFonts w:eastAsia="宋体" w:ascii="Times New Roman" w:hAnsi="Times New Roman"/>
+            <w:sz w:val="24"/>
+          </w:rPr>
+          <w:t xml:space="preserve">1.4 本文组织结构</w:t>
+          <w:tab/>
+          <w:t xml:space="preserve">5</w:t>
+        </w:r>
+      </w:hyperlink>
     </w:p>
     <w:p>
       <w:pPr>
@@ -1340,16 +1361,17 @@
         <w:jc w:val="left"/>
       </w:pPr>
       <w:r/>
-      <w:r>
-        <w:rPr>
-          <w:rFonts w:ascii="Times New Roman" w:hAnsi="Times New Roman" w:eastAsia="黑体"/>
-          <w:b w:val="0"/>
-          <w:sz w:val="24"/>
-        </w:rPr>
-        <w:t>2 校园社交匹配推荐系统相关理论及技术综述</w:t>
-        <w:tab/>
-        <w:t>7</w:t>
-      </w:r>
+      <w:hyperlink w:anchor="_TocLCJ009" w:history="1">
+        <w:r>
+          <w:rPr>
+            <w:rFonts w:eastAsia="黑体" w:ascii="Times New Roman" w:hAnsi="Times New Roman"/>
+            <w:sz w:val="24"/>
+          </w:rPr>
+          <w:t xml:space="preserve">2 校园社交匹配推荐系统相关理论及技术综述</w:t>
+          <w:tab/>
+          <w:t xml:space="preserve">7</w:t>
+        </w:r>
+      </w:hyperlink>
     </w:p>
     <w:p>
       <w:pPr>
@@ -1361,16 +1383,17 @@
         <w:jc w:val="left"/>
       </w:pPr>
       <w:r/>
-      <w:r>
-        <w:rPr>
-          <w:rFonts w:ascii="Times New Roman" w:hAnsi="Times New Roman" w:eastAsia="宋体"/>
-          <w:b w:val="0"/>
-          <w:sz w:val="24"/>
-        </w:rPr>
-        <w:t>2.1 推荐系统概述</w:t>
-        <w:tab/>
-        <w:t>7</w:t>
-      </w:r>
+      <w:hyperlink w:anchor="_TocLCJ010" w:history="1">
+        <w:r>
+          <w:rPr>
+            <w:rFonts w:eastAsia="宋体" w:ascii="Times New Roman" w:hAnsi="Times New Roman"/>
+            <w:sz w:val="24"/>
+          </w:rPr>
+          <w:t xml:space="preserve">2.1 推荐系统概述</w:t>
+          <w:tab/>
+          <w:t xml:space="preserve">7</w:t>
+        </w:r>
+      </w:hyperlink>
     </w:p>
     <w:p>
       <w:pPr>
@@ -1382,16 +1405,17 @@
         <w:jc w:val="left"/>
       </w:pPr>
       <w:r/>
-      <w:r>
-        <w:rPr>
-          <w:rFonts w:ascii="Times New Roman" w:hAnsi="Times New Roman" w:eastAsia="宋体"/>
-          <w:b w:val="0"/>
-          <w:sz w:val="24"/>
-        </w:rPr>
-        <w:t>2.2 基于内容的推荐</w:t>
-        <w:tab/>
-        <w:t>8</w:t>
-      </w:r>
+      <w:hyperlink w:anchor="_TocLCJ011" w:history="1">
+        <w:r>
+          <w:rPr>
+            <w:rFonts w:eastAsia="宋体" w:ascii="Times New Roman" w:hAnsi="Times New Roman"/>
+            <w:sz w:val="24"/>
+          </w:rPr>
+          <w:t xml:space="preserve">2.2 基于内容的推荐</w:t>
+          <w:tab/>
+          <w:t xml:space="preserve">8</w:t>
+        </w:r>
+      </w:hyperlink>
     </w:p>
     <w:p>
       <w:pPr>
@@ -1403,16 +1427,17 @@
         <w:jc w:val="left"/>
       </w:pPr>
       <w:r/>
-      <w:r>
-        <w:rPr>
-          <w:rFonts w:ascii="Times New Roman" w:hAnsi="Times New Roman" w:eastAsia="宋体"/>
-          <w:b w:val="0"/>
-          <w:sz w:val="24"/>
-        </w:rPr>
-        <w:t>2.3 TF-IDF 与用户画像</w:t>
-        <w:tab/>
-        <w:t>9</w:t>
-      </w:r>
+      <w:hyperlink w:anchor="_TocLCJ012" w:history="1">
+        <w:r>
+          <w:rPr>
+            <w:rFonts w:eastAsia="宋体" w:ascii="Times New Roman" w:hAnsi="Times New Roman"/>
+            <w:sz w:val="24"/>
+          </w:rPr>
+          <w:t xml:space="preserve">2.3 TF-IDF 与用户画像</w:t>
+          <w:tab/>
+          <w:t xml:space="preserve">9</w:t>
+        </w:r>
+      </w:hyperlink>
     </w:p>
     <w:p>
       <w:pPr>
@@ -1424,16 +1449,17 @@
         <w:jc w:val="left"/>
       </w:pPr>
       <w:r/>
-      <w:r>
-        <w:rPr>
-          <w:rFonts w:ascii="Times New Roman" w:hAnsi="Times New Roman" w:eastAsia="宋体"/>
-          <w:b w:val="0"/>
-          <w:sz w:val="24"/>
-        </w:rPr>
-        <w:t>2.4 协同过滤与本文取舍</w:t>
-        <w:tab/>
-        <w:t>10</w:t>
-      </w:r>
+      <w:hyperlink w:anchor="_TocLCJ013" w:history="1">
+        <w:r>
+          <w:rPr>
+            <w:rFonts w:eastAsia="宋体" w:ascii="Times New Roman" w:hAnsi="Times New Roman"/>
+            <w:sz w:val="24"/>
+          </w:rPr>
+          <w:t xml:space="preserve">2.4 协同过滤与算法取舍</w:t>
+          <w:tab/>
+          <w:t xml:space="preserve">10</w:t>
+        </w:r>
+      </w:hyperlink>
     </w:p>
     <w:p>
       <w:pPr>
@@ -1445,16 +1471,17 @@
         <w:jc w:val="left"/>
       </w:pPr>
       <w:r/>
-      <w:r>
-        <w:rPr>
-          <w:rFonts w:ascii="Times New Roman" w:hAnsi="Times New Roman" w:eastAsia="宋体"/>
-          <w:b w:val="0"/>
-          <w:sz w:val="24"/>
-        </w:rPr>
-        <w:t>2.5 可解释推荐与大语言模型辅助解释</w:t>
-        <w:tab/>
-        <w:t>10</w:t>
-      </w:r>
+      <w:hyperlink w:anchor="_TocLCJ014" w:history="1">
+        <w:r>
+          <w:rPr>
+            <w:rFonts w:eastAsia="宋体" w:ascii="Times New Roman" w:hAnsi="Times New Roman"/>
+            <w:sz w:val="24"/>
+          </w:rPr>
+          <w:t xml:space="preserve">2.5 可解释推荐与大语言模型辅助解释</w:t>
+          <w:tab/>
+          <w:t xml:space="preserve">10</w:t>
+        </w:r>
+      </w:hyperlink>
     </w:p>
     <w:p>
       <w:pPr>
@@ -1466,16 +1493,17 @@
         <w:jc w:val="left"/>
       </w:pPr>
       <w:r/>
-      <w:r>
-        <w:rPr>
-          <w:rFonts w:ascii="Times New Roman" w:hAnsi="Times New Roman" w:eastAsia="宋体"/>
-          <w:b w:val="0"/>
-          <w:sz w:val="24"/>
-        </w:rPr>
-        <w:t>2.6 混合推荐与场景化规则重排</w:t>
-        <w:tab/>
-        <w:t>11</w:t>
-      </w:r>
+      <w:hyperlink w:anchor="_TocLCJ015" w:history="1">
+        <w:r>
+          <w:rPr>
+            <w:rFonts w:eastAsia="宋体" w:ascii="Times New Roman" w:hAnsi="Times New Roman"/>
+            <w:sz w:val="24"/>
+          </w:rPr>
+          <w:t xml:space="preserve">2.6 混合推荐与场景化规则重排</w:t>
+          <w:tab/>
+          <w:t xml:space="preserve">11</w:t>
+        </w:r>
+      </w:hyperlink>
     </w:p>
     <w:p>
       <w:pPr>
@@ -1487,16 +1515,17 @@
         <w:jc w:val="left"/>
       </w:pPr>
       <w:r/>
-      <w:r>
-        <w:rPr>
-          <w:rFonts w:ascii="Times New Roman" w:hAnsi="Times New Roman" w:eastAsia="宋体"/>
-          <w:b w:val="0"/>
-          <w:sz w:val="24"/>
-        </w:rPr>
-        <w:t>2.7 本文技术路线选择</w:t>
-        <w:tab/>
-        <w:t>11</w:t>
-      </w:r>
+      <w:hyperlink w:anchor="_TocLCJ016" w:history="1">
+        <w:r>
+          <w:rPr>
+            <w:rFonts w:eastAsia="宋体" w:ascii="Times New Roman" w:hAnsi="Times New Roman"/>
+            <w:sz w:val="24"/>
+          </w:rPr>
+          <w:t xml:space="preserve">2.7 系统技术路线选择</w:t>
+          <w:tab/>
+          <w:t xml:space="preserve">11</w:t>
+        </w:r>
+      </w:hyperlink>
     </w:p>
     <w:p>
       <w:pPr>
@@ -1508,16 +1537,17 @@
         <w:jc w:val="left"/>
       </w:pPr>
       <w:r/>
-      <w:r>
-        <w:rPr>
-          <w:rFonts w:ascii="Times New Roman" w:hAnsi="Times New Roman" w:eastAsia="宋体"/>
-          <w:b w:val="0"/>
-          <w:sz w:val="24"/>
-        </w:rPr>
-        <w:t>2.8 本章小结</w:t>
-        <w:tab/>
-        <w:t>12</w:t>
-      </w:r>
+      <w:hyperlink w:anchor="_TocLCJ017" w:history="1">
+        <w:r>
+          <w:rPr>
+            <w:rFonts w:eastAsia="宋体" w:ascii="Times New Roman" w:hAnsi="Times New Roman"/>
+            <w:sz w:val="24"/>
+          </w:rPr>
+          <w:t xml:space="preserve">2.8 本章小结</w:t>
+          <w:tab/>
+          <w:t xml:space="preserve">12</w:t>
+        </w:r>
+      </w:hyperlink>
     </w:p>
     <w:p>
       <w:pPr>
@@ -1529,16 +1559,17 @@
         <w:jc w:val="left"/>
       </w:pPr>
       <w:r/>
-      <w:r>
-        <w:rPr>
-          <w:rFonts w:ascii="Times New Roman" w:hAnsi="Times New Roman" w:eastAsia="黑体"/>
-          <w:b w:val="0"/>
-          <w:sz w:val="24"/>
-        </w:rPr>
-        <w:t>3 校园社交匹配推荐系统需求分析</w:t>
-        <w:tab/>
-        <w:t>13</w:t>
-      </w:r>
+      <w:hyperlink w:anchor="_TocLCJ018" w:history="1">
+        <w:r>
+          <w:rPr>
+            <w:rFonts w:eastAsia="黑体" w:ascii="Times New Roman" w:hAnsi="Times New Roman"/>
+            <w:sz w:val="24"/>
+          </w:rPr>
+          <w:t xml:space="preserve">3 校园社交匹配推荐系统需求分析</w:t>
+          <w:tab/>
+          <w:t xml:space="preserve">13</w:t>
+        </w:r>
+      </w:hyperlink>
     </w:p>
     <w:p>
       <w:pPr>
@@ -1550,16 +1581,17 @@
         <w:jc w:val="left"/>
       </w:pPr>
       <w:r/>
-      <w:r>
-        <w:rPr>
-          <w:rFonts w:ascii="Times New Roman" w:hAnsi="Times New Roman" w:eastAsia="宋体"/>
-          <w:b w:val="0"/>
-          <w:sz w:val="24"/>
-        </w:rPr>
-        <w:t>3.1 需求分析综述</w:t>
-        <w:tab/>
-        <w:t>13</w:t>
-      </w:r>
+      <w:hyperlink w:anchor="_TocLCJ019" w:history="1">
+        <w:r>
+          <w:rPr>
+            <w:rFonts w:eastAsia="宋体" w:ascii="Times New Roman" w:hAnsi="Times New Roman"/>
+            <w:sz w:val="24"/>
+          </w:rPr>
+          <w:t xml:space="preserve">3.1 需求分析综述</w:t>
+          <w:tab/>
+          <w:t xml:space="preserve">13</w:t>
+        </w:r>
+      </w:hyperlink>
     </w:p>
     <w:p>
       <w:pPr>
@@ -1571,16 +1603,17 @@
         <w:jc w:val="left"/>
       </w:pPr>
       <w:r/>
-      <w:r>
-        <w:rPr>
-          <w:rFonts w:ascii="Times New Roman" w:hAnsi="Times New Roman" w:eastAsia="宋体"/>
-          <w:b w:val="0"/>
-          <w:sz w:val="24"/>
-        </w:rPr>
-        <w:t>3.2 功能性需求</w:t>
-        <w:tab/>
-        <w:t>13</w:t>
-      </w:r>
+      <w:hyperlink w:anchor="_TocLCJ020" w:history="1">
+        <w:r>
+          <w:rPr>
+            <w:rFonts w:eastAsia="宋体" w:ascii="Times New Roman" w:hAnsi="Times New Roman"/>
+            <w:sz w:val="24"/>
+          </w:rPr>
+          <w:t xml:space="preserve">3.2 功能性需求</w:t>
+          <w:tab/>
+          <w:t xml:space="preserve">13</w:t>
+        </w:r>
+      </w:hyperlink>
     </w:p>
     <w:p>
       <w:pPr>
@@ -1592,16 +1625,17 @@
         <w:jc w:val="left"/>
       </w:pPr>
       <w:r/>
-      <w:r>
-        <w:rPr>
-          <w:rFonts w:ascii="Times New Roman" w:hAnsi="Times New Roman" w:eastAsia="宋体"/>
-          <w:b w:val="0"/>
-          <w:sz w:val="24"/>
-        </w:rPr>
-        <w:t>3.2.1 用户与标签维护需求</w:t>
-        <w:tab/>
-        <w:t>13</w:t>
-      </w:r>
+      <w:hyperlink w:anchor="_TocLCJ021" w:history="1">
+        <w:r>
+          <w:rPr>
+            <w:rFonts w:eastAsia="宋体" w:ascii="Times New Roman" w:hAnsi="Times New Roman"/>
+            <w:sz w:val="24"/>
+          </w:rPr>
+          <w:t xml:space="preserve">3.2.1 用户与标签维护需求</w:t>
+          <w:tab/>
+          <w:t xml:space="preserve">13</w:t>
+        </w:r>
+      </w:hyperlink>
     </w:p>
     <w:p>
       <w:pPr>
@@ -1613,16 +1647,17 @@
         <w:jc w:val="left"/>
       </w:pPr>
       <w:r/>
-      <w:r>
-        <w:rPr>
-          <w:rFonts w:ascii="Times New Roman" w:hAnsi="Times New Roman" w:eastAsia="宋体"/>
-          <w:b w:val="0"/>
-          <w:sz w:val="24"/>
-        </w:rPr>
-        <w:t>3.2.2 用户画像构建模块需求</w:t>
-        <w:tab/>
-        <w:t>15</w:t>
-      </w:r>
+      <w:hyperlink w:anchor="_TocLCJ022" w:history="1">
+        <w:r>
+          <w:rPr>
+            <w:rFonts w:eastAsia="宋体" w:ascii="Times New Roman" w:hAnsi="Times New Roman"/>
+            <w:sz w:val="24"/>
+          </w:rPr>
+          <w:t xml:space="preserve">3.2.2 用户画像构建模块需求</w:t>
+          <w:tab/>
+          <w:t xml:space="preserve">15</w:t>
+        </w:r>
+      </w:hyperlink>
     </w:p>
     <w:p>
       <w:pPr>
@@ -1634,16 +1669,17 @@
         <w:jc w:val="left"/>
       </w:pPr>
       <w:r/>
-      <w:r>
-        <w:rPr>
-          <w:rFonts w:ascii="Times New Roman" w:hAnsi="Times New Roman" w:eastAsia="宋体"/>
-          <w:b w:val="0"/>
-          <w:sz w:val="24"/>
-        </w:rPr>
-        <w:t>3.2.3 匹配推荐生成模块需求</w:t>
-        <w:tab/>
-        <w:t>16</w:t>
-      </w:r>
+      <w:hyperlink w:anchor="_TocLCJ023" w:history="1">
+        <w:r>
+          <w:rPr>
+            <w:rFonts w:eastAsia="宋体" w:ascii="Times New Roman" w:hAnsi="Times New Roman"/>
+            <w:sz w:val="24"/>
+          </w:rPr>
+          <w:t xml:space="preserve">3.2.3 匹配推荐生成模块需求</w:t>
+          <w:tab/>
+          <w:t xml:space="preserve">16</w:t>
+        </w:r>
+      </w:hyperlink>
     </w:p>
     <w:p>
       <w:pPr>
@@ -1655,16 +1691,17 @@
         <w:jc w:val="left"/>
       </w:pPr>
       <w:r/>
-      <w:r>
-        <w:rPr>
-          <w:rFonts w:ascii="Times New Roman" w:hAnsi="Times New Roman" w:eastAsia="宋体"/>
-          <w:b w:val="0"/>
-          <w:sz w:val="24"/>
-        </w:rPr>
-        <w:t>3.2.4 推荐解释与用户反馈模块需求</w:t>
-        <w:tab/>
-        <w:t>18</w:t>
-      </w:r>
+      <w:hyperlink w:anchor="_TocLCJ024" w:history="1">
+        <w:r>
+          <w:rPr>
+            <w:rFonts w:eastAsia="宋体" w:ascii="Times New Roman" w:hAnsi="Times New Roman"/>
+            <w:sz w:val="24"/>
+          </w:rPr>
+          <w:t xml:space="preserve">3.2.4 推荐解释与用户反馈模块需求</w:t>
+          <w:tab/>
+          <w:t xml:space="preserve">18</w:t>
+        </w:r>
+      </w:hyperlink>
     </w:p>
     <w:p>
       <w:pPr>
@@ -1676,16 +1713,17 @@
         <w:jc w:val="left"/>
       </w:pPr>
       <w:r/>
-      <w:r>
-        <w:rPr>
-          <w:rFonts w:ascii="Times New Roman" w:hAnsi="Times New Roman" w:eastAsia="宋体"/>
-          <w:b w:val="0"/>
-          <w:sz w:val="24"/>
-        </w:rPr>
-        <w:t>3.3 非功能性需求</w:t>
-        <w:tab/>
-        <w:t>21</w:t>
-      </w:r>
+      <w:hyperlink w:anchor="_TocLCJ025" w:history="1">
+        <w:r>
+          <w:rPr>
+            <w:rFonts w:eastAsia="宋体" w:ascii="Times New Roman" w:hAnsi="Times New Roman"/>
+            <w:sz w:val="24"/>
+          </w:rPr>
+          <w:t xml:space="preserve">3.3 非功能性需求</w:t>
+          <w:tab/>
+          <w:t xml:space="preserve">21</w:t>
+        </w:r>
+      </w:hyperlink>
     </w:p>
     <w:p>
       <w:pPr>
@@ -1697,16 +1735,17 @@
         <w:jc w:val="left"/>
       </w:pPr>
       <w:r/>
-      <w:r>
-        <w:rPr>
-          <w:rFonts w:ascii="Times New Roman" w:hAnsi="Times New Roman" w:eastAsia="宋体"/>
-          <w:b w:val="0"/>
-          <w:sz w:val="24"/>
-        </w:rPr>
-        <w:t>3.4 本章小结</w:t>
-        <w:tab/>
-        <w:t>22</w:t>
-      </w:r>
+      <w:hyperlink w:anchor="_TocLCJ026" w:history="1">
+        <w:r>
+          <w:rPr>
+            <w:rFonts w:eastAsia="宋体" w:ascii="Times New Roman" w:hAnsi="Times New Roman"/>
+            <w:sz w:val="24"/>
+          </w:rPr>
+          <w:t xml:space="preserve">3.4 本章小结</w:t>
+          <w:tab/>
+          <w:t xml:space="preserve">22</w:t>
+        </w:r>
+      </w:hyperlink>
     </w:p>
     <w:p>
       <w:pPr>
@@ -1718,16 +1757,17 @@
         <w:jc w:val="left"/>
       </w:pPr>
       <w:r/>
-      <w:r>
-        <w:rPr>
-          <w:rFonts w:ascii="Times New Roman" w:hAnsi="Times New Roman" w:eastAsia="黑体"/>
-          <w:b w:val="0"/>
-          <w:sz w:val="24"/>
-        </w:rPr>
-        <w:t>4 校园社交匹配推荐系统概要设计</w:t>
-        <w:tab/>
-        <w:t>23</w:t>
-      </w:r>
+      <w:hyperlink w:anchor="_TocLCJ027" w:history="1">
+        <w:r>
+          <w:rPr>
+            <w:rFonts w:eastAsia="黑体" w:ascii="Times New Roman" w:hAnsi="Times New Roman"/>
+            <w:sz w:val="24"/>
+          </w:rPr>
+          <w:t xml:space="preserve">4 校园社交匹配推荐系统概要设计</w:t>
+          <w:tab/>
+          <w:t xml:space="preserve">23</w:t>
+        </w:r>
+      </w:hyperlink>
     </w:p>
     <w:p>
       <w:pPr>
@@ -1739,16 +1779,17 @@
         <w:jc w:val="left"/>
       </w:pPr>
       <w:r/>
-      <w:r>
-        <w:rPr>
-          <w:rFonts w:ascii="Times New Roman" w:hAnsi="Times New Roman" w:eastAsia="宋体"/>
-          <w:b w:val="0"/>
-          <w:sz w:val="24"/>
-        </w:rPr>
-        <w:t>4.1 系统整体架构设计</w:t>
-        <w:tab/>
-        <w:t>23</w:t>
-      </w:r>
+      <w:hyperlink w:anchor="_TocLCJ028" w:history="1">
+        <w:r>
+          <w:rPr>
+            <w:rFonts w:eastAsia="宋体" w:ascii="Times New Roman" w:hAnsi="Times New Roman"/>
+            <w:sz w:val="24"/>
+          </w:rPr>
+          <w:t xml:space="preserve">4.1 系统整体架构设计</w:t>
+          <w:tab/>
+          <w:t xml:space="preserve">23</w:t>
+        </w:r>
+      </w:hyperlink>
     </w:p>
     <w:p>
       <w:pPr>
@@ -1760,16 +1801,17 @@
         <w:jc w:val="left"/>
       </w:pPr>
       <w:r/>
-      <w:r>
-        <w:rPr>
-          <w:rFonts w:ascii="Times New Roman" w:hAnsi="Times New Roman" w:eastAsia="宋体"/>
-          <w:b w:val="0"/>
-          <w:sz w:val="24"/>
-        </w:rPr>
-        <w:t>4.2 系统功能模块设计</w:t>
-        <w:tab/>
-        <w:t>24</w:t>
-      </w:r>
+      <w:hyperlink w:anchor="_TocLCJ029" w:history="1">
+        <w:r>
+          <w:rPr>
+            <w:rFonts w:eastAsia="宋体" w:ascii="Times New Roman" w:hAnsi="Times New Roman"/>
+            <w:sz w:val="24"/>
+          </w:rPr>
+          <w:t xml:space="preserve">4.2 系统功能模块设计</w:t>
+          <w:tab/>
+          <w:t xml:space="preserve">24</w:t>
+        </w:r>
+      </w:hyperlink>
     </w:p>
     <w:p>
       <w:pPr>
@@ -1781,16 +1823,17 @@
         <w:jc w:val="left"/>
       </w:pPr>
       <w:r/>
-      <w:r>
-        <w:rPr>
-          <w:rFonts w:ascii="Times New Roman" w:hAnsi="Times New Roman" w:eastAsia="宋体"/>
-          <w:b w:val="0"/>
-          <w:sz w:val="24"/>
-        </w:rPr>
-        <w:t>4.3 系统核心流程设计</w:t>
-        <w:tab/>
-        <w:t>25</w:t>
-      </w:r>
+      <w:hyperlink w:anchor="_TocLCJ030" w:history="1">
+        <w:r>
+          <w:rPr>
+            <w:rFonts w:eastAsia="宋体" w:ascii="Times New Roman" w:hAnsi="Times New Roman"/>
+            <w:sz w:val="24"/>
+          </w:rPr>
+          <w:t xml:space="preserve">4.3 系统核心流程设计</w:t>
+          <w:tab/>
+          <w:t xml:space="preserve">25</w:t>
+        </w:r>
+      </w:hyperlink>
     </w:p>
     <w:p>
       <w:pPr>
@@ -1802,16 +1845,17 @@
         <w:jc w:val="left"/>
       </w:pPr>
       <w:r/>
-      <w:r>
-        <w:rPr>
-          <w:rFonts w:ascii="Times New Roman" w:hAnsi="Times New Roman" w:eastAsia="宋体"/>
-          <w:b w:val="0"/>
-          <w:sz w:val="24"/>
-        </w:rPr>
-        <w:t>4.4 数据存储设计</w:t>
-        <w:tab/>
-        <w:t>26</w:t>
-      </w:r>
+      <w:hyperlink w:anchor="_TocLCJ031" w:history="1">
+        <w:r>
+          <w:rPr>
+            <w:rFonts w:eastAsia="宋体" w:ascii="Times New Roman" w:hAnsi="Times New Roman"/>
+            <w:sz w:val="24"/>
+          </w:rPr>
+          <w:t xml:space="preserve">4.4 数据存储设计</w:t>
+          <w:tab/>
+          <w:t xml:space="preserve">26</w:t>
+        </w:r>
+      </w:hyperlink>
     </w:p>
     <w:p>
       <w:pPr>
@@ -1823,16 +1867,17 @@
         <w:jc w:val="left"/>
       </w:pPr>
       <w:r/>
-      <w:r>
-        <w:rPr>
-          <w:rFonts w:ascii="Times New Roman" w:hAnsi="Times New Roman" w:eastAsia="宋体"/>
-          <w:b w:val="0"/>
-          <w:sz w:val="24"/>
-        </w:rPr>
-        <w:t>4.4.1 概念与逻辑模型设计</w:t>
-        <w:tab/>
-        <w:t>26</w:t>
-      </w:r>
+      <w:hyperlink w:anchor="_TocLCJ032" w:history="1">
+        <w:r>
+          <w:rPr>
+            <w:rFonts w:eastAsia="宋体" w:ascii="Times New Roman" w:hAnsi="Times New Roman"/>
+            <w:sz w:val="24"/>
+          </w:rPr>
+          <w:t xml:space="preserve">4.4.1 概念与逻辑模型设计</w:t>
+          <w:tab/>
+          <w:t xml:space="preserve">26</w:t>
+        </w:r>
+      </w:hyperlink>
     </w:p>
     <w:p>
       <w:pPr>
@@ -1844,16 +1889,17 @@
         <w:jc w:val="left"/>
       </w:pPr>
       <w:r/>
-      <w:r>
-        <w:rPr>
-          <w:rFonts w:ascii="Times New Roman" w:hAnsi="Times New Roman" w:eastAsia="宋体"/>
-          <w:b w:val="0"/>
-          <w:sz w:val="24"/>
-        </w:rPr>
-        <w:t>4.4.2 物理模型设计</w:t>
-        <w:tab/>
-        <w:t>27</w:t>
-      </w:r>
+      <w:hyperlink w:anchor="_TocLCJ033" w:history="1">
+        <w:r>
+          <w:rPr>
+            <w:rFonts w:eastAsia="宋体" w:ascii="Times New Roman" w:hAnsi="Times New Roman"/>
+            <w:sz w:val="24"/>
+          </w:rPr>
+          <w:t xml:space="preserve">4.4.2 物理模型设计</w:t>
+          <w:tab/>
+          <w:t xml:space="preserve">27</w:t>
+        </w:r>
+      </w:hyperlink>
     </w:p>
     <w:p>
       <w:pPr>
@@ -1865,16 +1911,17 @@
         <w:jc w:val="left"/>
       </w:pPr>
       <w:r/>
-      <w:r>
-        <w:rPr>
-          <w:rFonts w:ascii="Times New Roman" w:hAnsi="Times New Roman" w:eastAsia="宋体"/>
-          <w:b w:val="0"/>
-          <w:sz w:val="24"/>
-        </w:rPr>
-        <w:t>4.5 Redis 缓存设计</w:t>
-        <w:tab/>
-        <w:t>35</w:t>
-      </w:r>
+      <w:hyperlink w:anchor="_TocLCJ034" w:history="1">
+        <w:r>
+          <w:rPr>
+            <w:rFonts w:eastAsia="宋体" w:ascii="Times New Roman" w:hAnsi="Times New Roman"/>
+            <w:sz w:val="24"/>
+          </w:rPr>
+          <w:t xml:space="preserve">4.5 Redis 缓存设计</w:t>
+          <w:tab/>
+          <w:t xml:space="preserve">35</w:t>
+        </w:r>
+      </w:hyperlink>
     </w:p>
     <w:p>
       <w:pPr>
@@ -1886,16 +1933,17 @@
         <w:jc w:val="left"/>
       </w:pPr>
       <w:r/>
-      <w:r>
-        <w:rPr>
-          <w:rFonts w:ascii="Times New Roman" w:hAnsi="Times New Roman" w:eastAsia="宋体"/>
-          <w:b w:val="0"/>
-          <w:sz w:val="24"/>
-        </w:rPr>
-        <w:t>4.6 本章小结</w:t>
-        <w:tab/>
-        <w:t>36</w:t>
-      </w:r>
+      <w:hyperlink w:anchor="_TocLCJ035" w:history="1">
+        <w:r>
+          <w:rPr>
+            <w:rFonts w:eastAsia="宋体" w:ascii="Times New Roman" w:hAnsi="Times New Roman"/>
+            <w:sz w:val="24"/>
+          </w:rPr>
+          <w:t xml:space="preserve">4.6 本章小结</w:t>
+          <w:tab/>
+          <w:t xml:space="preserve">36</w:t>
+        </w:r>
+      </w:hyperlink>
     </w:p>
     <w:p>
       <w:pPr>
@@ -1907,16 +1955,17 @@
         <w:jc w:val="left"/>
       </w:pPr>
       <w:r/>
-      <w:r>
-        <w:rPr>
-          <w:rFonts w:ascii="Times New Roman" w:hAnsi="Times New Roman" w:eastAsia="黑体"/>
-          <w:b w:val="0"/>
-          <w:sz w:val="24"/>
-        </w:rPr>
-        <w:t>5 校园社交匹配推荐系统详细设计与实现</w:t>
-        <w:tab/>
-        <w:t>37</w:t>
-      </w:r>
+      <w:hyperlink w:anchor="_TocLCJ036" w:history="1">
+        <w:r>
+          <w:rPr>
+            <w:rFonts w:eastAsia="黑体" w:ascii="Times New Roman" w:hAnsi="Times New Roman"/>
+            <w:sz w:val="24"/>
+          </w:rPr>
+          <w:t xml:space="preserve">5 校园社交匹配推荐系统详细设计与实现</w:t>
+          <w:tab/>
+          <w:t xml:space="preserve">37</w:t>
+        </w:r>
+      </w:hyperlink>
     </w:p>
     <w:p>
       <w:pPr>
@@ -1928,16 +1977,17 @@
         <w:jc w:val="left"/>
       </w:pPr>
       <w:r/>
-      <w:r>
-        <w:rPr>
-          <w:rFonts w:ascii="Times New Roman" w:hAnsi="Times New Roman" w:eastAsia="宋体"/>
-          <w:b w:val="0"/>
-          <w:sz w:val="24"/>
-        </w:rPr>
-        <w:t>5.1 用户画像构建模块</w:t>
-        <w:tab/>
-        <w:t>37</w:t>
-      </w:r>
+      <w:hyperlink w:anchor="_TocLCJ037" w:history="1">
+        <w:r>
+          <w:rPr>
+            <w:rFonts w:eastAsia="宋体" w:ascii="Times New Roman" w:hAnsi="Times New Roman"/>
+            <w:sz w:val="24"/>
+          </w:rPr>
+          <w:t xml:space="preserve">5.1 用户画像构建模块</w:t>
+          <w:tab/>
+          <w:t xml:space="preserve">37</w:t>
+        </w:r>
+      </w:hyperlink>
     </w:p>
     <w:p>
       <w:pPr>
@@ -1949,16 +1999,17 @@
         <w:jc w:val="left"/>
       </w:pPr>
       <w:r/>
-      <w:r>
-        <w:rPr>
-          <w:rFonts w:ascii="Times New Roman" w:hAnsi="Times New Roman" w:eastAsia="宋体"/>
-          <w:b w:val="0"/>
-          <w:sz w:val="24"/>
-        </w:rPr>
-        <w:t>5.2 匹配推荐生成模块</w:t>
-        <w:tab/>
-        <w:t>41</w:t>
-      </w:r>
+      <w:hyperlink w:anchor="_TocLCJ038" w:history="1">
+        <w:r>
+          <w:rPr>
+            <w:rFonts w:eastAsia="宋体" w:ascii="Times New Roman" w:hAnsi="Times New Roman"/>
+            <w:sz w:val="24"/>
+          </w:rPr>
+          <w:t xml:space="preserve">5.2 匹配推荐生成模块</w:t>
+          <w:tab/>
+          <w:t xml:space="preserve">41</w:t>
+        </w:r>
+      </w:hyperlink>
     </w:p>
     <w:p>
       <w:pPr>
@@ -1970,16 +2021,17 @@
         <w:jc w:val="left"/>
       </w:pPr>
       <w:r/>
-      <w:r>
-        <w:rPr>
-          <w:rFonts w:ascii="Times New Roman" w:hAnsi="Times New Roman" w:eastAsia="宋体"/>
-          <w:b w:val="0"/>
-          <w:sz w:val="24"/>
-        </w:rPr>
-        <w:t>5.3 推荐解释与用户反馈模块</w:t>
-        <w:tab/>
-        <w:t>44</w:t>
-      </w:r>
+      <w:hyperlink w:anchor="_TocLCJ039" w:history="1">
+        <w:r>
+          <w:rPr>
+            <w:rFonts w:eastAsia="宋体" w:ascii="Times New Roman" w:hAnsi="Times New Roman"/>
+            <w:sz w:val="24"/>
+          </w:rPr>
+          <w:t xml:space="preserve">5.3 推荐解释与用户反馈模块</w:t>
+          <w:tab/>
+          <w:t xml:space="preserve">44</w:t>
+        </w:r>
+      </w:hyperlink>
     </w:p>
     <w:p>
       <w:pPr>
@@ -1991,16 +2043,17 @@
         <w:jc w:val="left"/>
       </w:pPr>
       <w:r/>
-      <w:r>
-        <w:rPr>
-          <w:rFonts w:ascii="Times New Roman" w:hAnsi="Times New Roman" w:eastAsia="宋体"/>
-          <w:b w:val="0"/>
-          <w:sz w:val="24"/>
-        </w:rPr>
-        <w:t>5.4 本章小结</w:t>
-        <w:tab/>
-        <w:t>49</w:t>
-      </w:r>
+      <w:hyperlink w:anchor="_TocLCJ040" w:history="1">
+        <w:r>
+          <w:rPr>
+            <w:rFonts w:eastAsia="宋体" w:ascii="Times New Roman" w:hAnsi="Times New Roman"/>
+            <w:sz w:val="24"/>
+          </w:rPr>
+          <w:t xml:space="preserve">5.4 本章小结</w:t>
+          <w:tab/>
+          <w:t xml:space="preserve">49</w:t>
+        </w:r>
+      </w:hyperlink>
     </w:p>
     <w:p>
       <w:pPr>
@@ -2012,16 +2065,17 @@
         <w:jc w:val="left"/>
       </w:pPr>
       <w:r/>
-      <w:r>
-        <w:rPr>
-          <w:rFonts w:ascii="Times New Roman" w:hAnsi="Times New Roman" w:eastAsia="黑体"/>
-          <w:b w:val="0"/>
-          <w:sz w:val="24"/>
-        </w:rPr>
-        <w:t>6 校园社交匹配推荐系统测试</w:t>
-        <w:tab/>
-        <w:t>50</w:t>
-      </w:r>
+      <w:hyperlink w:anchor="_TocLCJ041" w:history="1">
+        <w:r>
+          <w:rPr>
+            <w:rFonts w:eastAsia="黑体" w:ascii="Times New Roman" w:hAnsi="Times New Roman"/>
+            <w:sz w:val="24"/>
+          </w:rPr>
+          <w:t xml:space="preserve">6 校园社交匹配推荐系统测试</w:t>
+          <w:tab/>
+          <w:t xml:space="preserve">50</w:t>
+        </w:r>
+      </w:hyperlink>
     </w:p>
     <w:p>
       <w:pPr>
@@ -2033,16 +2087,17 @@
         <w:jc w:val="left"/>
       </w:pPr>
       <w:r/>
-      <w:r>
-        <w:rPr>
-          <w:rFonts w:ascii="Times New Roman" w:hAnsi="Times New Roman" w:eastAsia="宋体"/>
-          <w:b w:val="0"/>
-          <w:sz w:val="24"/>
-        </w:rPr>
-        <w:t>6.1 测试目标</w:t>
-        <w:tab/>
-        <w:t>50</w:t>
-      </w:r>
+      <w:hyperlink w:anchor="_TocLCJ042" w:history="1">
+        <w:r>
+          <w:rPr>
+            <w:rFonts w:eastAsia="宋体" w:ascii="Times New Roman" w:hAnsi="Times New Roman"/>
+            <w:sz w:val="24"/>
+          </w:rPr>
+          <w:t xml:space="preserve">6.1 测试目标</w:t>
+          <w:tab/>
+          <w:t xml:space="preserve">50</w:t>
+        </w:r>
+      </w:hyperlink>
     </w:p>
     <w:p>
       <w:pPr>
@@ -2054,16 +2109,17 @@
         <w:jc w:val="left"/>
       </w:pPr>
       <w:r/>
-      <w:r>
-        <w:rPr>
-          <w:rFonts w:ascii="Times New Roman" w:hAnsi="Times New Roman" w:eastAsia="宋体"/>
-          <w:b w:val="0"/>
-          <w:sz w:val="24"/>
-        </w:rPr>
-        <w:t>6.2 测试环境</w:t>
-        <w:tab/>
-        <w:t>50</w:t>
-      </w:r>
+      <w:hyperlink w:anchor="_TocLCJ043" w:history="1">
+        <w:r>
+          <w:rPr>
+            <w:rFonts w:eastAsia="宋体" w:ascii="Times New Roman" w:hAnsi="Times New Roman"/>
+            <w:sz w:val="24"/>
+          </w:rPr>
+          <w:t xml:space="preserve">6.2 测试环境</w:t>
+          <w:tab/>
+          <w:t xml:space="preserve">50</w:t>
+        </w:r>
+      </w:hyperlink>
     </w:p>
     <w:p>
       <w:pPr>
@@ -2075,16 +2131,17 @@
         <w:jc w:val="left"/>
       </w:pPr>
       <w:r/>
-      <w:r>
-        <w:rPr>
-          <w:rFonts w:ascii="Times New Roman" w:hAnsi="Times New Roman" w:eastAsia="宋体"/>
-          <w:b w:val="0"/>
-          <w:sz w:val="24"/>
-        </w:rPr>
-        <w:t>6.3 测试用例设计思路</w:t>
-        <w:tab/>
-        <w:t>51</w:t>
-      </w:r>
+      <w:hyperlink w:anchor="_TocLCJ044" w:history="1">
+        <w:r>
+          <w:rPr>
+            <w:rFonts w:eastAsia="宋体" w:ascii="Times New Roman" w:hAnsi="Times New Roman"/>
+            <w:sz w:val="24"/>
+          </w:rPr>
+          <w:t xml:space="preserve">6.3 测试用例设计思路</w:t>
+          <w:tab/>
+          <w:t xml:space="preserve">51</w:t>
+        </w:r>
+      </w:hyperlink>
     </w:p>
     <w:p>
       <w:pPr>
@@ -2096,16 +2153,17 @@
         <w:jc w:val="left"/>
       </w:pPr>
       <w:r/>
-      <w:r>
-        <w:rPr>
-          <w:rFonts w:ascii="Times New Roman" w:hAnsi="Times New Roman" w:eastAsia="宋体"/>
-          <w:b w:val="0"/>
-          <w:sz w:val="24"/>
-        </w:rPr>
-        <w:t>6.4 功能性需求测试用例</w:t>
-        <w:tab/>
-        <w:t>51</w:t>
-      </w:r>
+      <w:hyperlink w:anchor="_TocLCJ045" w:history="1">
+        <w:r>
+          <w:rPr>
+            <w:rFonts w:eastAsia="宋体" w:ascii="Times New Roman" w:hAnsi="Times New Roman"/>
+            <w:sz w:val="24"/>
+          </w:rPr>
+          <w:t xml:space="preserve">6.4 功能性需求测试用例</w:t>
+          <w:tab/>
+          <w:t xml:space="preserve">51</w:t>
+        </w:r>
+      </w:hyperlink>
     </w:p>
     <w:p>
       <w:pPr>
@@ -2117,16 +2175,17 @@
         <w:jc w:val="left"/>
       </w:pPr>
       <w:r/>
-      <w:r>
-        <w:rPr>
-          <w:rFonts w:ascii="Times New Roman" w:hAnsi="Times New Roman" w:eastAsia="宋体"/>
-          <w:b w:val="0"/>
-          <w:sz w:val="24"/>
-        </w:rPr>
-        <w:t>6.5 非功能性需求测试用例</w:t>
-        <w:tab/>
-        <w:t>54</w:t>
-      </w:r>
+      <w:hyperlink w:anchor="_TocLCJ046" w:history="1">
+        <w:r>
+          <w:rPr>
+            <w:rFonts w:eastAsia="宋体" w:ascii="Times New Roman" w:hAnsi="Times New Roman"/>
+            <w:sz w:val="24"/>
+          </w:rPr>
+          <w:t xml:space="preserve">6.5 非功能性需求测试用例</w:t>
+          <w:tab/>
+          <w:t xml:space="preserve">54</w:t>
+        </w:r>
+      </w:hyperlink>
     </w:p>
     <w:p>
       <w:pPr>
@@ -2138,16 +2197,17 @@
         <w:jc w:val="left"/>
       </w:pPr>
       <w:r/>
-      <w:r>
-        <w:rPr>
-          <w:rFonts w:ascii="Times New Roman" w:hAnsi="Times New Roman" w:eastAsia="宋体"/>
-          <w:b w:val="0"/>
-          <w:sz w:val="24"/>
-        </w:rPr>
-        <w:t>6.6 离线评估设计</w:t>
-        <w:tab/>
-        <w:t>55</w:t>
-      </w:r>
+      <w:hyperlink w:anchor="_TocLCJ047" w:history="1">
+        <w:r>
+          <w:rPr>
+            <w:rFonts w:eastAsia="宋体" w:ascii="Times New Roman" w:hAnsi="Times New Roman"/>
+            <w:sz w:val="24"/>
+          </w:rPr>
+          <w:t xml:space="preserve">6.6 离线评估设计</w:t>
+          <w:tab/>
+          <w:t xml:space="preserve">55</w:t>
+        </w:r>
+      </w:hyperlink>
     </w:p>
     <w:p>
       <w:pPr>
@@ -2159,16 +2219,17 @@
         <w:jc w:val="left"/>
       </w:pPr>
       <w:r/>
-      <w:r>
-        <w:rPr>
-          <w:rFonts w:ascii="Times New Roman" w:hAnsi="Times New Roman" w:eastAsia="宋体"/>
-          <w:b w:val="0"/>
-          <w:sz w:val="24"/>
-        </w:rPr>
-        <w:t>6.7 测试结果分析</w:t>
-        <w:tab/>
-        <w:t>58</w:t>
-      </w:r>
+      <w:hyperlink w:anchor="_TocLCJ048" w:history="1">
+        <w:r>
+          <w:rPr>
+            <w:rFonts w:eastAsia="宋体" w:ascii="Times New Roman" w:hAnsi="Times New Roman"/>
+            <w:sz w:val="24"/>
+          </w:rPr>
+          <w:t xml:space="preserve">6.7 扩展评估与工程化验证</w:t>
+          <w:tab/>
+          <w:t xml:space="preserve">59</w:t>
+        </w:r>
+      </w:hyperlink>
     </w:p>
     <w:p>
       <w:pPr>
@@ -2180,16 +2241,39 @@
         <w:jc w:val="left"/>
       </w:pPr>
       <w:r/>
-      <w:r>
-        <w:rPr>
-          <w:rFonts w:ascii="Times New Roman" w:hAnsi="Times New Roman" w:eastAsia="宋体"/>
-          <w:b w:val="0"/>
-          <w:sz w:val="24"/>
-        </w:rPr>
-        <w:t>6.8 本章小结</w:t>
-        <w:tab/>
-        <w:t>59</w:t>
-      </w:r>
+      <w:hyperlink w:anchor="_TocLCJ049" w:history="1">
+        <w:r>
+          <w:rPr>
+            <w:rFonts w:eastAsia="宋体" w:ascii="Times New Roman" w:hAnsi="Times New Roman"/>
+            <w:sz w:val="24"/>
+          </w:rPr>
+          <w:t xml:space="preserve">6.8 测试结果分析</w:t>
+          <w:tab/>
+          <w:t xml:space="preserve">60</w:t>
+        </w:r>
+      </w:hyperlink>
+    </w:p>
+    <w:p>
+      <w:pPr>
+        <w:tabs>
+          <w:tab w:pos="8856" w:val="right" w:leader="dot"/>
+        </w:tabs>
+        <w:spacing w:before="0" w:after="0" w:line="400" w:lineRule="exact"/>
+        <w:ind w:left="0" w:firstLine="240"/>
+        <w:jc w:val="left"/>
+      </w:pPr>
+      <w:r/>
+      <w:hyperlink w:anchor="_TocLCJ050" w:history="1">
+        <w:r>
+          <w:rPr>
+            <w:rFonts w:eastAsia="宋体" w:ascii="Times New Roman" w:hAnsi="Times New Roman"/>
+            <w:sz w:val="24"/>
+          </w:rPr>
+          <w:t xml:space="preserve">6.9 本章小结</w:t>
+          <w:tab/>
+          <w:t xml:space="preserve">61</w:t>
+        </w:r>
+      </w:hyperlink>
     </w:p>
     <w:p>
       <w:pPr>
@@ -2201,16 +2285,17 @@
         <w:jc w:val="left"/>
       </w:pPr>
       <w:r/>
-      <w:r>
-        <w:rPr>
-          <w:rFonts w:ascii="Times New Roman" w:hAnsi="Times New Roman" w:eastAsia="黑体"/>
-          <w:b w:val="0"/>
-          <w:sz w:val="24"/>
-        </w:rPr>
-        <w:t>7 总结与展望</w:t>
-        <w:tab/>
-        <w:t>60</w:t>
-      </w:r>
+      <w:hyperlink w:anchor="_TocLCJ051" w:history="1">
+        <w:r>
+          <w:rPr>
+            <w:rFonts w:eastAsia="黑体" w:ascii="Times New Roman" w:hAnsi="Times New Roman"/>
+            <w:sz w:val="24"/>
+          </w:rPr>
+          <w:t xml:space="preserve">7 总结与展望</w:t>
+          <w:tab/>
+          <w:t xml:space="preserve">62</w:t>
+        </w:r>
+      </w:hyperlink>
     </w:p>
     <w:p>
       <w:pPr>
@@ -2222,16 +2307,17 @@
         <w:jc w:val="left"/>
       </w:pPr>
       <w:r/>
-      <w:r>
-        <w:rPr>
-          <w:rFonts w:ascii="Times New Roman" w:hAnsi="Times New Roman" w:eastAsia="宋体"/>
-          <w:b w:val="0"/>
-          <w:sz w:val="24"/>
-        </w:rPr>
-        <w:t>7.1 全文总结</w:t>
-        <w:tab/>
-        <w:t>60</w:t>
-      </w:r>
+      <w:hyperlink w:anchor="_TocLCJ052" w:history="1">
+        <w:r>
+          <w:rPr>
+            <w:rFonts w:eastAsia="宋体" w:ascii="Times New Roman" w:hAnsi="Times New Roman"/>
+            <w:sz w:val="24"/>
+          </w:rPr>
+          <w:t xml:space="preserve">7.1 全文总结</w:t>
+          <w:tab/>
+          <w:t xml:space="preserve">62</w:t>
+        </w:r>
+      </w:hyperlink>
     </w:p>
     <w:p>
       <w:pPr>
@@ -2243,16 +2329,17 @@
         <w:jc w:val="left"/>
       </w:pPr>
       <w:r/>
-      <w:r>
-        <w:rPr>
-          <w:rFonts w:ascii="Times New Roman" w:hAnsi="Times New Roman" w:eastAsia="宋体"/>
-          <w:b w:val="0"/>
-          <w:sz w:val="24"/>
-        </w:rPr>
-        <w:t>7.2 系统展望</w:t>
-        <w:tab/>
-        <w:t>61</w:t>
-      </w:r>
+      <w:hyperlink w:anchor="_TocLCJ053" w:history="1">
+        <w:r>
+          <w:rPr>
+            <w:rFonts w:eastAsia="宋体" w:ascii="Times New Roman" w:hAnsi="Times New Roman"/>
+            <w:sz w:val="24"/>
+          </w:rPr>
+          <w:t xml:space="preserve">7.2 系统展望</w:t>
+          <w:tab/>
+          <w:t xml:space="preserve">63</w:t>
+        </w:r>
+      </w:hyperlink>
     </w:p>
     <w:p>
       <w:pPr>
@@ -2264,16 +2351,17 @@
         <w:jc w:val="left"/>
       </w:pPr>
       <w:r/>
-      <w:r>
-        <w:rPr>
-          <w:rFonts w:ascii="Times New Roman" w:hAnsi="Times New Roman" w:eastAsia="黑体"/>
-          <w:b w:val="0"/>
-          <w:sz w:val="24"/>
-        </w:rPr>
-        <w:t>参考文献</w:t>
-        <w:tab/>
-        <w:t>63</w:t>
-      </w:r>
+      <w:hyperlink w:anchor="_TocLCJ054" w:history="1">
+        <w:r>
+          <w:rPr>
+            <w:rFonts w:eastAsia="黑体" w:ascii="Times New Roman" w:hAnsi="Times New Roman"/>
+            <w:sz w:val="24"/>
+          </w:rPr>
+          <w:t xml:space="preserve">参考文献</w:t>
+          <w:tab/>
+          <w:t xml:space="preserve">65</w:t>
+        </w:r>
+      </w:hyperlink>
     </w:p>
     <w:p>
       <w:pPr>
@@ -2285,16 +2373,17 @@
         <w:jc w:val="left"/>
       </w:pPr>
       <w:r/>
-      <w:r>
-        <w:rPr>
-          <w:rFonts w:ascii="Times New Roman" w:hAnsi="Times New Roman" w:eastAsia="黑体"/>
-          <w:b w:val="0"/>
-          <w:sz w:val="24"/>
-        </w:rPr>
-        <w:t>致谢</w:t>
-        <w:tab/>
-        <w:t>66</w:t>
-      </w:r>
+      <w:hyperlink w:anchor="_TocLCJ055" w:history="1">
+        <w:r>
+          <w:rPr>
+            <w:rFonts w:eastAsia="黑体" w:ascii="Times New Roman" w:hAnsi="Times New Roman"/>
+            <w:sz w:val="24"/>
+          </w:rPr>
+          <w:t xml:space="preserve">致谢</w:t>
+          <w:tab/>
+          <w:t xml:space="preserve">68</w:t>
+        </w:r>
+      </w:hyperlink>
     </w:p>
     <w:p>
       <w:pPr>
@@ -2314,6 +2403,7 @@
       </w:pPr>
     </w:p>
     <w:p>
+      <w:bookmarkStart w:id="4" w:name="_TocLCJ004"/>
       <w:pPr>
         <w:pStyle w:val="1"/>
         <w:keepNext/>
@@ -2329,6 +2419,7 @@
         </w:rPr>
         <w:t>引言</w:t>
       </w:r>
+      <w:bookmarkEnd w:id="4"/>
     </w:p>
     <w:p>
       <w:pPr>
@@ -2344,10 +2435,11 @@
           <w:b w:val="0"/>
           <w:sz w:val="24"/>
         </w:rPr>
-        <w:t>本章首先说明校园社交匹配推荐系统的项目背景、社会意义与应用价值，并对本文使用的关键概念进行界定；随后分析国内外研究现状以及同类产品或解决方案的特点与不足，明确本文需要解决的问题；最后介绍本文主要工作内容和全文组织结构。</w:t>
-      </w:r>
-    </w:p>
-    <w:p>
+        <w:t>本章首先说明校园社交匹配推荐系统的项目背景、社会意义与应用价值，并界定系统涉及的关键概念；随后分析国内外研究现状以及同类产品或解决方案的特点与不足，明确系统需要解决的问题；最后介绍主要工作内容和全文组织结构。</w:t>
+      </w:r>
+    </w:p>
+    <w:p>
+      <w:bookmarkStart w:id="5" w:name="_TocLCJ005"/>
       <w:pPr>
         <w:pStyle w:val="2"/>
         <w:keepNext/>
@@ -2363,6 +2455,7 @@
         </w:rPr>
         <w:t>项目背景与意义</w:t>
       </w:r>
+      <w:bookmarkEnd w:id="5"/>
     </w:p>
     <w:p>
       <w:pPr>
@@ -2429,7 +2522,7 @@
           <w:b w:val="0"/>
           <w:sz w:val="24"/>
         </w:rPr>
-        <w:t>为便于后续论述，本文对关键概念作如下界定。校园社交匹配是指在校园学习、社团和兴趣场景下，根据用户标签、校园属性和反馈行为，为目标用户推荐潜在匹配对象的过程。用户画像是指由用户标签及其权重构成的兴趣表示，用于支撑召回、排序和解释。候选召回是指根据画像中的核心标签从候选用户集合中筛选可能匹配对象。排序重排是指先依据相似度得到基础排序，再结合年级、专业、社团等校园规则调整结果顺序。推荐解释是指面向用户说明推荐依据的文本或证据集合，其内容应来自标签贡献、规则命中和可信连接原因。用户反馈是指用户对推荐对象的关注、忽略等行为，系统据此对画像进行轻量更新。</w:t>
+        <w:t>系统涉及的关键概念包括校园社交匹配、用户画像、候选召回、排序重排、推荐解释和用户反馈。校园社交匹配是指在校园学习、社团和兴趣场景下，根据用户标签、校园属性和反馈行为，为目标用户推荐潜在匹配对象的过程。用户画像是指由用户标签及其权重构成的兴趣表示，用于支撑召回、排序和解释。候选召回是指根据画像中的核心标签从候选用户集合中筛选可能匹配对象。排序重排是指先依据相似度得到基础排序，再结合年级、专业、社团等校园规则调整结果顺序。推荐解释是指面向用户说明推荐依据的文本或证据集合，其内容应来自标签贡献、规则命中和可信连接原因。用户反馈是指用户对推荐对象的关注、忽略等行为，系统据此对画像进行轻量更新。</w:t>
       </w:r>
     </w:p>
     <w:p>
@@ -2450,6 +2543,7 @@
       </w:r>
     </w:p>
     <w:p>
+      <w:bookmarkStart w:id="6" w:name="_TocLCJ006"/>
       <w:pPr>
         <w:pStyle w:val="2"/>
         <w:keepNext/>
@@ -2465,6 +2559,7 @@
         </w:rPr>
         <w:t>国内外研究现状与同类方案分析</w:t>
       </w:r>
+      <w:bookmarkEnd w:id="6"/>
     </w:p>
     <w:p>
       <w:pPr>
@@ -2531,7 +2626,7 @@
           <w:b w:val="0"/>
           <w:sz w:val="24"/>
         </w:rPr>
-        <w:t>。这类研究为本文从校园用户关系、共同标签和可信连接角度组织匹配推荐提供了理论背景。</w:t>
+        <w:t>。这类研究为校园用户关系、共同标签和可信连接的匹配推荐设计提供了理论背景。</w:t>
       </w:r>
     </w:p>
     <w:p>
@@ -2565,7 +2660,7 @@
           <w:b w:val="0"/>
           <w:sz w:val="24"/>
         </w:rPr>
-        <w:t>。该工作说明，在人员匹配场景中，推荐解释不是附属功能，而是影响用户是否接受推荐的重要因素。校园社交匹配与企业人员推荐具有相似之处：推荐对象都是人，用户需要理解推荐对象与自身之间的关系依据。因此，本文在设计中没有只输出推荐分数，而是保留匹配标签、规则命中和可信连接原因。</w:t>
+        <w:t>。该工作说明，在人员匹配场景中，推荐解释会影响用户是否接受推荐。校园社交匹配与企业人员推荐具有相似之处：推荐对象都是人，用户需要理解推荐对象与自身之间的关系依据。因此，系统在输出推荐分数的同时保留匹配标签、规则命中和可信连接原因。</w:t>
       </w:r>
     </w:p>
     <w:p>
@@ -2582,7 +2677,7 @@
           <w:b w:val="0"/>
           <w:sz w:val="24"/>
         </w:rPr>
-        <w:t>教育和学习场景中的推荐研究也与本文项目相关。Drachsler 等对技术增强学习中的推荐系统进行了回顾，指出学习推荐系统可以服务于学习资源、学习路径、同伴或教师等多类对象，并需要结合教育场景特点进行评价</w:t>
+        <w:t>教育和学习场景中的推荐研究与校园匹配目标相关。Drachsler 等对技术增强学习中的推荐系统进行了回顾，指出学习推荐系统可以服务于学习资源、学习路径、同伴或教师等多类对象，并需要结合教育场景特点进行评价</w:t>
       </w:r>
       <w:r>
         <w:rPr>
@@ -2616,7 +2711,7 @@
           <w:b w:val="0"/>
           <w:sz w:val="24"/>
         </w:rPr>
-        <w:t>。这些研究表明，校园场景下的推荐不能简单照搬电商或内容平台的目标函数，而应结合学习活动、兴趣发展和用户连接目的进行建模。</w:t>
+        <w:t>。这些研究表明，校园场景下的推荐需要结合学习活动、兴趣发展和用户连接目的进行建模。</w:t>
       </w:r>
     </w:p>
     <w:p>
@@ -2718,7 +2813,7 @@
           <w:b w:val="0"/>
           <w:sz w:val="24"/>
         </w:rPr>
-        <w:t>。这类研究与校园信息化场景较为接近，说明学习者画像、用户兴趣和社交关系建模能够提升推荐的针对性。不过，学习资源推荐的推荐对象通常是课程、知识点或学习材料，而本文关注的是校园用户之间的匹配。高校场景中的用户匹配需求具有明显的线下属性，用户不仅关注兴趣是否相似，也关注年级、专业、课程、社团、项目经历和可信连接关系。国内不少校园社区或学习平台已经能够承载课程讨论、社团通知、活动报名和信息发布，但其核心仍以内容、群组或活动为组织对象，用户之间的主动匹配能力相对有限。部分系统会使用标签、问卷或兴趣分类辅助筛选用户，但通常缺少从画像构建、候选召回、排序重排到反馈更新的完整链路。</w:t>
+        <w:t>。这类研究与校园信息化场景较为接近，说明学习者画像、用户兴趣和社交关系建模能够提升推荐的针对性。不过，学习资源推荐的推荐对象通常是课程、知识点或学习材料，校园社交匹配的推荐对象则是具体用户。高校场景中的用户匹配需求具有明显的线下属性，用户不仅关注兴趣是否相似，也关注年级、专业、课程、社团、项目经历和可信连接关系。国内不少校园社区或学习平台已经能够承载课程讨论、社团通知、活动报名和信息发布，但其核心仍以内容、群组或活动为组织对象，用户之间的主动匹配能力相对有限。部分系统会使用标签、问卷或兴趣分类辅助筛选用户，但通常缺少从画像构建、候选召回、排序重排到反馈更新的完整链路。</w:t>
       </w:r>
     </w:p>
     <w:p>
@@ -2752,7 +2847,7 @@
           <w:b w:val="0"/>
           <w:sz w:val="24"/>
         </w:rPr>
-        <w:t>从工程实现角度看，校园用户匹配还受到数据规模和数据类型限制。一方面，校园系统在毕业设计阶段难以获得大规模连续行为日志，不适合直接采用依赖海量点击或评分数据的复杂模型；另一方面，学生基础信息、兴趣标签、专业方向和社团参与情况相对容易结构化，适合采用标签画像、倒排召回和规则重排形成可演示、可验证的推荐链路。因此，本文将研究现状中较成熟的用户建模、内容推荐、社会化推荐和可解释推荐思想转化为轻量工程实现，并通过多算法对比说明最终方案选择，而不是追求复杂模型堆叠。</w:t>
+        <w:t>从工程实现角度看，校园用户匹配还受到数据规模和数据类型限制。一方面，校园系统在毕业设计阶段难以获得大规模连续行为日志，不适合直接采用依赖海量点击或评分数据的复杂模型；另一方面，学生基础信息、兴趣标签、专业方向和社团参与情况相对容易结构化，适合采用标签画像、倒排召回和规则重排形成可演示、可验证的推荐链路。因此，系统设计将用户建模、内容推荐、社会化推荐和可解释推荐思想转化为轻量工程实现，并通过多算法对比确定推荐方案，避免复杂模型堆叠。</w:t>
       </w:r>
     </w:p>
     <w:p>
@@ -2769,7 +2864,7 @@
           <w:b w:val="0"/>
           <w:sz w:val="24"/>
         </w:rPr>
-        <w:t>上述方案各有优势。通用社交平台覆盖面广，校园社区平台场景接近，兴趣活动平台组织效率较高，推荐算法平台技术体系成熟。然而，从本文项目目标出发，它们仍存在以下不足。首先，推荐对象和推荐场景不完全匹配，许多产品重点推荐内容、活动或群组，而本文需要推荐校园用户。其次，推荐依据缺少可追溯表达，用户往往只能看到结果，难以理解结果产生的具体原因。再次，校园属性在排序中的作用不足，年级、专业、社团和学习目标等因素没有被系统化纳入推荐链路。最后，用户反馈与后续画像更新之间缺少明确机制，用户行为难以影响后续推荐。</w:t>
+        <w:t>上述方案各有优势。通用社交平台覆盖面广，校园社区平台场景接近，兴趣活动平台组织效率较高，推荐算法平台技术体系成熟。然而，面向校园用户匹配场景时，它们仍存在以下不足。首先，推荐对象和推荐场景不完全匹配，许多产品重点推荐内容、活动或群组，而校园社交匹配需要推荐具体用户。其次，推荐依据缺少可追溯表达，用户往往只能看到结果，难以理解结果产生的具体原因。再次，校园属性在排序中的作用不足，年级、专业、社团和学习目标等因素没有被系统化纳入推荐链路。最后，用户反馈与后续画像更新之间缺少明确机制，用户行为难以影响后续推荐。</w:t>
       </w:r>
     </w:p>
     <w:p>
@@ -2786,10 +2881,11 @@
           <w:b w:val="0"/>
           <w:sz w:val="24"/>
         </w:rPr>
-        <w:t>综上，现有研究和产品为校园用户匹配提供了推荐算法、标签建模、社交网络分析和解释生成等基础，但在工程落地时仍需要结合校园场景重新组织系统边界。本文系统针对上述不足进行设计。系统以校园用户为推荐对象，围绕用户标签构建画像，通过标签倒排索引进行候选召回，采用相似度排序和校园规则重排生成推荐结果，并将推荐解释绑定到标签贡献、规则命中和可信连接原因。用户对推荐对象的反馈会回写到画像更新环节，使推荐过程形成闭环。因此，本文并不追求构建完整社交产品，而是重点解决校园用户匹配中的画像构建、结果排序、解释生成和反馈更新问题。</w:t>
-      </w:r>
-    </w:p>
-    <w:p>
+        <w:t>综上，现有研究和产品为校园用户匹配提供了推荐算法、标签建模、社交网络分析和解释生成等基础，但在工程落地时仍需要结合校园场景重新组织系统边界。本系统以校园用户为推荐对象，围绕用户标签构建画像，通过标签倒排索引进行候选召回，采用相似度排序和校园规则重排生成推荐结果，并将推荐解释绑定到标签贡献、规则命中和可信连接原因。用户对推荐对象的反馈会回写到画像更新环节，使推荐过程形成闭环。系统边界聚焦校园用户匹配中的画像构建、结果排序、解释生成和反馈更新问题。</w:t>
+      </w:r>
+    </w:p>
+    <w:p>
+      <w:bookmarkStart w:id="7" w:name="_TocLCJ007"/>
       <w:pPr>
         <w:pStyle w:val="2"/>
         <w:keepNext/>
@@ -2805,6 +2901,7 @@
         </w:rPr>
         <w:t>本文主要工作内容</w:t>
       </w:r>
+      <w:bookmarkEnd w:id="7"/>
     </w:p>
     <w:p>
       <w:pPr>
@@ -2820,7 +2917,7 @@
           <w:b w:val="0"/>
           <w:sz w:val="24"/>
         </w:rPr>
-        <w:t>针对同类方案中推荐对象不聚焦、推荐依据不透明、校园场景因素利用不足和反馈闭环不完整的问题，本文设计并实现了一套基于 Spring Boot 的校园社交匹配与可解释推荐系统。系统面向校园用户匹配场景，以用户画像构建模块、匹配推荐生成模块、推荐解释与用户反馈模块为主体功能，提供画像生成、候选召回、相似度排序、校园规则重排、推荐解释、用户反馈、链路展示和评估导出能力。</w:t>
+        <w:t>针对同类方案中推荐对象不聚焦、推荐依据不透明、校园场景因素利用不足和反馈闭环不完整的问题，系统采用 Spring Boot 实现校园社交匹配与可解释推荐能力。系统面向校园用户匹配场景，以用户画像构建模块、匹配推荐生成模块、推荐解释与用户反馈模块为主体功能，提供画像生成、候选召回、相似度排序、校园规则重排、推荐解释、用户反馈、链路展示和评估导出能力。</w:t>
       </w:r>
     </w:p>
     <w:p>
@@ -2854,7 +2951,7 @@
           <w:b w:val="0"/>
           <w:sz w:val="24"/>
         </w:rPr>
-        <w:t>（1）完成校园社交匹配场景需求分析。本文明确系统角色、核心功能和非功能约束，将工作重点限定在校园用户匹配、推荐解释和反馈更新上，避免将即时聊天、内容社区和大规模在线实验平台纳入系统边界。</w:t>
+        <w:t>（1）完成校园社交匹配场景需求分析。系统角色、核心功能和非功能约束得到明确，工作重点限定在校园用户匹配、推荐解释和反馈更新上。</w:t>
       </w:r>
     </w:p>
     <w:p>
@@ -2956,10 +3053,11 @@
           <w:b w:val="0"/>
           <w:sz w:val="24"/>
         </w:rPr>
-        <w:t>（7）完成系统测试与结果分析。本文通过测试用例、治理检查和离线评估验证系统功能链路。测试结果表明，系统能够完成从用户标签到 Top-K 推荐结果、推荐解释、用户反馈更新和结果复核的完整流程。</w:t>
-      </w:r>
-    </w:p>
-    <w:p>
+        <w:t>（7）完成系统测试与结果分析。通过测试用例、治理检查和离线评估验证系统功能链路。测试结果表明，系统能够完成从用户标签到 Top-K 推荐结果、推荐解释、用户反馈更新和结果复核的完整流程。</w:t>
+      </w:r>
+    </w:p>
+    <w:p>
+      <w:bookmarkStart w:id="8" w:name="_TocLCJ008"/>
       <w:pPr>
         <w:pStyle w:val="2"/>
         <w:keepNext/>
@@ -2975,6 +3073,7 @@
         </w:rPr>
         <w:t>本文组织结构</w:t>
       </w:r>
+      <w:bookmarkEnd w:id="8"/>
     </w:p>
     <w:p>
       <w:pPr>
@@ -3024,7 +3123,7 @@
           <w:b w:val="0"/>
           <w:sz w:val="24"/>
         </w:rPr>
-        <w:t>第 2 章为校园社交匹配推荐系统相关理论及技术综述，介绍推荐系统、基于内容推荐、TF-IDF、协同过滤、可解释推荐、混合推荐和本文采用的技术路线。</w:t>
+        <w:t>第 2 章为校园社交匹配推荐系统相关理论及技术综述，介绍推荐系统、基于内容推荐、TF-IDF、协同过滤、可解释推荐、混合推荐和系统技术路线。</w:t>
       </w:r>
     </w:p>
     <w:p>
@@ -3118,6 +3217,7 @@
       </w:r>
     </w:p>
     <w:p>
+      <w:bookmarkStart w:id="9" w:name="_TocLCJ009"/>
       <w:pPr>
         <w:pStyle w:val="1"/>
         <w:keepNext/>
@@ -3133,6 +3233,7 @@
         </w:rPr>
         <w:t>校园社交匹配推荐系统相关理论及技术综述</w:t>
       </w:r>
+      <w:bookmarkEnd w:id="9"/>
     </w:p>
     <w:p>
       <w:pPr>
@@ -3148,10 +3249,11 @@
           <w:b w:val="0"/>
           <w:sz w:val="24"/>
         </w:rPr>
-        <w:t>本章介绍本文系统涉及的相关理论和关键技术，包括推荐系统基本方法、基于内容的推荐、TF-IDF 权重计算、协同过滤、可解释推荐、混合推荐与场景化规则重排。由于本文属于工程型本科毕业设计，本章重点说明与系统设计和实现直接相关的技术依据，不展开复杂模型推导。</w:t>
-      </w:r>
-    </w:p>
-    <w:p>
+        <w:t>本章介绍系统涉及的相关理论和关键技术，包括推荐系统基本方法、基于内容的推荐、TF-IDF 权重计算、协同过滤、可解释推荐、混合推荐与场景化规则重排。相关技术说明围绕系统设计和实现展开，重点关注画像构建、推荐生成、解释生成和测试评估所需的技术依据。</w:t>
+      </w:r>
+    </w:p>
+    <w:p>
+      <w:bookmarkStart w:id="10" w:name="_TocLCJ010"/>
       <w:pPr>
         <w:pStyle w:val="2"/>
         <w:keepNext/>
@@ -3167,6 +3269,7 @@
         </w:rPr>
         <w:t>推荐系统概述</w:t>
       </w:r>
+      <w:bookmarkEnd w:id="10"/>
     </w:p>
     <w:p>
       <w:pPr>
@@ -3199,7 +3302,7 @@
           <w:b w:val="0"/>
           <w:sz w:val="24"/>
         </w:rPr>
-        <w:t>。常见推荐对象包括商品、内容、视频、音乐、课程和用户等。本文系统的推荐对象是校园用户，因此推荐结果不仅需要考虑兴趣相似性，还需要结合年级、专业、社团等校园场景因素。</w:t>
+        <w:t>。常见推荐对象包括商品、内容、视频、音乐、课程和用户等。本系统的推荐对象是校园用户，因此推荐结果不仅需要考虑兴趣相似性，还需要结合年级、专业、社团等校园场景因素。</w:t>
       </w:r>
     </w:p>
     <w:p>
@@ -3250,7 +3353,7 @@
           <w:b w:val="0"/>
           <w:sz w:val="24"/>
         </w:rPr>
-        <w:t>。本文系统在校园小规模数据和标签信息较明确的前提下，主要采用基于内容和规则重排的混合思路，而不是依赖大规模用户行为日志。</w:t>
+        <w:t>。本系统在校园小规模数据和标签信息较明确的前提下，主要采用基于内容和规则重排的混合思路，不依赖大规模用户行为日志。</w:t>
       </w:r>
     </w:p>
     <w:p>
@@ -3976,6 +4079,7 @@
       </w:pPr>
     </w:p>
     <w:p>
+      <w:bookmarkStart w:id="11" w:name="_TocLCJ011"/>
       <w:pPr>
         <w:pStyle w:val="2"/>
         <w:keepNext/>
@@ -3991,6 +4095,7 @@
         </w:rPr>
         <w:t>基于内容的推荐</w:t>
       </w:r>
+      <w:bookmarkEnd w:id="11"/>
     </w:p>
     <w:p>
       <w:pPr>
@@ -4040,7 +4145,7 @@
           <w:b w:val="0"/>
           <w:sz w:val="24"/>
         </w:rPr>
-        <w:t>在本文场景中，推荐对象是用户。系统将每个用户的标签集合转化为兴趣画像，再计算请求用户与候选用户画像之间的相似度。这种方法适合校园标签数据场景，因为用户兴趣、专业方向和社团参与情况可以较自然地表示为结构化标签。</w:t>
+        <w:t>在校园社交匹配场景中，推荐对象是用户。系统将每个用户的标签集合转化为兴趣画像，再计算请求用户与候选用户画像之间的相似度。这种方法适合校园标签数据场景，因为用户兴趣、专业方向和社团参与情况可以较自然地表示为结构化标签。</w:t>
       </w:r>
     </w:p>
     <w:p>
@@ -4091,10 +4196,11 @@
           <w:b w:val="0"/>
           <w:sz w:val="24"/>
         </w:rPr>
-        <w:t>因此，本文在画像阶段引入改进 TF-IDF、时间衰减和 Top-K 裁剪，在排序后引入校园规则重排和可信连接分。该处理方式不是替代基于内容推荐，而是在标签型校园数据的约束下提高画像区分度、解释可读性和推荐结果的场景适配能力。</w:t>
-      </w:r>
-    </w:p>
-    <w:p>
+        <w:t>因此，系统在画像阶段引入改进 TF-IDF、时间衰减和 Top-K 裁剪，在排序后引入校园规则重排和可信连接分，在标签型校园数据的约束下提高画像区分度、解释可读性和推荐结果的场景适配能力。</w:t>
+      </w:r>
+    </w:p>
+    <w:p>
+      <w:bookmarkStart w:id="12" w:name="_TocLCJ012"/>
       <w:pPr>
         <w:pStyle w:val="2"/>
         <w:keepNext/>
@@ -4110,6 +4216,7 @@
         </w:rPr>
         <w:t>TF-IDF 与用户画像</w:t>
       </w:r>
+      <w:bookmarkEnd w:id="12"/>
     </w:p>
     <w:p>
       <w:pPr>
@@ -4125,7 +4232,7 @@
           <w:b w:val="0"/>
           <w:sz w:val="24"/>
         </w:rPr>
-        <w:t>在基于内容推荐中，用户画像通常需要把文本、标签或属性转换为数值化特征。早期内容推荐大量借鉴信息检索中的向量空间模型，将词项或标签看作特征维度，再通过权重计算得到用户偏好向量</w:t>
+        <w:t>在基于内容推荐中，用户画像通常需要把文本、标签或属性转换为数值化特征。早期内容推荐大量使用信息检索中的向量空间模型，将词项或标签看作特征维度，再通过权重计算得到用户偏好向量</w:t>
       </w:r>
       <w:r>
         <w:rPr>
@@ -4193,7 +4300,7 @@
           <w:b w:val="0"/>
           <w:sz w:val="24"/>
         </w:rPr>
-        <w:t>本文将 TF-IDF 思路迁移到用户兴趣标签场景。对于用户画像而言，标签可以类比为文本中的词项，用户标签集合可以类比为文档。若某标签只在少数用户中出现，则该标签更能体现用户差异；若某标签在大量用户中出现，则其区分度较低。</w:t>
+        <w:t>系统将 TF-IDF 思路迁移到用户兴趣标签场景。对于用户画像而言，标签可以类比为文本中的词项，用户标签集合可以类比为文档。若某标签只在少数用户中出现，则该标签更能体现用户差异；若某标签在大量用户中出现，则其区分度较低。</w:t>
       </w:r>
     </w:p>
     <w:p>
@@ -4227,7 +4334,7 @@
           <w:b w:val="0"/>
           <w:sz w:val="24"/>
         </w:rPr>
-        <w:t>。该思路与本文使用标签权重构建用户画像具有一定相似性，但本文场景从电商用户画像转向校园用户匹配。</w:t>
+        <w:t>。该思路与标签权重画像构建具有一定相似性，本系统将应用场景从电商用户画像转向校园用户匹配。</w:t>
       </w:r>
     </w:p>
     <w:p>
@@ -4244,7 +4351,7 @@
           <w:b w:val="0"/>
           <w:sz w:val="24"/>
         </w:rPr>
-        <w:t>本文系统在传统 TF-IDF 基础上加入三类处理：一是保留标签区分度项，用于降低热门标签影响；二是加入时间衰减，用于体现用户兴趣的动态变化；三是采用 Top-K 裁剪，保留画像中的核心兴趣标签。具体而言，系统先读取用户标签关系，结合标签来源和初始权重生成标签基础分；随后根据标签在全体用户中的出现范围计算区分度，使过于普遍的标签不会主导画像；再根据标签选择或活跃时间加入衰减因子，使近期标签获得更高权重；最后选取权重较高的若干标签组成核心画像。</w:t>
+        <w:t>系统在传统 TF-IDF 基础上加入三类处理：一是保留标签区分度项，用于降低热门标签影响；二是加入时间衰减，用于体现用户兴趣的动态变化；三是采用 Top-K 裁剪，保留画像中的核心兴趣标签。具体而言，系统先读取用户标签关系，结合标签来源和初始权重生成标签基础分；随后根据标签在全体用户中的出现范围计算区分度，使过于普遍的标签不会主导画像；再根据标签选择或活跃时间加入衰减因子，使近期标签获得更高权重；最后选取权重较高的若干标签组成核心画像。</w:t>
       </w:r>
     </w:p>
     <w:p>
@@ -4278,10 +4385,11 @@
           <w:b w:val="0"/>
           <w:sz w:val="24"/>
         </w:rPr>
-        <w:t>TF-IDF 方法也存在局限。首先，它主要处理标签或词项的统计区分度，不能直接理解标签之间的语义相似关系；其次，在用户标签过少时，画像稳定性会受到影响；再次，传统 TF-IDF 不会自动表达社交关系、可信连接或用户反馈方向。因此，本文没有将 TF-IDF 作为完整推荐算法，而是将其作为用户画像权重计算的一部分，并在后续推荐链路中结合余弦相似度、校园规则重排和反馈更新机制。</w:t>
-      </w:r>
-    </w:p>
-    <w:p>
+        <w:t>TF-IDF 方法也存在局限。首先，它主要处理标签或词项的统计区分度，不能直接理解标签之间的语义相似关系；其次，在用户标签过少时，画像稳定性会受到影响；再次，传统 TF-IDF 不会自动表达社交关系、可信连接或用户反馈方向。因此，系统将 TF-IDF 用作用户画像权重计算的一部分，并在推荐链路中结合余弦相似度、校园规则重排和反馈更新机制。</w:t>
+      </w:r>
+    </w:p>
+    <w:p>
+      <w:bookmarkStart w:id="13" w:name="_TocLCJ013"/>
       <w:pPr>
         <w:pStyle w:val="2"/>
         <w:keepNext/>
@@ -4295,8 +4403,9 @@
           <w:b w:val="0"/>
           <w:sz w:val="30"/>
         </w:rPr>
-        <w:t>协同过滤与本文取舍</w:t>
-      </w:r>
+        <w:t>协同过滤与算法取舍</w:t>
+      </w:r>
+      <w:bookmarkEnd w:id="13"/>
     </w:p>
     <w:p>
       <w:pPr>
@@ -4448,10 +4557,11 @@
           <w:b w:val="0"/>
           <w:sz w:val="24"/>
         </w:rPr>
-        <w:t>协同过滤适合行为数据较丰富的推荐平台。本文系统以校园用户标签和场景规则为主要数据基础，若直接采用复杂协同过滤或矩阵分解模型，容易增加数据准备、模型解释和工程实现成本。因此，本文没有将协同过滤作为核心算法，而是采用基于标签画像和规则重排的轻量路线。</w:t>
-      </w:r>
-    </w:p>
-    <w:p>
+        <w:t>协同过滤适合行为数据较丰富的推荐平台。本系统以校园用户标签和场景规则为主要数据基础，若直接采用复杂协同过滤或矩阵分解模型，容易增加数据准备、模型解释和工程实现成本。因此，推荐主链路采用基于标签画像和规则重排的轻量路线。</w:t>
+      </w:r>
+    </w:p>
+    <w:p>
+      <w:bookmarkStart w:id="14" w:name="_TocLCJ014"/>
       <w:pPr>
         <w:pStyle w:val="2"/>
         <w:keepNext/>
@@ -4467,6 +4577,7 @@
         </w:rPr>
         <w:t>可解释推荐与大语言模型辅助解释</w:t>
       </w:r>
+      <w:bookmarkEnd w:id="14"/>
     </w:p>
     <w:p>
       <w:pPr>
@@ -4516,7 +4627,7 @@
           <w:b w:val="0"/>
           <w:sz w:val="24"/>
         </w:rPr>
-        <w:t>；本文则在标签型校园数据条件下采用更轻量的兴趣画像表示。</w:t>
+        <w:t>；本系统在标签型校园数据条件下采用更轻量的兴趣画像表示。</w:t>
       </w:r>
     </w:p>
     <w:p>
@@ -4550,7 +4661,7 @@
           <w:b w:val="0"/>
           <w:sz w:val="24"/>
         </w:rPr>
-        <w:t>近年来，大语言模型也开始被用于推荐系统相关研究。史鸿旭等对基于大语言模型的推荐系统进行了综述，说明大语言模型可以在语义理解、用户建模和自然语言解释等方面为推荐系统提供新的能力</w:t>
+        <w:t>近年来，大语言模型也开始被用于推荐系统相关研究。谢广明等对基于大语言模型的推荐系统进行了综述，说明大语言模型能够在语义理解、推荐模型构建和用户交互等方面为推荐系统提供新的能力</w:t>
       </w:r>
       <w:r>
         <w:rPr>
@@ -4567,7 +4678,7 @@
           <w:b w:val="0"/>
           <w:sz w:val="24"/>
         </w:rPr>
-        <w:t>。本文系统没有让大语言模型参与推荐排序，而是仅将其作为基于证据的解释文本改写能力，并保留规则解释回退。这样既能提升解释文本的自然度，也能避免推荐结果受不可控生成内容影响。</w:t>
+        <w:t>。本系统将大语言模型限定为基于证据的解释文本改写能力，并保留规则解释回退；推荐排序仍由画像相似度和校园规则重排完成。这样既能提升解释文本的自然度，也能避免推荐结果受不可控生成内容影响。</w:t>
       </w:r>
     </w:p>
     <w:p>
@@ -4584,10 +4695,11 @@
           <w:b w:val="0"/>
           <w:sz w:val="24"/>
         </w:rPr>
-        <w:t>本文系统采用证据绑定的解释策略：排序阶段记录共同标签和贡献值，重排阶段记录规则命中和分数变化，解释阶段从上述证据中生成文本，大语言模型只用于解释文本改写且不改变证据项，外部服务不可用时回退到规则解释。该实现方式可以保证解释与推荐逻辑保持一致。</w:t>
-      </w:r>
-    </w:p>
-    <w:p>
+        <w:t>系统采用证据绑定的解释策略：排序阶段记录共同标签和贡献值，重排阶段记录规则命中和分数变化，解释阶段从上述证据中生成文本，大语言模型只用于解释文本改写且不改变证据项，外部服务不可用时回退到规则解释。该实现方式可以保证解释与推荐逻辑保持一致。</w:t>
+      </w:r>
+    </w:p>
+    <w:p>
+      <w:bookmarkStart w:id="15" w:name="_TocLCJ015"/>
       <w:pPr>
         <w:pStyle w:val="2"/>
         <w:keepNext/>
@@ -4603,6 +4715,7 @@
         </w:rPr>
         <w:t>混合推荐与场景化规则重排</w:t>
       </w:r>
+      <w:bookmarkEnd w:id="15"/>
     </w:p>
     <w:p>
       <w:pPr>
@@ -4635,7 +4748,7 @@
           <w:b w:val="0"/>
           <w:sz w:val="24"/>
         </w:rPr>
-        <w:t>。本文系统虽然没有采用复杂模型融合，但采用了“标签画像 + 相似度排序 + 校园规则重排”的轻量混合思路。</w:t>
+        <w:t>。本系统采用“标签画像 + 相似度排序 + 校园规则重排”的轻量混合思路。</w:t>
       </w:r>
     </w:p>
     <w:p>
@@ -4652,7 +4765,7 @@
           <w:b w:val="0"/>
           <w:sz w:val="24"/>
         </w:rPr>
-        <w:t>本文面向校园场景，在基础相似度排序后增加规则重排。规则包括年级差、专业相关性和社团重合度，并通过 scenarioMode 区分学习搭子、社团搭子和兴趣同频三类目标。</w:t>
+        <w:t>系统面向校园场景，在基础相似度排序后增加规则重排。规则包括年级差、专业相关性和社团重合度，并通过 scenarioMode 区分学习搭子、社团搭子和兴趣同频三类目标。</w:t>
       </w:r>
     </w:p>
     <w:p>
@@ -4673,6 +4786,7 @@
       </w:r>
     </w:p>
     <w:p>
+      <w:bookmarkStart w:id="16" w:name="_TocLCJ016"/>
       <w:pPr>
         <w:pStyle w:val="2"/>
         <w:keepNext/>
@@ -4686,8 +4800,9 @@
           <w:b w:val="0"/>
           <w:sz w:val="30"/>
         </w:rPr>
-        <w:t>本文技术路线选择</w:t>
-      </w:r>
+        <w:t>系统技术路线选择</w:t>
+      </w:r>
+      <w:bookmarkEnd w:id="16"/>
     </w:p>
     <w:p>
       <w:pPr>
@@ -4703,7 +4818,7 @@
           <w:b w:val="0"/>
           <w:sz w:val="24"/>
         </w:rPr>
-        <w:t>综合上述相关工作和项目约束，本文选择以下技术路线：</w:t>
+        <w:t>综合上述相关工作和项目约束，系统采用以下技术路线：</w:t>
       </w:r>
     </w:p>
     <w:p>
@@ -4890,7 +5005,7 @@
           <w:b w:val="0"/>
           <w:sz w:val="24"/>
         </w:rPr>
-        <w:t>。这些观点与本文采用的轻量工程路线一致，即在可实现的算法基础上保留可解释和可验证的用户体验支撑。</w:t>
+        <w:t>。这些观点与系统采用的轻量工程路线一致，即在可实现的算法基础上保留可解释和可验证的用户体验支撑。</w:t>
       </w:r>
     </w:p>
     <w:p>
@@ -4907,7 +5022,7 @@
           <w:b w:val="0"/>
           <w:sz w:val="24"/>
         </w:rPr>
-        <w:t>与本文更接近的是社会化推荐、互惠推荐和信任推荐方向。Pu 等对交互式推荐系统进行综述，指出透明度、控制感和用户信任会影响推荐系统的接受度</w:t>
+        <w:t>社会化推荐、互惠推荐和信任推荐方向与校园社交匹配更接近。Pu 等对交互式推荐系统进行综述，指出透明度、控制感和用户信任会影响推荐系统的接受度</w:t>
       </w:r>
       <w:r>
         <w:rPr>
@@ -4992,7 +5107,7 @@
           <w:b w:val="0"/>
           <w:sz w:val="24"/>
         </w:rPr>
-        <w:t>；但结合本文工程边界，大语言模型更适合作为基于证据的解释文本改写能力，而不宜直接替代可追溯的排序和重排逻辑。</w:t>
+        <w:t>；在本系统工程边界内，大语言模型更适合作为基于证据的解释文本改写能力，不直接替代可追溯的排序和重排逻辑。</w:t>
       </w:r>
     </w:p>
     <w:p>
@@ -5013,6 +5128,7 @@
       </w:r>
     </w:p>
     <w:p>
+      <w:bookmarkStart w:id="17" w:name="_TocLCJ017"/>
       <w:pPr>
         <w:pStyle w:val="2"/>
         <w:keepNext/>
@@ -5028,6 +5144,7 @@
         </w:rPr>
         <w:t>本章小结</w:t>
       </w:r>
+      <w:bookmarkEnd w:id="17"/>
     </w:p>
     <w:p>
       <w:pPr>
@@ -5043,7 +5160,7 @@
           <w:b w:val="0"/>
           <w:sz w:val="24"/>
         </w:rPr>
-        <w:t>本章介绍了推荐系统、基于内容推荐、TF-IDF、协同过滤、可解释推荐、大语言模型辅助解释和混合推荐等相关理论与技术。结合本文的数据条件和工程目标，系统采用基于标签画像和规则重排的轻量推荐方案，并将解释机制与推荐证据绑定。下一章将基于该技术路线展开系统需求分析。</w:t>
+        <w:t>本章介绍了推荐系统、基于内容推荐、TF-IDF、协同过滤、可解释推荐、大语言模型辅助解释和混合推荐等相关理论与技术。结合系统数据条件和工程目标，推荐链路采用基于标签画像和规则重排的轻量方案，并将解释机制与推荐证据绑定。下一章将基于该技术路线展开系统需求分析。</w:t>
       </w:r>
     </w:p>
     <w:p>
@@ -5052,6 +5169,7 @@
       </w:r>
     </w:p>
     <w:p>
+      <w:bookmarkStart w:id="18" w:name="_TocLCJ018"/>
       <w:pPr>
         <w:pStyle w:val="1"/>
         <w:keepNext/>
@@ -5067,6 +5185,7 @@
         </w:rPr>
         <w:t>校园社交匹配推荐系统需求分析</w:t>
       </w:r>
+      <w:bookmarkEnd w:id="18"/>
     </w:p>
     <w:p>
       <w:pPr>
@@ -5082,10 +5201,11 @@
           <w:b w:val="0"/>
           <w:sz w:val="24"/>
         </w:rPr>
-        <w:t>本章在项目目标和同类方案不足的基础上，对校园社交匹配推荐系统进行需求分析。系统面向校园用户匹配场景，核心任务是根据用户标签、校园属性和反馈行为生成可解释的匹配推荐结果。为保持第 3 章需求分析、第 4 章概要设计和第 5 章详细设计与实现之间的模块一致性，本章按用户画像构建模块、匹配推荐生成模块、推荐解释与用户反馈模块三个重点模块组织需求。</w:t>
-      </w:r>
-    </w:p>
-    <w:p>
+        <w:t>本章在项目目标和同类方案不足的基础上，对校园社交匹配推荐系统进行需求分析。系统面向校园用户匹配场景，核心任务是根据用户标签、校园属性和反馈行为生成可解释的匹配推荐结果。功能需求围绕用户画像构建模块、匹配推荐生成模块、推荐解释与用户反馈模块三个重点模块展开。</w:t>
+      </w:r>
+    </w:p>
+    <w:p>
+      <w:bookmarkStart w:id="19" w:name="_TocLCJ019"/>
       <w:pPr>
         <w:pStyle w:val="2"/>
         <w:keepNext/>
@@ -5101,6 +5221,7 @@
         </w:rPr>
         <w:t>需求分析综述</w:t>
       </w:r>
+      <w:bookmarkEnd w:id="19"/>
     </w:p>
     <w:p>
       <w:pPr>
@@ -5137,6 +5258,7 @@
       </w:r>
     </w:p>
     <w:p>
+      <w:bookmarkStart w:id="20" w:name="_TocLCJ020"/>
       <w:pPr>
         <w:pStyle w:val="2"/>
         <w:keepNext/>
@@ -5152,6 +5274,7 @@
         </w:rPr>
         <w:t>功能性需求</w:t>
       </w:r>
+      <w:bookmarkEnd w:id="20"/>
     </w:p>
     <w:p>
       <w:pPr>
@@ -5167,10 +5290,11 @@
           <w:b w:val="0"/>
           <w:sz w:val="24"/>
         </w:rPr>
-        <w:t>参考开发型论文范文中“系统功能性需求分析”按功能模块逐项展开的写法，本节以系统实际业务流程为依据，对用户与标签维护、用户画像构建模块、匹配推荐生成模块、推荐解释与用户反馈模块进行功能性需求分析。各子需求均先说明业务目标，再给出用例图和用例要素，使后续概要设计和详细设计能够沿用相同的模块边界。</w:t>
-      </w:r>
-    </w:p>
-    <w:p>
+        <w:t>本节以系统实际业务流程为依据，对用户与标签维护、用户画像构建模块、匹配推荐生成模块、推荐解释与用户反馈模块进行功能性需求分析。各子需求包括业务目标、用例图和用例要素，形成后续概要设计和详细实现的功能边界。</w:t>
+      </w:r>
+    </w:p>
+    <w:p>
+      <w:bookmarkStart w:id="21" w:name="_TocLCJ021"/>
       <w:pPr>
         <w:pStyle w:val="3"/>
         <w:keepNext/>
@@ -5186,6 +5310,7 @@
         </w:rPr>
         <w:t>用户与标签维护需求</w:t>
       </w:r>
+      <w:bookmarkEnd w:id="21"/>
     </w:p>
     <w:p>
       <w:pPr>
@@ -6037,6 +6162,7 @@
       </w:pPr>
     </w:p>
     <w:p>
+      <w:bookmarkStart w:id="22" w:name="_TocLCJ022"/>
       <w:pPr>
         <w:pStyle w:val="3"/>
         <w:keepNext/>
@@ -6052,6 +6178,7 @@
         </w:rPr>
         <w:t>用户画像构建模块需求</w:t>
       </w:r>
+      <w:bookmarkEnd w:id="22"/>
     </w:p>
     <w:p>
       <w:pPr>
@@ -6809,6 +6936,7 @@
       </w:pPr>
     </w:p>
     <w:p>
+      <w:bookmarkStart w:id="23" w:name="_TocLCJ023"/>
       <w:pPr>
         <w:pStyle w:val="3"/>
         <w:keepNext/>
@@ -6824,6 +6952,7 @@
         </w:rPr>
         <w:t>匹配推荐生成模块需求</w:t>
       </w:r>
+      <w:bookmarkEnd w:id="23"/>
     </w:p>
     <w:p>
       <w:pPr>
@@ -7675,6 +7804,7 @@
       </w:pPr>
     </w:p>
     <w:p>
+      <w:bookmarkStart w:id="24" w:name="_TocLCJ024"/>
       <w:pPr>
         <w:pStyle w:val="3"/>
         <w:keepNext/>
@@ -7690,6 +7820,7 @@
         </w:rPr>
         <w:t>推荐解释与用户反馈模块需求</w:t>
       </w:r>
+      <w:bookmarkEnd w:id="24"/>
     </w:p>
     <w:p>
       <w:pPr>
@@ -8635,6 +8766,7 @@
       </w:r>
     </w:p>
     <w:p>
+      <w:bookmarkStart w:id="25" w:name="_TocLCJ025"/>
       <w:pPr>
         <w:pStyle w:val="2"/>
         <w:keepNext/>
@@ -8650,6 +8782,7 @@
         </w:rPr>
         <w:t>非功能性需求</w:t>
       </w:r>
+      <w:bookmarkEnd w:id="25"/>
     </w:p>
     <w:p>
       <w:pPr>
@@ -9280,6 +9413,7 @@
       </w:pPr>
     </w:p>
     <w:p>
+      <w:bookmarkStart w:id="26" w:name="_TocLCJ026"/>
       <w:pPr>
         <w:pStyle w:val="2"/>
         <w:keepNext/>
@@ -9295,6 +9429,7 @@
         </w:rPr>
         <w:t>本章小结</w:t>
       </w:r>
+      <w:bookmarkEnd w:id="26"/>
     </w:p>
     <w:p>
       <w:pPr>
@@ -9310,7 +9445,7 @@
           <w:b w:val="0"/>
           <w:sz w:val="24"/>
         </w:rPr>
-        <w:t>本章围绕校园用户匹配推荐系统的功能性需求和非功能性需求进行了分析。功能性需求按用户与标签维护、用户画像构建模块、匹配推荐生成模块、推荐解释与用户反馈模块展开；非功能性需求从可维护性、可解释性、可验证性和响应可用性四个方面提出约束。其中，透明链路展示和评估导出作为推荐解释与用户反馈模块的复核能力存在，不再单独作为业务模块划分。上述需求明确了第 4 章概要设计的模块边界，也为第 5 章详细设计与实现中的业务流程图、类图、时序图和实现展示提供依据。</w:t>
+        <w:t>本章围绕校园用户匹配推荐系统的功能性需求和非功能性需求进行了分析。功能性需求按用户与标签维护、用户画像构建模块、匹配推荐生成模块、推荐解释与用户反馈模块展开；非功能性需求从可维护性、可解释性、可验证性和响应可用性四个方面提出约束。推荐解释与用户反馈模块包括解释生成、链路展示、评估导出和反馈更新等能力，用于支撑推荐结果的理解、复核与持续改进。上述需求明确了系统模块边界，也为详细设计与实现中的业务流程图、类图、时序图和实现展示提供依据。</w:t>
       </w:r>
     </w:p>
     <w:p>
@@ -9319,6 +9454,7 @@
       </w:r>
     </w:p>
     <w:p>
+      <w:bookmarkStart w:id="27" w:name="_TocLCJ027"/>
       <w:pPr>
         <w:pStyle w:val="1"/>
         <w:keepNext/>
@@ -9334,6 +9470,7 @@
         </w:rPr>
         <w:t>校园社交匹配推荐系统概要设计</w:t>
       </w:r>
+      <w:bookmarkEnd w:id="27"/>
     </w:p>
     <w:p>
       <w:pPr>
@@ -9353,6 +9490,7 @@
       </w:r>
     </w:p>
     <w:p>
+      <w:bookmarkStart w:id="28" w:name="_TocLCJ028"/>
       <w:pPr>
         <w:pStyle w:val="2"/>
         <w:keepNext/>
@@ -9368,6 +9506,7 @@
         </w:rPr>
         <w:t>系统整体架构设计</w:t>
       </w:r>
+      <w:bookmarkEnd w:id="28"/>
     </w:p>
     <w:p>
       <w:pPr>
@@ -9477,10 +9616,11 @@
           <w:b w:val="0"/>
           <w:sz w:val="24"/>
         </w:rPr>
-        <w:t>推荐主链路集中在服务端业务模块内部：用户服务和标签服务提供基础数据，画像服务将标签关系转化为权重向量，召回服务根据画像核心标签读取倒排索引，排序服务计算画像相似度，重排服务结合年级、专业、社团和场景模式调整结果，解释服务根据标签贡献和规则命中生成可追溯说明，反馈服务将用户关注或忽略行为写回画像更新环节。该结构能够降低控制器与算法逻辑的耦合度，也便于后续按模块开展测试和论文说明。</w:t>
-      </w:r>
-    </w:p>
-    <w:p>
+        <w:t>推荐主链路集中在服务端业务模块内部：用户服务和标签服务提供基础数据，画像服务将标签关系转化为权重向量，召回服务根据画像核心标签读取倒排索引，排序服务计算画像相似度，重排服务结合年级、专业、社团和场景模式调整结果，解释服务根据标签贡献和规则命中生成可追溯说明，反馈服务将用户关注或忽略行为写回画像更新环节。该结构能够降低控制器与算法逻辑的耦合度，并支撑模块化测试与功能复核。</w:t>
+      </w:r>
+    </w:p>
+    <w:p>
+      <w:bookmarkStart w:id="29" w:name="_TocLCJ029"/>
       <w:pPr>
         <w:pStyle w:val="2"/>
         <w:keepNext/>
@@ -9496,6 +9636,7 @@
         </w:rPr>
         <w:t>系统功能模块设计</w:t>
       </w:r>
+      <w:bookmarkEnd w:id="29"/>
     </w:p>
     <w:p>
       <w:pPr>
@@ -9511,7 +9652,7 @@
           <w:b w:val="0"/>
           <w:sz w:val="24"/>
         </w:rPr>
-        <w:t>根据第 3 章需求分析，系统功能结构如图 4-2 所示。开发型论文范文中的系统功能模块结构图具有层级清晰、同层模块对齐、顶层系统名称居中、下层功能以树形结构展开等特点，图中通常不展示复杂数据流，而是突出“系统 -&gt; 主模块 -&gt; 子功能”的包含关系。本文图 4-2 按照该风格绘制，使读者能够快速看出系统功能边界和各模块包含的子功能。</w:t>
+        <w:t>根据第 3 章需求分析，系统功能结构如图 4-2 所示。该结构以校园社交匹配推荐系统为顶层功能，将基础数据维护、用户画像构建、匹配推荐生成、推荐解释与用户反馈等能力按层级展开，重点说明系统功能边界和各模块包含的子功能。</w:t>
       </w:r>
     </w:p>
     <w:p>
@@ -9528,7 +9669,7 @@
           <w:b w:val="0"/>
           <w:sz w:val="24"/>
         </w:rPr>
-        <w:t>系统以校园用户匹配推荐为核心，将功能划分为基础数据维护和三个重点业务模块。基础数据维护负责用户信息、标签定义和用户标签关系；三个重点业务模块依次为用户画像构建模块、匹配推荐生成模块、推荐解释与用户反馈模块。透明链路展示和评估导出作为推荐解释与用户反馈模块的复核能力纳入该模块，不再单独作为并列业务模块。该顺序与第 3 章需求分析和第 5 章详细设计与实现保持一致。</w:t>
+        <w:t>系统以校园用户匹配推荐为核心，将功能划分为基础数据维护和三个重点业务模块。基础数据维护负责用户信息、标签定义和用户标签关系；用户画像构建模块负责生成画像向量；匹配推荐生成模块负责候选召回、排序和重排；推荐解释与用户反馈模块负责解释生成、透明链路展示、评估导出、反馈记录和画像更新。</w:t>
       </w:r>
     </w:p>
     <w:p>
@@ -9609,6 +9750,7 @@
       </w:r>
     </w:p>
     <w:p>
+      <w:bookmarkStart w:id="30" w:name="_TocLCJ030"/>
       <w:pPr>
         <w:pStyle w:val="2"/>
         <w:keepNext/>
@@ -9624,6 +9766,7 @@
         </w:rPr>
         <w:t>系统核心流程设计</w:t>
       </w:r>
+      <w:bookmarkEnd w:id="30"/>
     </w:p>
     <w:p>
       <w:pPr>
@@ -9716,10 +9859,11 @@
           <w:b w:val="0"/>
           <w:sz w:val="24"/>
         </w:rPr>
-        <w:t>如图 4-3 所示，系统核心流程不是单次列表查询，而是包含画像生成、推荐生成、解释生成、反馈更新和结果复核的闭环。该流程明确了第 5 章详细设计中各模块的调用顺序，也为第 6 章测试用例设计提供了依据。</w:t>
-      </w:r>
-    </w:p>
-    <w:p>
+        <w:t>如图 4-3 所示，系统核心流程包含画像生成、推荐生成、解释生成、反馈更新和结果复核等环节，形成完整闭环。该流程串联了各模块的调用顺序，并为测试用例设计提供了依据。</w:t>
+      </w:r>
+    </w:p>
+    <w:p>
+      <w:bookmarkStart w:id="31" w:name="_TocLCJ031"/>
       <w:pPr>
         <w:pStyle w:val="2"/>
         <w:keepNext/>
@@ -9735,6 +9879,7 @@
         </w:rPr>
         <w:t>数据存储设计</w:t>
       </w:r>
+      <w:bookmarkEnd w:id="31"/>
     </w:p>
     <w:p>
       <w:pPr>
@@ -9750,10 +9895,11 @@
           <w:b w:val="0"/>
           <w:sz w:val="24"/>
         </w:rPr>
-        <w:t>本系统的数据存储围绕推荐主链路展开。参考开发型论文中先说明数据关系、再给出物理表结构的组织方式，本节先使用 Peter Chen 表示法绘制 ER 图说明概念与逻辑层面的实体关系，再结合 MySQL 表结构给出物理模型和字段设计。由于概念模型和逻辑模型都用于说明实体及关系，本文不再分别绘制两张含义接近的图，而是用一张 ER 图集中展示实体、关系和关键属性。</w:t>
-      </w:r>
-    </w:p>
-    <w:p>
+        <w:t>本系统的数据存储围绕推荐主链路展开，先说明概念与逻辑层面的实体关系，再结合 MySQL 表结构给出物理模型和字段设计。数据存储设计需要同时支撑画像构建、推荐结果保存、解释证据追溯和用户反馈更新，因此实体关系与物理表结构均围绕推荐闭环组织。</w:t>
+      </w:r>
+    </w:p>
+    <w:p>
+      <w:bookmarkStart w:id="32" w:name="_TocLCJ032"/>
       <w:pPr>
         <w:pStyle w:val="3"/>
         <w:keepNext/>
@@ -9769,6 +9915,7 @@
         </w:rPr>
         <w:t>概念与逻辑模型设计</w:t>
       </w:r>
+      <w:bookmarkEnd w:id="32"/>
     </w:p>
     <w:p>
       <w:pPr>
@@ -9784,7 +9931,7 @@
           <w:b w:val="0"/>
           <w:sz w:val="24"/>
         </w:rPr>
-        <w:t>概念与逻辑模型用于描述系统业务对象、关系和关键属性，不直接限定数据库字段类型。系统涉及的核心实体包括用户、标签、用户画像、推荐结果、推荐解释和用户反馈，如图 4-4 所示。该图采用 Peter Chen 表示法：矩形表示实体，菱形表示实体之间的关系，椭圆表示关键属性，连线表示业务关联。用户通过“选择”关系关联标签，用户与标签共同“生成”用户画像；用户画像“产生”推荐结果；推荐结果“对应”推荐解释并“接收”用户反馈；用户反馈再影响后续画像更新。</w:t>
+        <w:t>概念与逻辑模型用于描述系统业务对象、关系和关键属性，不直接限定数据库字段类型。系统涉及的核心实体包括用户、标签、用户画像、推荐结果、推荐解释和用户反馈，如图 4-4 所示。用户通过“选择”关系关联标签，用户与标签共同“生成”用户画像；用户画像“产生”推荐结果；推荐结果“对应”推荐解释并“接收”用户反馈；用户反馈再影响后续画像更新。</w:t>
       </w:r>
     </w:p>
     <w:p>
@@ -9844,7 +9991,7 @@
           <w:b w:val="0"/>
           <w:sz w:val="21"/>
         </w:rPr>
-        <w:t>图 4-4 数据存储 ER 图（Peter Chen 表示法）</w:t>
+        <w:t>图 4-4 数据存储 ER 图</w:t>
       </w:r>
     </w:p>
     <w:p>
@@ -9865,6 +10012,7 @@
       </w:r>
     </w:p>
     <w:p>
+      <w:bookmarkStart w:id="33" w:name="_TocLCJ033"/>
       <w:pPr>
         <w:pStyle w:val="3"/>
         <w:keepNext/>
@@ -9880,6 +10028,7 @@
         </w:rPr>
         <w:t>物理模型设计</w:t>
       </w:r>
+      <w:bookmarkEnd w:id="33"/>
     </w:p>
     <w:p>
       <w:pPr>
@@ -22297,6 +22446,7 @@
       </w:r>
     </w:p>
     <w:p>
+      <w:bookmarkStart w:id="34" w:name="_TocLCJ034"/>
       <w:pPr>
         <w:pStyle w:val="2"/>
         <w:keepNext/>
@@ -22312,6 +22462,7 @@
         </w:rPr>
         <w:t>Redis 缓存设计</w:t>
       </w:r>
+      <w:bookmarkEnd w:id="34"/>
     </w:p>
     <w:p>
       <w:pPr>
@@ -22831,6 +22982,7 @@
       </w:pPr>
     </w:p>
     <w:p>
+      <w:bookmarkStart w:id="35" w:name="_TocLCJ035"/>
       <w:pPr>
         <w:pStyle w:val="2"/>
         <w:keepNext/>
@@ -22846,6 +22998,7 @@
         </w:rPr>
         <w:t>本章小结</w:t>
       </w:r>
+      <w:bookmarkEnd w:id="35"/>
     </w:p>
     <w:p>
       <w:pPr>
@@ -22861,7 +23014,7 @@
           <w:b w:val="0"/>
           <w:sz w:val="24"/>
         </w:rPr>
-        <w:t>本章完成了系统概要设计。系统采用 Spring Boot 单体分层架构，以校园用户匹配推荐为核心进行功能划分，并通过核心流程图说明推荐闭环的执行顺序。数据存储设计使用 Peter Chen 表示法 ER 图说明概念与逻辑层面的实体关系，再通过物理模型和表结构说明 MySQL 落表方式；Redis 用于支撑倒排召回和画像缓存。上述设计为第 5 章详细设计与实现提供了总体依据。</w:t>
+        <w:t>本章完成了系统概要设计。系统采用 Spring Boot 单体分层架构，以校园用户匹配推荐为核心进行功能划分，并通过核心流程图说明推荐闭环的执行顺序。数据存储设计通过 ER 图说明概念与逻辑层面的实体关系，再通过物理模型和表结构说明 MySQL 落表方式；Redis 用于支撑倒排召回和画像缓存。上述设计构成详细实现的总体基础。</w:t>
       </w:r>
     </w:p>
     <w:p>
@@ -22870,6 +23023,7 @@
       </w:r>
     </w:p>
     <w:p>
+      <w:bookmarkStart w:id="36" w:name="_TocLCJ036"/>
       <w:pPr>
         <w:pStyle w:val="1"/>
         <w:keepNext/>
@@ -22885,6 +23039,7 @@
         </w:rPr>
         <w:t>校园社交匹配推荐系统详细设计与实现</w:t>
       </w:r>
+      <w:bookmarkEnd w:id="36"/>
     </w:p>
     <w:p>
       <w:pPr>
@@ -22900,7 +23055,7 @@
           <w:b w:val="0"/>
           <w:sz w:val="24"/>
         </w:rPr>
-        <w:t>本章在概要设计的基础上，按重点模块说明校园社交匹配推荐系统的详细设计与实现。结合第 3 章需求和第 4 章功能结构，本文依次阐述用户画像构建模块、匹配推荐生成模块、推荐解释与用户反馈模块。各模块按照推荐链路的时间顺序展开，先说明业务流程，再说明类协作关系、时序交互过程、关键机制和主要界面效果。</w:t>
+        <w:t>本章在概要设计的基础上，按重点模块说明校园社交匹配推荐系统的详细设计与实现。系统详细设计围绕用户画像构建模块、匹配推荐生成模块、推荐解释与用户反馈模块展开。各模块按照推荐链路的时间顺序组织，先说明业务流程，再说明类协作关系、时序交互过程、关键机制和主要界面效果。</w:t>
       </w:r>
     </w:p>
     <w:p>
@@ -22917,10 +23072,11 @@
           <w:b w:val="0"/>
           <w:sz w:val="24"/>
         </w:rPr>
-        <w:t>开发型论文范文的详细设计章节通常按照“模块业务流程图 -&gt; 类图 -&gt; 时序图 -&gt; 实现效果图”的顺序展开。其业务流程图使用黑白线框、单向箭头和少量数据存储节点说明模块处理步骤；类图突出 Controller、Service、ServiceImpl、Mapper、实体或 DTO 等类之间的依赖；时序图按参与对象横向排列，并用水平消息线描述一次请求的调用顺序；实现效果图放在模块末尾，用于说明页面功能。本文第 5 章按上述特点重绘各模块非界面图，并使用系统本地运行后的真实浏览器截图展示主要界面效果。</w:t>
-      </w:r>
-    </w:p>
-    <w:p>
+        <w:t>第 5 章围绕推荐链路中的三个重点模块展开说明。每个模块先给出业务流程，明确输入、处理步骤和数据写入位置；再给出类协作关系和时序交互过程，说明控制器、服务实现、策略组件、数据访问层和缓存组件之间的调用关系；最后结合系统本地运行后的浏览器截图说明主要界面效果。</w:t>
+      </w:r>
+    </w:p>
+    <w:p>
+      <w:bookmarkStart w:id="37" w:name="_TocLCJ037"/>
       <w:pPr>
         <w:pStyle w:val="2"/>
         <w:keepNext/>
@@ -22936,6 +23092,7 @@
         </w:rPr>
         <w:t>用户画像构建模块</w:t>
       </w:r>
+      <w:bookmarkEnd w:id="37"/>
     </w:p>
     <w:p>
       <w:pPr>
@@ -22968,7 +23125,7 @@
           <w:b w:val="0"/>
           <w:sz w:val="24"/>
         </w:rPr>
-        <w:t>用户画像构建模块的业务流程如图 5-1 所示。该图参考开发型范文业务流程图的画法，以处理步骤为主线，并在流程旁标出 MySQL 和 Redis 等数据节点。系统接收画像构建请求后，首先读取用户标签关系，再按照标签频次、全局区分度、时间衰减和权重种子计算标签权重。权重计算完成后，系统截取 Top-K 核心标签，生成画像 JSON 和核心标签 JSON，并将结果保存到 MySQL 和 Redis 中。</w:t>
+        <w:t>用户画像构建模块的业务流程如图 5-1 所示。系统接收画像构建请求后，首先读取用户标签关系，再按照标签频次、全局区分度、时间衰减和权重种子计算标签权重。权重计算完成后，系统截取 Top-K 核心标签，生成画像 JSON 和核心标签 JSON，并将结果保存到 MySQL 和 Redis 中。</w:t>
       </w:r>
     </w:p>
     <w:p>
@@ -23062,7 +23219,7 @@
           <w:b w:val="0"/>
           <w:sz w:val="24"/>
         </w:rPr>
-        <w:t>用户画像构建模块的类关系如图 5-2 所示。该类图参考开发型范文类图的特点，按控制器、服务实现、策略接口、Mapper 和缓存仓储分层摆放，只保留关键方法和依赖关系，避免在图中堆叠完整代码字段。</w:t>
+        <w:t>用户画像构建模块的类关系如图 5-2 所示。该类图按控制器、服务实现、策略接口、Mapper 和缓存仓储展示模块内的主要协作关系，突出关键方法和依赖关系。</w:t>
       </w:r>
     </w:p>
     <w:p>
@@ -23156,7 +23313,7 @@
           <w:b w:val="0"/>
           <w:sz w:val="24"/>
         </w:rPr>
-        <w:t>用户画像生成时序如图 5-3 所示。该时序图参考开发型范文时序图的特点，将用户、控制器、服务、Mapper、计算器和存储组件横向排列，用消息线展示画像生成的一次完整调用。</w:t>
+        <w:t>用户画像生成时序如图 5-3 所示。该时序图将用户、控制器、服务、Mapper、计算器和存储组件作为主要参与对象，展示画像生成的一次完整调用。</w:t>
       </w:r>
     </w:p>
     <w:p>
@@ -23358,7 +23515,7 @@
           <w:b w:val="0"/>
           <w:sz w:val="24"/>
         </w:rPr>
-        <w:t>其中，tf(u,t) 表示标签在用户标签集合中的相对频次，idf(t) 表示标签全局区分度，decay(t) 表示时间衰减因子，seed(u,t) 表示用户标签关系中的权重种子。当前实现中保留 idf(t) 项，是为了后续接入全局标签分布统计。</w:t>
+        <w:t>其中，tf(u,t) 表示标签在用户标签集合中的相对频次，idf(t) 表示标签全局区分度，decay(t) 表示时间衰减因子，seed(u,t) 表示用户标签关系中的权重种子。当前实现中保留 idf(t) 项，便于接入全局标签分布统计。</w:t>
       </w:r>
     </w:p>
     <w:p>
@@ -23567,6 +23724,7 @@
       </w:r>
     </w:p>
     <w:p>
+      <w:bookmarkStart w:id="38" w:name="_TocLCJ038"/>
       <w:pPr>
         <w:pStyle w:val="2"/>
         <w:keepNext/>
@@ -23582,6 +23740,7 @@
         </w:rPr>
         <w:t>匹配推荐生成模块</w:t>
       </w:r>
+      <w:bookmarkEnd w:id="38"/>
     </w:p>
     <w:p>
       <w:pPr>
@@ -23614,7 +23773,7 @@
           <w:b w:val="0"/>
           <w:sz w:val="24"/>
         </w:rPr>
-        <w:t>匹配推荐生成模块的业务流程如图 5-5 所示。该图延续开发型范文模块业务流程图的特点，用从左到右、再向下回流的流程表达一次推荐请求的主要步骤，并在流程附近标出倒排索引、排序策略、重排规则和结果表。系统接收 Top-K 推荐请求后，先读取目标用户画像，并根据画像中的核心标签从 Redis 倒排索引中召回候选用户。候选集合生成后，系统读取候选用户画像并计算基础相似度，再结合校园规则执行重排，最后保存推荐结果、分数构成和解释证据。</w:t>
+        <w:t>匹配推荐生成模块的业务流程如图 5-5 所示。系统接收 Top-K 推荐请求后，先读取目标用户画像，并根据画像中的核心标签从 Redis 倒排索引中召回候选用户。候选集合生成后，系统读取候选用户画像并计算基础相似度，再结合校园规则执行重排，最后保存推荐结果、分数构成和解释证据。</w:t>
       </w:r>
     </w:p>
     <w:p>
@@ -23691,7 +23850,7 @@
           <w:b w:val="0"/>
           <w:sz w:val="24"/>
         </w:rPr>
-        <w:t>如图 5-5 所示，匹配推荐生成模块不是简单的数据库查询，而是由画像读取、候选召回、相似度排序、规则重排和结果保存组成的连续链路。该流程将性能敏感的召回环节放在 Redis 索引中，将推荐结果和证据材料保存在 MySQL 中，使后续解释生成和测试复核能够读取同一份推荐链路数据。</w:t>
+        <w:t>如图 5-5 所示，匹配推荐生成模块由画像读取、候选召回、相似度排序、规则重排和结果保存组成。该流程将性能敏感的召回环节放在 Redis 索引中，将推荐结果和证据材料保存在 MySQL 中，使解释生成和测试复核能够读取同一份推荐链路数据。</w:t>
       </w:r>
     </w:p>
     <w:p>
@@ -23708,7 +23867,7 @@
           <w:b w:val="0"/>
           <w:sz w:val="24"/>
         </w:rPr>
-        <w:t>匹配推荐生成模块的类关系如图 5-6 所示。该类图参考开发型范文中核心模块类图的表达方式，将推荐编排服务置于中心位置，周围布置画像、召回、排序、重排、可信连接、探索、解释和持久化组件，突出主服务对各能力类的调用关系。</w:t>
+        <w:t>匹配推荐生成模块的类关系如图 5-6 所示。RecommendationServiceImpl 是推荐主链路的编排入口，画像、召回、排序、重排、可信连接、探索、解释和持久化组件围绕该服务展开，体现一次推荐请求从画像读取到结果保存的主要依赖关系。</w:t>
       </w:r>
     </w:p>
     <w:p>
@@ -24618,7 +24777,7 @@
           <w:b w:val="0"/>
           <w:sz w:val="24"/>
         </w:rPr>
-        <w:t>为了体现推荐算法的选择过程，系统没有直接将完整链路作为唯一方案，而是保留了五种可对比的推荐策略。五种策略的输入数据相同，均使用同一批用户、标签和用户标签关系，差异主要体现在基础算法、画像权重、排序依据和是否叠加校园场景规则。推荐算法候选方案如表 5-2 所示。</w:t>
+        <w:t>推荐算法选择过程保留五种可对比策略。五种策略的输入数据相同，均使用同一批用户、标签和用户标签关系，差异主要体现在基础算法、画像权重、排序依据和是否叠加校园场景规则。推荐算法候选方案如表 5-2 所示。</w:t>
       </w:r>
     </w:p>
     <w:p>
@@ -25345,7 +25504,7 @@
                 <w:b w:val="0"/>
                 <w:sz w:val="21"/>
               </w:rPr>
-              <w:t>验证本文画像构建算法对学生兴趣重点的表达能力</w:t>
+              <w:t>验证画像构建算法对学生兴趣重点的表达能力</w:t>
             </w:r>
           </w:p>
         </w:tc>
@@ -25552,10 +25711,11 @@
           <w:b w:val="0"/>
           <w:sz w:val="24"/>
         </w:rPr>
-        <w:t>如表 5-2 所示，A1 用于判断“只看共同标签”能达到的基础水平，A2 用于验证集合相似度方法，A3 用于验证普通 TF-IDF 向量排序，A4 对应系统的画像算法，A5 对应最终上线链路。本文选择 A5 作为最终推荐方案，并不是因为其在所有单项指标上都必然最高，而是因为该方案同时保留画像权重、场景规则、可信连接和解释证据，能够支撑校园匹配系统的可解释性、可验证性和后续扩展。第 6 章将基于同一测试数据集对上述五种方案进行离线对比。</w:t>
-      </w:r>
-    </w:p>
-    <w:p>
+        <w:t>如表 5-2 所示，A1 用于判断“只看共同标签”能达到的基础水平，A2 用于验证集合相似度方法，A3 用于验证普通 TF-IDF 向量排序，A4 对应系统的画像算法，A5 对应完整推荐链路。最终推荐方案采用 A5，原因在于该方案同时保留画像权重、场景规则、可信连接和解释证据，能够支撑校园匹配系统的可解释性、可验证性和后续扩展。五种方案使用同一测试数据集进行离线对比。</w:t>
+      </w:r>
+    </w:p>
+    <w:p>
+      <w:bookmarkStart w:id="39" w:name="_TocLCJ039"/>
       <w:pPr>
         <w:pStyle w:val="2"/>
         <w:keepNext/>
@@ -25571,6 +25731,7 @@
         </w:rPr>
         <w:t>推荐解释与用户反馈模块</w:t>
       </w:r>
+      <w:bookmarkEnd w:id="39"/>
     </w:p>
     <w:p>
       <w:pPr>
@@ -25697,7 +25858,7 @@
           <w:b w:val="0"/>
           <w:sz w:val="24"/>
         </w:rPr>
-        <w:t>推荐解释与用户反馈模块的业务流程如图 5-9 所示。该图参考开发型范文业务流程图，采用单向主流程和辅助数据节点展示解释生成、外部服务改写、反馈保存和画像更新之间的关系。系统读取推荐结果和链路证据后，先抽取标签贡献、规则命中和可信连接原因，再生成规则解释文本。若外部大语言模型服务可用，系统仅将规则解释文本和证据摘要送入外部服务进行表达改写；若外部服务不可用，则直接返回规则解释。用户查看解释后可以提交关注或忽略反馈，系统保存反馈记录并触发画像更新。</w:t>
+        <w:t>推荐解释与用户反馈模块的业务流程如图 5-9 所示。系统读取推荐结果和链路证据后，先抽取标签贡献、规则命中和可信连接原因，再生成规则解释文本。若外部大语言模型服务可用，系统仅将规则解释文本和证据摘要送入外部服务进行表达改写；若外部服务不可用，则直接返回规则解释。用户查看解释后可以提交关注或忽略反馈，系统保存反馈记录并触发画像更新。</w:t>
       </w:r>
     </w:p>
     <w:p>
@@ -25791,7 +25952,7 @@
           <w:b w:val="0"/>
           <w:sz w:val="24"/>
         </w:rPr>
-        <w:t>推荐解释与用户反馈模块的类关系如图 5-10 所示。该类图参考开发型范文中“控制器 -&gt; 服务实现 -&gt; 工具类/Mapper”的层次表达，将解释生成与反馈处理拆成两条协作链路，便于说明外部大语言模型只负责基于证据改写解释文本。</w:t>
+        <w:t>推荐解释与用户反馈模块的类关系如图 5-10 所示。该模块将解释生成与反馈处理拆成两条协作链路：解释生成链路负责证据抽取、规则解释和外部改写，反馈处理链路负责反馈保存和画像更新。</w:t>
       </w:r>
     </w:p>
     <w:p>
@@ -25885,7 +26046,7 @@
           <w:b w:val="0"/>
           <w:sz w:val="24"/>
         </w:rPr>
-        <w:t>用户反馈更新时序如图 5-11 所示。该时序图参考开发型范文的调用顺序表达，将反馈提交、反馈保存、推荐证据读取、标签权重调整和画像重建串联为一次完整请求。</w:t>
+        <w:t>用户反馈更新时序如图 5-11 所示。该时序图将反馈提交、反馈保存、推荐证据读取、标签权重调整和画像重建串联为一次完整请求。</w:t>
       </w:r>
     </w:p>
     <w:p>
@@ -26795,10 +26956,11 @@
           <w:b w:val="0"/>
           <w:sz w:val="24"/>
         </w:rPr>
-        <w:t>透明链路页面还提供双视图对比和评估导出能力。双视图对比用于比较不同候选用户的分数构成、匹配标签和规则命中情况；评估导出用于保存测试数据集、评估指标和参数实验结果。该设计使第 6 章测试中的功能用例、非功能用例和离线评估能够回到系统中的具体页面、接口返回和导出材料。</w:t>
-      </w:r>
-    </w:p>
-    <w:p>
+        <w:t>透明链路页面还提供双视图对比和评估导出能力。双视图对比用于比较不同候选用户的分数构成、匹配标签和规则命中情况；评估导出用于保存测试数据集、评估指标和参数实验结果。功能用例、非功能用例和离线评估均可以回到系统中的具体页面、接口返回和导出材料。</w:t>
+      </w:r>
+    </w:p>
+    <w:p>
+      <w:bookmarkStart w:id="40" w:name="_TocLCJ040"/>
       <w:pPr>
         <w:pStyle w:val="2"/>
         <w:keepNext/>
@@ -26814,6 +26976,7 @@
         </w:rPr>
         <w:t>本章小结</w:t>
       </w:r>
+      <w:bookmarkEnd w:id="40"/>
     </w:p>
     <w:p>
       <w:pPr>
@@ -26829,7 +26992,7 @@
           <w:b w:val="0"/>
           <w:sz w:val="24"/>
         </w:rPr>
-        <w:t>本章按重点模块说明了校园社交匹配推荐系统的详细设计与实现。用户画像构建模块将标签关系转化为可计算画像；匹配推荐生成模块完成候选召回、基础排序、校园规则重排和推荐结果保存；推荐解释与用户反馈模块生成可追溯推荐理由，提供推荐过程复核和评估材料导出能力，并将用户行为回写到画像更新环节。上述模块共同构成“标签 -&gt; 画像 -&gt; 召回 -&gt; 排序 -&gt; 重排 -&gt; 解释 -&gt; 反馈 -&gt; 画像更新 -&gt; 结果复核”的推荐闭环，为第 6 章系统测试提供了实现依据。</w:t>
+        <w:t>本章按重点模块说明了校园社交匹配推荐系统的详细设计与实现。用户画像构建模块将标签关系转化为可计算画像；匹配推荐生成模块完成候选召回、基础排序、校园规则重排和推荐结果保存；推荐解释与用户反馈模块生成可追溯推荐理由，提供推荐过程复核和评估材料导出能力，并将用户行为回写到画像更新环节。上述模块共同构成“标签 -&gt; 画像 -&gt; 召回 -&gt; 排序 -&gt; 重排 -&gt; 解释 -&gt; 反馈 -&gt; 画像更新 -&gt; 结果复核”的推荐闭环。</w:t>
       </w:r>
     </w:p>
     <w:p>
@@ -26838,6 +27001,7 @@
       </w:r>
     </w:p>
     <w:p>
+      <w:bookmarkStart w:id="41" w:name="_TocLCJ041"/>
       <w:pPr>
         <w:pStyle w:val="1"/>
         <w:keepNext/>
@@ -26853,6 +27017,7 @@
         </w:rPr>
         <w:t>校园社交匹配推荐系统测试</w:t>
       </w:r>
+      <w:bookmarkEnd w:id="41"/>
     </w:p>
     <w:p>
       <w:pPr>
@@ -26872,6 +27037,7 @@
       </w:r>
     </w:p>
     <w:p>
+      <w:bookmarkStart w:id="42" w:name="_TocLCJ042"/>
       <w:pPr>
         <w:pStyle w:val="2"/>
         <w:keepNext/>
@@ -26887,6 +27053,7 @@
         </w:rPr>
         <w:t>测试目标</w:t>
       </w:r>
+      <w:bookmarkEnd w:id="42"/>
     </w:p>
     <w:p>
       <w:pPr>
@@ -26953,7 +27120,7 @@
           <w:b w:val="0"/>
           <w:sz w:val="24"/>
         </w:rPr>
-        <w:t>（3）验证推荐解释是否来自标签贡献、规则命中和可信连接原因，而不是脱离推荐过程单独生成。</w:t>
+        <w:t>（3）验证推荐解释是否来自标签贡献、规则命中和可信连接原因，并与推荐过程保持一致。</w:t>
       </w:r>
     </w:p>
     <w:p>
@@ -26991,6 +27158,7 @@
       </w:r>
     </w:p>
     <w:p>
+      <w:bookmarkStart w:id="43" w:name="_TocLCJ043"/>
       <w:pPr>
         <w:pStyle w:val="2"/>
         <w:keepNext/>
@@ -27006,6 +27174,7 @@
         </w:rPr>
         <w:t>测试环境</w:t>
       </w:r>
+      <w:bookmarkEnd w:id="43"/>
     </w:p>
     <w:p>
       <w:pPr>
@@ -27858,6 +28027,7 @@
       </w:r>
     </w:p>
     <w:p>
+      <w:bookmarkStart w:id="44" w:name="_TocLCJ044"/>
       <w:pPr>
         <w:pStyle w:val="2"/>
         <w:keepNext/>
@@ -27873,6 +28043,7 @@
         </w:rPr>
         <w:t>测试用例设计思路</w:t>
       </w:r>
+      <w:bookmarkEnd w:id="44"/>
     </w:p>
     <w:p>
       <w:pPr>
@@ -27888,7 +28059,7 @@
           <w:b w:val="0"/>
           <w:sz w:val="24"/>
         </w:rPr>
-        <w:t>测试用例按照黑盒测试思路设计。首先，根据第 3 章需求分析提取主要功能点，包括用户与标签维护、画像构建与推荐生成、推荐解释、用户反馈与画像更新、透明链路与评估展示。其次，将每个功能点拆分为测试准备、测试流程、预期结果和实际结果，保证测试过程可复查。最后，针对非功能性需求设计响应效率、可解释性、可维护性和可验证性测试，判断系统是否满足工程型毕业设计对稳定性和可复核性的要求。</w:t>
+        <w:t>测试用例按照黑盒测试思路设计。首先，根据第 3 章需求分析提取主要功能点，包括用户与标签维护、画像构建与推荐生成、推荐解释、用户反馈与画像更新、透明链路与评估展示。其次，将每个功能点拆分为测试准备、测试流程、预期结果和实际结果，保证测试过程可复查。最后，针对非功能性需求设计响应效率、可解释性、可维护性和可验证性测试，判断系统是否满足稳定性和可复核性要求。</w:t>
       </w:r>
     </w:p>
     <w:p>
@@ -27905,10 +28076,11 @@
           <w:b w:val="0"/>
           <w:sz w:val="24"/>
         </w:rPr>
-        <w:t>功能性需求测试重点检查系统是否按预期完成业务流程；非功能性需求测试重点检查响应可用性、解释可追溯性、模块边界和测试材料可重复性。测试用例格式参考工程型样例中的表 6-2，用表格记录用例编号、用例名称、测试目的、测试准备、测试流程、预期结果和实际结果。</w:t>
-      </w:r>
-    </w:p>
-    <w:p>
+        <w:t>功能性需求测试重点检查系统是否按预期完成业务流程；非功能性需求测试重点检查响应可用性、解释可追溯性、模块边界和测试材料可重复性。测试用例表记录用例编号、用例名称、测试目的、测试准备、测试流程、预期结果和实际结果，使测试过程能够被复查。</w:t>
+      </w:r>
+    </w:p>
+    <w:p>
+      <w:bookmarkStart w:id="45" w:name="_TocLCJ045"/>
       <w:pPr>
         <w:pStyle w:val="2"/>
         <w:keepNext/>
@@ -27924,6 +28096,7 @@
         </w:rPr>
         <w:t>功能性需求测试用例</w:t>
       </w:r>
+      <w:bookmarkEnd w:id="45"/>
     </w:p>
     <w:p>
       <w:pPr>
@@ -27939,7 +28112,7 @@
           <w:b w:val="0"/>
           <w:sz w:val="24"/>
         </w:rPr>
-        <w:t>功能性需求测试围绕第 3 章的用户与标签维护以及三个重点业务模块展开，测试用例如表 6-2 至表 6-6 所示。其中，透明链路与评估展示作为推荐解释与用户反馈模块的复核能力单独设置测试用例。</w:t>
+        <w:t>功能性需求测试围绕第 3 章的用户与标签维护以及三个重点业务模块展开，测试用例如表 6-2 至表 6-6 所示。透明链路与评估展示测试用于验证推荐过程展示、双视图对比和评估材料导出能力。</w:t>
       </w:r>
     </w:p>
     <w:p>
@@ -31533,6 +31706,7 @@
       </w:pPr>
     </w:p>
     <w:p>
+      <w:bookmarkStart w:id="46" w:name="_TocLCJ046"/>
       <w:pPr>
         <w:pStyle w:val="2"/>
         <w:keepNext/>
@@ -31548,6 +31722,7 @@
         </w:rPr>
         <w:t>非功能性需求测试用例</w:t>
       </w:r>
+      <w:bookmarkEnd w:id="46"/>
     </w:p>
     <w:p>
       <w:pPr>
@@ -33721,6 +33896,7 @@
       </w:pPr>
     </w:p>
     <w:p>
+      <w:bookmarkStart w:id="47" w:name="_TocLCJ047"/>
       <w:pPr>
         <w:pStyle w:val="2"/>
         <w:keepNext/>
@@ -33736,6 +33912,7 @@
         </w:rPr>
         <w:t>离线评估设计</w:t>
       </w:r>
+      <w:bookmarkEnd w:id="47"/>
     </w:p>
     <w:p>
       <w:pPr>
@@ -33785,7 +33962,7 @@
           <w:b w:val="0"/>
           <w:sz w:val="24"/>
         </w:rPr>
-        <w:t>离线评估指标的含义和计算口径如表 6-10 所示。该表用于说明第 6 章后续实验结果中各列数据的来源，避免只给出数值而缺少评价依据。</w:t>
+        <w:t>离线评估指标的含义和计算口径如表 6-10 所示。该表统一说明实验结果中各列数据的来源和评价用途。</w:t>
       </w:r>
     </w:p>
     <w:p>
@@ -34865,7 +35042,7 @@
           <w:b w:val="0"/>
           <w:sz w:val="24"/>
         </w:rPr>
-        <w:t>当前评估设置五类算法方案，如表 6-11 所示。五类方案对应第 5 章的算法选择过程，其中 A1、A2 和 A3 作为基础算法对比基线，A4 验证画像算法，A5 验证最终推荐链路。</w:t>
+        <w:t>当前评估设置五类算法方案，如表 6-11 所示。A1、A2 和 A3 作为基础算法对比基线，A4 验证画像算法，A5 验证完整推荐链路。</w:t>
       </w:r>
     </w:p>
     <w:p>
@@ -35627,7 +35804,7 @@
                 <w:b w:val="0"/>
                 <w:sz w:val="21"/>
               </w:rPr>
-              <w:t>验证本文画像权重算法</w:t>
+              <w:t>验证画像权重算法</w:t>
             </w:r>
           </w:p>
         </w:tc>
@@ -35799,7 +35976,7 @@
           <w:b w:val="0"/>
           <w:sz w:val="24"/>
         </w:rPr>
-        <w:t>上述指标中，Precision@K 和 NDCG@K 主要用于判断推荐结果的准确性和排序质量，覆盖率用于判断算法是否过度集中于少数候选用户，平均响应时间用于判断算法是否满足小规模实时推荐的工程要求，解释覆盖率用于验证推荐结果是否能够支撑第 5 章提出的解释展示需求。由于当前数据集规模有限，本文不将上述指标解释为真实线上满意度，而是将其作为算法方案选择和工程链路复核的离线依据。</w:t>
+        <w:t>上述指标中，Precision@K 和 NDCG@K 主要用于判断推荐结果的准确性和排序质量，覆盖率用于判断算法是否过度集中于少数候选用户，平均响应时间用于判断算法是否满足小规模实时推荐的工程要求，解释覆盖率用于验证推荐结果是否能够支撑解释展示需求。由于当前数据集规模有限，上述指标不用于推断真实线上满意度，而是作为算法方案选择和工程链路复核的离线依据。</w:t>
       </w:r>
     </w:p>
     <w:p>
@@ -38271,7 +38448,7 @@
           <w:b w:val="0"/>
           <w:sz w:val="24"/>
         </w:rPr>
-        <w:t>为了进一步验证场景规则对不同使用目的的影响，系统对场景模式、TopK、画像 Top 标签数和重排权重缩放进行组合实验，部分结果如表 6-13 所示。</w:t>
+        <w:t>系统进一步对场景模式、TopK、画像 Top 标签数和重排权重缩放进行组合实验，以验证场景规则对不同使用目的的影响，部分结果如表 6-13 所示。</w:t>
       </w:r>
     </w:p>
     <w:p>
@@ -39594,6 +39771,7 @@
       </w:r>
     </w:p>
     <w:p>
+      <w:bookmarkStart w:id="48" w:name="_TocLCJ048"/>
       <w:pPr>
         <w:pStyle w:val="2"/>
         <w:keepNext/>
@@ -39607,8 +39785,9 @@
           <w:b w:val="0"/>
           <w:sz w:val="30"/>
         </w:rPr>
-        <w:t>测试结果分析</w:t>
-      </w:r>
+        <w:t>扩展评估与工程化验证</w:t>
+      </w:r>
+      <w:bookmarkEnd w:id="48"/>
     </w:p>
     <w:p>
       <w:pPr>
@@ -39624,7 +39803,7 @@
           <w:b w:val="0"/>
           <w:sz w:val="24"/>
         </w:rPr>
-        <w:t>综合功能性需求测试、非功能性需求测试和离线评估结果，可以得到以下结论：</w:t>
+        <w:t>系统在原有演示数据集之外补充固定种子的扩展评估链路。该链路不写入业务数据库，而是在评估服务中按规则生成校园用户、标签和用户标签关系，再对五类推荐方案进行批量评估并导出 Markdown 结果文件。扩展评估包括三部分：第一，数据生成层固定标签集合、专业集合、年级分布和每个用户的标签数量，使不同运行批次可以得到相同输入；第二，算法评估层复用标签重叠、Jaccard、TF-IDF、改进 TF-IDF 和场景规则重排五类方案，保证扩展评估与前述算法选择口径一致；第三，导出层提供规模参数、TopK 和场景模式配置，输出用户规模、标签数、关系数和各项评估指标，便于结果复核和持续迭代。</w:t>
       </w:r>
     </w:p>
     <w:p>
@@ -39641,8 +39820,917 @@
           <w:b w:val="0"/>
           <w:sz w:val="24"/>
         </w:rPr>
-        <w:t>（1）系统主链路已经闭环。用户标签可以生成画像，画像可以驱动召回、排序、重排和解释，用户反馈可以回到画像更新环节。</w:t>
-      </w:r>
+        <w:t>扩展评估接口在学习搭子场景下设置 TopK=5，分别生成 100、300 和 500 个用户，每个用户绑定 6 个标签，标签总数为 36。扩展评估结果节选如表 6-14 所示。</w:t>
+      </w:r>
+    </w:p>
+    <w:p>
+      <w:pPr>
+        <w:keepNext/>
+        <w:widowControl/>
+        <w:spacing w:line="400" w:lineRule="exact" w:before="160" w:after="60"/>
+        <w:jc w:val="center"/>
+      </w:pPr>
+      <w:r/>
+      <w:r>
+        <w:rPr>
+          <w:rFonts w:ascii="Times New Roman" w:hAnsi="Times New Roman" w:eastAsia="宋体"/>
+          <w:b w:val="0"/>
+          <w:sz w:val="21"/>
+        </w:rPr>
+        <w:t>表 6-14 扩展评估结果节选</w:t>
+      </w:r>
+    </w:p>
+    <w:tbl>
+      <w:tblPr>
+        <w:tblW w:type="dxa" w:w="9071"/>
+        <w:jc w:val="center"/>
+        <w:tblLayout w:type="fixed"/>
+        <w:tblLook w:firstColumn="1" w:firstRow="1" w:lastColumn="0" w:lastRow="0" w:noHBand="0" w:noVBand="1" w:val="04A0"/>
+      </w:tblPr>
+      <w:tblGrid>
+        <w:gridCol w:w="1371"/>
+        <w:gridCol w:w="1218"/>
+        <w:gridCol w:w="1448"/>
+        <w:gridCol w:w="1448"/>
+        <w:gridCol w:w="1448"/>
+        <w:gridCol w:w="2138"/>
+      </w:tblGrid>
+      <w:tr>
+        <w:trPr>
+          <w:cantSplit/>
+          <w:trHeight w:val="460" w:hRule="atLeast"/>
+        </w:trPr>
+        <w:tc>
+          <w:tcPr>
+            <w:tcW w:type="dxa" w:w="1371"/>
+            <w:tcBorders>
+              <w:top w:val="single" w:sz="4" w:space="0" w:color="000000"/>
+              <w:left w:val="single" w:sz="4" w:space="0" w:color="000000"/>
+              <w:bottom w:val="single" w:sz="4" w:space="0" w:color="000000"/>
+              <w:right w:val="single" w:sz="4" w:space="0" w:color="000000"/>
+            </w:tcBorders>
+            <w:tcMar>
+              <w:top w:w="90" w:type="dxa"/>
+              <w:bottom w:w="90" w:type="dxa"/>
+              <w:left w:w="120" w:type="dxa"/>
+              <w:right w:w="120" w:type="dxa"/>
+            </w:tcMar>
+            <w:vAlign w:val="center"/>
+            <w:shd w:fill="D9E3F0"/>
+          </w:tcPr>
+          <w:p>
+            <w:pPr>
+              <w:keepNext/>
+              <w:keepLines/>
+              <w:spacing w:before="20" w:after="20" w:line="280" w:lineRule="exact"/>
+              <w:jc w:val="center"/>
+            </w:pPr>
+            <w:r/>
+            <w:r>
+              <w:rPr>
+                <w:rFonts w:ascii="Times New Roman" w:hAnsi="Times New Roman" w:eastAsia="宋体"/>
+                <w:b/>
+                <w:sz w:val="21"/>
+              </w:rPr>
+              <w:t>用户规模</w:t>
+            </w:r>
+          </w:p>
+        </w:tc>
+        <w:tc>
+          <w:tcPr>
+            <w:tcW w:type="dxa" w:w="1218"/>
+            <w:tcBorders>
+              <w:top w:val="single" w:sz="4" w:space="0" w:color="000000"/>
+              <w:left w:val="single" w:sz="4" w:space="0" w:color="000000"/>
+              <w:bottom w:val="single" w:sz="4" w:space="0" w:color="000000"/>
+              <w:right w:val="single" w:sz="4" w:space="0" w:color="000000"/>
+            </w:tcBorders>
+            <w:tcMar>
+              <w:top w:w="90" w:type="dxa"/>
+              <w:bottom w:w="90" w:type="dxa"/>
+              <w:left w:w="120" w:type="dxa"/>
+              <w:right w:w="120" w:type="dxa"/>
+            </w:tcMar>
+            <w:vAlign w:val="center"/>
+            <w:shd w:fill="D9E3F0"/>
+          </w:tcPr>
+          <w:p>
+            <w:pPr>
+              <w:keepNext/>
+              <w:keepLines/>
+              <w:spacing w:before="20" w:after="20" w:line="280" w:lineRule="exact"/>
+              <w:jc w:val="center"/>
+            </w:pPr>
+            <w:r/>
+            <w:r>
+              <w:rPr>
+                <w:rFonts w:ascii="Times New Roman" w:hAnsi="Times New Roman" w:eastAsia="宋体"/>
+                <w:b/>
+                <w:sz w:val="21"/>
+              </w:rPr>
+              <w:t>关系数</w:t>
+            </w:r>
+          </w:p>
+        </w:tc>
+        <w:tc>
+          <w:tcPr>
+            <w:tcW w:type="dxa" w:w="1448"/>
+            <w:tcBorders>
+              <w:top w:val="single" w:sz="4" w:space="0" w:color="000000"/>
+              <w:left w:val="single" w:sz="4" w:space="0" w:color="000000"/>
+              <w:bottom w:val="single" w:sz="4" w:space="0" w:color="000000"/>
+              <w:right w:val="single" w:sz="4" w:space="0" w:color="000000"/>
+            </w:tcBorders>
+            <w:tcMar>
+              <w:top w:w="90" w:type="dxa"/>
+              <w:bottom w:w="90" w:type="dxa"/>
+              <w:left w:w="120" w:type="dxa"/>
+              <w:right w:w="120" w:type="dxa"/>
+            </w:tcMar>
+            <w:vAlign w:val="center"/>
+            <w:shd w:fill="D9E3F0"/>
+          </w:tcPr>
+          <w:p>
+            <w:pPr>
+              <w:keepNext/>
+              <w:keepLines/>
+              <w:spacing w:before="20" w:after="20" w:line="280" w:lineRule="exact"/>
+              <w:jc w:val="center"/>
+            </w:pPr>
+            <w:r/>
+            <w:r>
+              <w:rPr>
+                <w:rFonts w:ascii="Times New Roman" w:hAnsi="Times New Roman" w:eastAsia="宋体"/>
+                <w:b/>
+                <w:sz w:val="21"/>
+              </w:rPr>
+              <w:t>A4 NDCG@K</w:t>
+            </w:r>
+          </w:p>
+        </w:tc>
+        <w:tc>
+          <w:tcPr>
+            <w:tcW w:type="dxa" w:w="1448"/>
+            <w:tcBorders>
+              <w:top w:val="single" w:sz="4" w:space="0" w:color="000000"/>
+              <w:left w:val="single" w:sz="4" w:space="0" w:color="000000"/>
+              <w:bottom w:val="single" w:sz="4" w:space="0" w:color="000000"/>
+              <w:right w:val="single" w:sz="4" w:space="0" w:color="000000"/>
+            </w:tcBorders>
+            <w:tcMar>
+              <w:top w:w="90" w:type="dxa"/>
+              <w:bottom w:w="90" w:type="dxa"/>
+              <w:left w:w="120" w:type="dxa"/>
+              <w:right w:w="120" w:type="dxa"/>
+            </w:tcMar>
+            <w:vAlign w:val="center"/>
+            <w:shd w:fill="D9E3F0"/>
+          </w:tcPr>
+          <w:p>
+            <w:pPr>
+              <w:keepNext/>
+              <w:keepLines/>
+              <w:spacing w:before="20" w:after="20" w:line="280" w:lineRule="exact"/>
+              <w:jc w:val="center"/>
+            </w:pPr>
+            <w:r/>
+            <w:r>
+              <w:rPr>
+                <w:rFonts w:ascii="Times New Roman" w:hAnsi="Times New Roman" w:eastAsia="宋体"/>
+                <w:b/>
+                <w:sz w:val="21"/>
+              </w:rPr>
+              <w:t>A5 NDCG@K</w:t>
+            </w:r>
+          </w:p>
+        </w:tc>
+        <w:tc>
+          <w:tcPr>
+            <w:tcW w:type="dxa" w:w="1448"/>
+            <w:tcBorders>
+              <w:top w:val="single" w:sz="4" w:space="0" w:color="000000"/>
+              <w:left w:val="single" w:sz="4" w:space="0" w:color="000000"/>
+              <w:bottom w:val="single" w:sz="4" w:space="0" w:color="000000"/>
+              <w:right w:val="single" w:sz="4" w:space="0" w:color="000000"/>
+            </w:tcBorders>
+            <w:tcMar>
+              <w:top w:w="90" w:type="dxa"/>
+              <w:bottom w:w="90" w:type="dxa"/>
+              <w:left w:w="120" w:type="dxa"/>
+              <w:right w:w="120" w:type="dxa"/>
+            </w:tcMar>
+            <w:vAlign w:val="center"/>
+            <w:shd w:fill="D9E3F0"/>
+          </w:tcPr>
+          <w:p>
+            <w:pPr>
+              <w:keepNext/>
+              <w:keepLines/>
+              <w:spacing w:before="20" w:after="20" w:line="280" w:lineRule="exact"/>
+              <w:jc w:val="center"/>
+            </w:pPr>
+            <w:r/>
+            <w:r>
+              <w:rPr>
+                <w:rFonts w:ascii="Times New Roman" w:hAnsi="Times New Roman" w:eastAsia="宋体"/>
+                <w:b/>
+                <w:sz w:val="21"/>
+              </w:rPr>
+              <w:t>A5 覆盖率</w:t>
+            </w:r>
+          </w:p>
+        </w:tc>
+        <w:tc>
+          <w:tcPr>
+            <w:tcW w:type="dxa" w:w="2138"/>
+            <w:tcBorders>
+              <w:top w:val="single" w:sz="4" w:space="0" w:color="000000"/>
+              <w:left w:val="single" w:sz="4" w:space="0" w:color="000000"/>
+              <w:bottom w:val="single" w:sz="4" w:space="0" w:color="000000"/>
+              <w:right w:val="single" w:sz="4" w:space="0" w:color="000000"/>
+            </w:tcBorders>
+            <w:tcMar>
+              <w:top w:w="90" w:type="dxa"/>
+              <w:bottom w:w="90" w:type="dxa"/>
+              <w:left w:w="120" w:type="dxa"/>
+              <w:right w:w="120" w:type="dxa"/>
+            </w:tcMar>
+            <w:vAlign w:val="center"/>
+            <w:shd w:fill="D9E3F0"/>
+          </w:tcPr>
+          <w:p>
+            <w:pPr>
+              <w:keepNext/>
+              <w:keepLines/>
+              <w:spacing w:before="20" w:after="20" w:line="280" w:lineRule="exact"/>
+              <w:jc w:val="center"/>
+            </w:pPr>
+            <w:r/>
+            <w:r>
+              <w:rPr>
+                <w:rFonts w:ascii="Times New Roman" w:hAnsi="Times New Roman" w:eastAsia="宋体"/>
+                <w:b/>
+                <w:sz w:val="21"/>
+              </w:rPr>
+              <w:t>A5 平均响应时间/ms</w:t>
+            </w:r>
+          </w:p>
+        </w:tc>
+      </w:tr>
+      <w:tr>
+        <w:trPr>
+          <w:cantSplit/>
+          <w:trHeight w:val="430" w:hRule="atLeast"/>
+        </w:trPr>
+        <w:tc>
+          <w:tcPr>
+            <w:tcW w:type="dxa" w:w="1371"/>
+            <w:tcBorders>
+              <w:top w:val="single" w:sz="4" w:space="0" w:color="000000"/>
+              <w:left w:val="single" w:sz="4" w:space="0" w:color="000000"/>
+              <w:bottom w:val="single" w:sz="4" w:space="0" w:color="000000"/>
+              <w:right w:val="single" w:sz="4" w:space="0" w:color="000000"/>
+            </w:tcBorders>
+            <w:tcMar>
+              <w:top w:w="90" w:type="dxa"/>
+              <w:bottom w:w="90" w:type="dxa"/>
+              <w:left w:w="120" w:type="dxa"/>
+              <w:right w:w="120" w:type="dxa"/>
+            </w:tcMar>
+            <w:vAlign w:val="center"/>
+          </w:tcPr>
+          <w:p>
+            <w:pPr>
+              <w:keepNext/>
+              <w:keepLines/>
+              <w:spacing w:before="20" w:after="20" w:line="280" w:lineRule="exact"/>
+              <w:jc w:val="center"/>
+            </w:pPr>
+            <w:r/>
+            <w:r>
+              <w:rPr>
+                <w:rFonts w:ascii="Times New Roman" w:hAnsi="Times New Roman" w:eastAsia="宋体"/>
+                <w:b w:val="0"/>
+                <w:sz w:val="21"/>
+              </w:rPr>
+              <w:t>100</w:t>
+            </w:r>
+          </w:p>
+        </w:tc>
+        <w:tc>
+          <w:tcPr>
+            <w:tcW w:type="dxa" w:w="1218"/>
+            <w:tcBorders>
+              <w:top w:val="single" w:sz="4" w:space="0" w:color="000000"/>
+              <w:left w:val="single" w:sz="4" w:space="0" w:color="000000"/>
+              <w:bottom w:val="single" w:sz="4" w:space="0" w:color="000000"/>
+              <w:right w:val="single" w:sz="4" w:space="0" w:color="000000"/>
+            </w:tcBorders>
+            <w:tcMar>
+              <w:top w:w="90" w:type="dxa"/>
+              <w:bottom w:w="90" w:type="dxa"/>
+              <w:left w:w="120" w:type="dxa"/>
+              <w:right w:w="120" w:type="dxa"/>
+            </w:tcMar>
+            <w:vAlign w:val="center"/>
+          </w:tcPr>
+          <w:p>
+            <w:pPr>
+              <w:keepNext/>
+              <w:keepLines/>
+              <w:spacing w:before="20" w:after="20" w:line="280" w:lineRule="exact"/>
+              <w:jc w:val="center"/>
+            </w:pPr>
+            <w:r/>
+            <w:r>
+              <w:rPr>
+                <w:rFonts w:ascii="Times New Roman" w:hAnsi="Times New Roman" w:eastAsia="宋体"/>
+                <w:b w:val="0"/>
+                <w:sz w:val="21"/>
+              </w:rPr>
+              <w:t>600</w:t>
+            </w:r>
+          </w:p>
+        </w:tc>
+        <w:tc>
+          <w:tcPr>
+            <w:tcW w:type="dxa" w:w="1448"/>
+            <w:tcBorders>
+              <w:top w:val="single" w:sz="4" w:space="0" w:color="000000"/>
+              <w:left w:val="single" w:sz="4" w:space="0" w:color="000000"/>
+              <w:bottom w:val="single" w:sz="4" w:space="0" w:color="000000"/>
+              <w:right w:val="single" w:sz="4" w:space="0" w:color="000000"/>
+            </w:tcBorders>
+            <w:tcMar>
+              <w:top w:w="90" w:type="dxa"/>
+              <w:bottom w:w="90" w:type="dxa"/>
+              <w:left w:w="120" w:type="dxa"/>
+              <w:right w:w="120" w:type="dxa"/>
+            </w:tcMar>
+            <w:vAlign w:val="center"/>
+          </w:tcPr>
+          <w:p>
+            <w:pPr>
+              <w:keepNext/>
+              <w:keepLines/>
+              <w:spacing w:before="20" w:after="20" w:line="280" w:lineRule="exact"/>
+              <w:jc w:val="center"/>
+            </w:pPr>
+            <w:r/>
+            <w:r>
+              <w:rPr>
+                <w:rFonts w:ascii="Times New Roman" w:hAnsi="Times New Roman" w:eastAsia="宋体"/>
+                <w:b w:val="0"/>
+                <w:sz w:val="21"/>
+              </w:rPr>
+              <w:t>0.6756</w:t>
+            </w:r>
+          </w:p>
+        </w:tc>
+        <w:tc>
+          <w:tcPr>
+            <w:tcW w:type="dxa" w:w="1448"/>
+            <w:tcBorders>
+              <w:top w:val="single" w:sz="4" w:space="0" w:color="000000"/>
+              <w:left w:val="single" w:sz="4" w:space="0" w:color="000000"/>
+              <w:bottom w:val="single" w:sz="4" w:space="0" w:color="000000"/>
+              <w:right w:val="single" w:sz="4" w:space="0" w:color="000000"/>
+            </w:tcBorders>
+            <w:tcMar>
+              <w:top w:w="90" w:type="dxa"/>
+              <w:bottom w:w="90" w:type="dxa"/>
+              <w:left w:w="120" w:type="dxa"/>
+              <w:right w:w="120" w:type="dxa"/>
+            </w:tcMar>
+            <w:vAlign w:val="center"/>
+          </w:tcPr>
+          <w:p>
+            <w:pPr>
+              <w:keepNext/>
+              <w:keepLines/>
+              <w:spacing w:before="20" w:after="20" w:line="280" w:lineRule="exact"/>
+              <w:jc w:val="center"/>
+            </w:pPr>
+            <w:r/>
+            <w:r>
+              <w:rPr>
+                <w:rFonts w:ascii="Times New Roman" w:hAnsi="Times New Roman" w:eastAsia="宋体"/>
+                <w:b w:val="0"/>
+                <w:sz w:val="21"/>
+              </w:rPr>
+              <w:t>0.8876</w:t>
+            </w:r>
+          </w:p>
+        </w:tc>
+        <w:tc>
+          <w:tcPr>
+            <w:tcW w:type="dxa" w:w="1448"/>
+            <w:tcBorders>
+              <w:top w:val="single" w:sz="4" w:space="0" w:color="000000"/>
+              <w:left w:val="single" w:sz="4" w:space="0" w:color="000000"/>
+              <w:bottom w:val="single" w:sz="4" w:space="0" w:color="000000"/>
+              <w:right w:val="single" w:sz="4" w:space="0" w:color="000000"/>
+            </w:tcBorders>
+            <w:tcMar>
+              <w:top w:w="90" w:type="dxa"/>
+              <w:bottom w:w="90" w:type="dxa"/>
+              <w:left w:w="120" w:type="dxa"/>
+              <w:right w:w="120" w:type="dxa"/>
+            </w:tcMar>
+            <w:vAlign w:val="center"/>
+          </w:tcPr>
+          <w:p>
+            <w:pPr>
+              <w:keepNext/>
+              <w:keepLines/>
+              <w:spacing w:before="20" w:after="20" w:line="280" w:lineRule="exact"/>
+              <w:jc w:val="center"/>
+            </w:pPr>
+            <w:r/>
+            <w:r>
+              <w:rPr>
+                <w:rFonts w:ascii="Times New Roman" w:hAnsi="Times New Roman" w:eastAsia="宋体"/>
+                <w:b w:val="0"/>
+                <w:sz w:val="21"/>
+              </w:rPr>
+              <w:t>1.0000</w:t>
+            </w:r>
+          </w:p>
+        </w:tc>
+        <w:tc>
+          <w:tcPr>
+            <w:tcW w:type="dxa" w:w="2138"/>
+            <w:tcBorders>
+              <w:top w:val="single" w:sz="4" w:space="0" w:color="000000"/>
+              <w:left w:val="single" w:sz="4" w:space="0" w:color="000000"/>
+              <w:bottom w:val="single" w:sz="4" w:space="0" w:color="000000"/>
+              <w:right w:val="single" w:sz="4" w:space="0" w:color="000000"/>
+            </w:tcBorders>
+            <w:tcMar>
+              <w:top w:w="90" w:type="dxa"/>
+              <w:bottom w:w="90" w:type="dxa"/>
+              <w:left w:w="120" w:type="dxa"/>
+              <w:right w:w="120" w:type="dxa"/>
+            </w:tcMar>
+            <w:vAlign w:val="center"/>
+          </w:tcPr>
+          <w:p>
+            <w:pPr>
+              <w:keepNext/>
+              <w:keepLines/>
+              <w:spacing w:before="20" w:after="20" w:line="280" w:lineRule="exact"/>
+              <w:jc w:val="left"/>
+            </w:pPr>
+            <w:r/>
+            <w:r>
+              <w:rPr>
+                <w:rFonts w:ascii="Times New Roman" w:hAnsi="Times New Roman" w:eastAsia="宋体"/>
+                <w:b w:val="0"/>
+                <w:sz w:val="21"/>
+              </w:rPr>
+              <w:t>0.0448</w:t>
+            </w:r>
+          </w:p>
+        </w:tc>
+      </w:tr>
+      <w:tr>
+        <w:trPr>
+          <w:cantSplit/>
+          <w:trHeight w:val="430" w:hRule="atLeast"/>
+        </w:trPr>
+        <w:tc>
+          <w:tcPr>
+            <w:tcW w:type="dxa" w:w="1371"/>
+            <w:tcBorders>
+              <w:top w:val="single" w:sz="4" w:space="0" w:color="000000"/>
+              <w:left w:val="single" w:sz="4" w:space="0" w:color="000000"/>
+              <w:bottom w:val="single" w:sz="4" w:space="0" w:color="000000"/>
+              <w:right w:val="single" w:sz="4" w:space="0" w:color="000000"/>
+            </w:tcBorders>
+            <w:tcMar>
+              <w:top w:w="90" w:type="dxa"/>
+              <w:bottom w:w="90" w:type="dxa"/>
+              <w:left w:w="120" w:type="dxa"/>
+              <w:right w:w="120" w:type="dxa"/>
+            </w:tcMar>
+            <w:vAlign w:val="center"/>
+          </w:tcPr>
+          <w:p>
+            <w:pPr>
+              <w:keepNext/>
+              <w:keepLines/>
+              <w:spacing w:before="20" w:after="20" w:line="280" w:lineRule="exact"/>
+              <w:jc w:val="center"/>
+            </w:pPr>
+            <w:r/>
+            <w:r>
+              <w:rPr>
+                <w:rFonts w:ascii="Times New Roman" w:hAnsi="Times New Roman" w:eastAsia="宋体"/>
+                <w:b w:val="0"/>
+                <w:sz w:val="21"/>
+              </w:rPr>
+              <w:t>300</w:t>
+            </w:r>
+          </w:p>
+        </w:tc>
+        <w:tc>
+          <w:tcPr>
+            <w:tcW w:type="dxa" w:w="1218"/>
+            <w:tcBorders>
+              <w:top w:val="single" w:sz="4" w:space="0" w:color="000000"/>
+              <w:left w:val="single" w:sz="4" w:space="0" w:color="000000"/>
+              <w:bottom w:val="single" w:sz="4" w:space="0" w:color="000000"/>
+              <w:right w:val="single" w:sz="4" w:space="0" w:color="000000"/>
+            </w:tcBorders>
+            <w:tcMar>
+              <w:top w:w="90" w:type="dxa"/>
+              <w:bottom w:w="90" w:type="dxa"/>
+              <w:left w:w="120" w:type="dxa"/>
+              <w:right w:w="120" w:type="dxa"/>
+            </w:tcMar>
+            <w:vAlign w:val="center"/>
+          </w:tcPr>
+          <w:p>
+            <w:pPr>
+              <w:keepNext/>
+              <w:keepLines/>
+              <w:spacing w:before="20" w:after="20" w:line="280" w:lineRule="exact"/>
+              <w:jc w:val="center"/>
+            </w:pPr>
+            <w:r/>
+            <w:r>
+              <w:rPr>
+                <w:rFonts w:ascii="Times New Roman" w:hAnsi="Times New Roman" w:eastAsia="宋体"/>
+                <w:b w:val="0"/>
+                <w:sz w:val="21"/>
+              </w:rPr>
+              <w:t>1800</w:t>
+            </w:r>
+          </w:p>
+        </w:tc>
+        <w:tc>
+          <w:tcPr>
+            <w:tcW w:type="dxa" w:w="1448"/>
+            <w:tcBorders>
+              <w:top w:val="single" w:sz="4" w:space="0" w:color="000000"/>
+              <w:left w:val="single" w:sz="4" w:space="0" w:color="000000"/>
+              <w:bottom w:val="single" w:sz="4" w:space="0" w:color="000000"/>
+              <w:right w:val="single" w:sz="4" w:space="0" w:color="000000"/>
+            </w:tcBorders>
+            <w:tcMar>
+              <w:top w:w="90" w:type="dxa"/>
+              <w:bottom w:w="90" w:type="dxa"/>
+              <w:left w:w="120" w:type="dxa"/>
+              <w:right w:w="120" w:type="dxa"/>
+            </w:tcMar>
+            <w:vAlign w:val="center"/>
+          </w:tcPr>
+          <w:p>
+            <w:pPr>
+              <w:keepNext/>
+              <w:keepLines/>
+              <w:spacing w:before="20" w:after="20" w:line="280" w:lineRule="exact"/>
+              <w:jc w:val="center"/>
+            </w:pPr>
+            <w:r/>
+            <w:r>
+              <w:rPr>
+                <w:rFonts w:ascii="Times New Roman" w:hAnsi="Times New Roman" w:eastAsia="宋体"/>
+                <w:b w:val="0"/>
+                <w:sz w:val="21"/>
+              </w:rPr>
+              <w:t>0.5470</w:t>
+            </w:r>
+          </w:p>
+        </w:tc>
+        <w:tc>
+          <w:tcPr>
+            <w:tcW w:type="dxa" w:w="1448"/>
+            <w:tcBorders>
+              <w:top w:val="single" w:sz="4" w:space="0" w:color="000000"/>
+              <w:left w:val="single" w:sz="4" w:space="0" w:color="000000"/>
+              <w:bottom w:val="single" w:sz="4" w:space="0" w:color="000000"/>
+              <w:right w:val="single" w:sz="4" w:space="0" w:color="000000"/>
+            </w:tcBorders>
+            <w:tcMar>
+              <w:top w:w="90" w:type="dxa"/>
+              <w:bottom w:w="90" w:type="dxa"/>
+              <w:left w:w="120" w:type="dxa"/>
+              <w:right w:w="120" w:type="dxa"/>
+            </w:tcMar>
+            <w:vAlign w:val="center"/>
+          </w:tcPr>
+          <w:p>
+            <w:pPr>
+              <w:keepNext/>
+              <w:keepLines/>
+              <w:spacing w:before="20" w:after="20" w:line="280" w:lineRule="exact"/>
+              <w:jc w:val="center"/>
+            </w:pPr>
+            <w:r/>
+            <w:r>
+              <w:rPr>
+                <w:rFonts w:ascii="Times New Roman" w:hAnsi="Times New Roman" w:eastAsia="宋体"/>
+                <w:b w:val="0"/>
+                <w:sz w:val="21"/>
+              </w:rPr>
+              <w:t>0.7839</w:t>
+            </w:r>
+          </w:p>
+        </w:tc>
+        <w:tc>
+          <w:tcPr>
+            <w:tcW w:type="dxa" w:w="1448"/>
+            <w:tcBorders>
+              <w:top w:val="single" w:sz="4" w:space="0" w:color="000000"/>
+              <w:left w:val="single" w:sz="4" w:space="0" w:color="000000"/>
+              <w:bottom w:val="single" w:sz="4" w:space="0" w:color="000000"/>
+              <w:right w:val="single" w:sz="4" w:space="0" w:color="000000"/>
+            </w:tcBorders>
+            <w:tcMar>
+              <w:top w:w="90" w:type="dxa"/>
+              <w:bottom w:w="90" w:type="dxa"/>
+              <w:left w:w="120" w:type="dxa"/>
+              <w:right w:w="120" w:type="dxa"/>
+            </w:tcMar>
+            <w:vAlign w:val="center"/>
+          </w:tcPr>
+          <w:p>
+            <w:pPr>
+              <w:keepNext/>
+              <w:keepLines/>
+              <w:spacing w:before="20" w:after="20" w:line="280" w:lineRule="exact"/>
+              <w:jc w:val="center"/>
+            </w:pPr>
+            <w:r/>
+            <w:r>
+              <w:rPr>
+                <w:rFonts w:ascii="Times New Roman" w:hAnsi="Times New Roman" w:eastAsia="宋体"/>
+                <w:b w:val="0"/>
+                <w:sz w:val="21"/>
+              </w:rPr>
+              <w:t>1.0000</w:t>
+            </w:r>
+          </w:p>
+        </w:tc>
+        <w:tc>
+          <w:tcPr>
+            <w:tcW w:type="dxa" w:w="2138"/>
+            <w:tcBorders>
+              <w:top w:val="single" w:sz="4" w:space="0" w:color="000000"/>
+              <w:left w:val="single" w:sz="4" w:space="0" w:color="000000"/>
+              <w:bottom w:val="single" w:sz="4" w:space="0" w:color="000000"/>
+              <w:right w:val="single" w:sz="4" w:space="0" w:color="000000"/>
+            </w:tcBorders>
+            <w:tcMar>
+              <w:top w:w="90" w:type="dxa"/>
+              <w:bottom w:w="90" w:type="dxa"/>
+              <w:left w:w="120" w:type="dxa"/>
+              <w:right w:w="120" w:type="dxa"/>
+            </w:tcMar>
+            <w:vAlign w:val="center"/>
+          </w:tcPr>
+          <w:p>
+            <w:pPr>
+              <w:keepNext/>
+              <w:keepLines/>
+              <w:spacing w:before="20" w:after="20" w:line="280" w:lineRule="exact"/>
+              <w:jc w:val="left"/>
+            </w:pPr>
+            <w:r/>
+            <w:r>
+              <w:rPr>
+                <w:rFonts w:ascii="Times New Roman" w:hAnsi="Times New Roman" w:eastAsia="宋体"/>
+                <w:b w:val="0"/>
+                <w:sz w:val="21"/>
+              </w:rPr>
+              <w:t>0.0759</w:t>
+            </w:r>
+          </w:p>
+        </w:tc>
+      </w:tr>
+      <w:tr>
+        <w:trPr>
+          <w:cantSplit/>
+          <w:trHeight w:val="430" w:hRule="atLeast"/>
+        </w:trPr>
+        <w:tc>
+          <w:tcPr>
+            <w:tcW w:type="dxa" w:w="1371"/>
+            <w:tcBorders>
+              <w:top w:val="single" w:sz="4" w:space="0" w:color="000000"/>
+              <w:left w:val="single" w:sz="4" w:space="0" w:color="000000"/>
+              <w:bottom w:val="single" w:sz="4" w:space="0" w:color="000000"/>
+              <w:right w:val="single" w:sz="4" w:space="0" w:color="000000"/>
+            </w:tcBorders>
+            <w:tcMar>
+              <w:top w:w="90" w:type="dxa"/>
+              <w:bottom w:w="90" w:type="dxa"/>
+              <w:left w:w="120" w:type="dxa"/>
+              <w:right w:w="120" w:type="dxa"/>
+            </w:tcMar>
+            <w:vAlign w:val="center"/>
+          </w:tcPr>
+          <w:p>
+            <w:pPr>
+              <w:keepNext w:val="0"/>
+              <w:keepLines/>
+              <w:spacing w:before="20" w:after="20" w:line="280" w:lineRule="exact"/>
+              <w:jc w:val="center"/>
+            </w:pPr>
+            <w:r/>
+            <w:r>
+              <w:rPr>
+                <w:rFonts w:ascii="Times New Roman" w:hAnsi="Times New Roman" w:eastAsia="宋体"/>
+                <w:b w:val="0"/>
+                <w:sz w:val="21"/>
+              </w:rPr>
+              <w:t>500</w:t>
+            </w:r>
+          </w:p>
+        </w:tc>
+        <w:tc>
+          <w:tcPr>
+            <w:tcW w:type="dxa" w:w="1218"/>
+            <w:tcBorders>
+              <w:top w:val="single" w:sz="4" w:space="0" w:color="000000"/>
+              <w:left w:val="single" w:sz="4" w:space="0" w:color="000000"/>
+              <w:bottom w:val="single" w:sz="4" w:space="0" w:color="000000"/>
+              <w:right w:val="single" w:sz="4" w:space="0" w:color="000000"/>
+            </w:tcBorders>
+            <w:tcMar>
+              <w:top w:w="90" w:type="dxa"/>
+              <w:bottom w:w="90" w:type="dxa"/>
+              <w:left w:w="120" w:type="dxa"/>
+              <w:right w:w="120" w:type="dxa"/>
+            </w:tcMar>
+            <w:vAlign w:val="center"/>
+          </w:tcPr>
+          <w:p>
+            <w:pPr>
+              <w:keepNext w:val="0"/>
+              <w:keepLines/>
+              <w:spacing w:before="20" w:after="20" w:line="280" w:lineRule="exact"/>
+              <w:jc w:val="center"/>
+            </w:pPr>
+            <w:r/>
+            <w:r>
+              <w:rPr>
+                <w:rFonts w:ascii="Times New Roman" w:hAnsi="Times New Roman" w:eastAsia="宋体"/>
+                <w:b w:val="0"/>
+                <w:sz w:val="21"/>
+              </w:rPr>
+              <w:t>3000</w:t>
+            </w:r>
+          </w:p>
+        </w:tc>
+        <w:tc>
+          <w:tcPr>
+            <w:tcW w:type="dxa" w:w="1448"/>
+            <w:tcBorders>
+              <w:top w:val="single" w:sz="4" w:space="0" w:color="000000"/>
+              <w:left w:val="single" w:sz="4" w:space="0" w:color="000000"/>
+              <w:bottom w:val="single" w:sz="4" w:space="0" w:color="000000"/>
+              <w:right w:val="single" w:sz="4" w:space="0" w:color="000000"/>
+            </w:tcBorders>
+            <w:tcMar>
+              <w:top w:w="90" w:type="dxa"/>
+              <w:bottom w:w="90" w:type="dxa"/>
+              <w:left w:w="120" w:type="dxa"/>
+              <w:right w:w="120" w:type="dxa"/>
+            </w:tcMar>
+            <w:vAlign w:val="center"/>
+          </w:tcPr>
+          <w:p>
+            <w:pPr>
+              <w:keepNext w:val="0"/>
+              <w:keepLines/>
+              <w:spacing w:before="20" w:after="20" w:line="280" w:lineRule="exact"/>
+              <w:jc w:val="center"/>
+            </w:pPr>
+            <w:r/>
+            <w:r>
+              <w:rPr>
+                <w:rFonts w:ascii="Times New Roman" w:hAnsi="Times New Roman" w:eastAsia="宋体"/>
+                <w:b w:val="0"/>
+                <w:sz w:val="21"/>
+              </w:rPr>
+              <w:t>0.5446</w:t>
+            </w:r>
+          </w:p>
+        </w:tc>
+        <w:tc>
+          <w:tcPr>
+            <w:tcW w:type="dxa" w:w="1448"/>
+            <w:tcBorders>
+              <w:top w:val="single" w:sz="4" w:space="0" w:color="000000"/>
+              <w:left w:val="single" w:sz="4" w:space="0" w:color="000000"/>
+              <w:bottom w:val="single" w:sz="4" w:space="0" w:color="000000"/>
+              <w:right w:val="single" w:sz="4" w:space="0" w:color="000000"/>
+            </w:tcBorders>
+            <w:tcMar>
+              <w:top w:w="90" w:type="dxa"/>
+              <w:bottom w:w="90" w:type="dxa"/>
+              <w:left w:w="120" w:type="dxa"/>
+              <w:right w:w="120" w:type="dxa"/>
+            </w:tcMar>
+            <w:vAlign w:val="center"/>
+          </w:tcPr>
+          <w:p>
+            <w:pPr>
+              <w:keepNext w:val="0"/>
+              <w:keepLines/>
+              <w:spacing w:before="20" w:after="20" w:line="280" w:lineRule="exact"/>
+              <w:jc w:val="center"/>
+            </w:pPr>
+            <w:r/>
+            <w:r>
+              <w:rPr>
+                <w:rFonts w:ascii="Times New Roman" w:hAnsi="Times New Roman" w:eastAsia="宋体"/>
+                <w:b w:val="0"/>
+                <w:sz w:val="21"/>
+              </w:rPr>
+              <w:t>0.8467</w:t>
+            </w:r>
+          </w:p>
+        </w:tc>
+        <w:tc>
+          <w:tcPr>
+            <w:tcW w:type="dxa" w:w="1448"/>
+            <w:tcBorders>
+              <w:top w:val="single" w:sz="4" w:space="0" w:color="000000"/>
+              <w:left w:val="single" w:sz="4" w:space="0" w:color="000000"/>
+              <w:bottom w:val="single" w:sz="4" w:space="0" w:color="000000"/>
+              <w:right w:val="single" w:sz="4" w:space="0" w:color="000000"/>
+            </w:tcBorders>
+            <w:tcMar>
+              <w:top w:w="90" w:type="dxa"/>
+              <w:bottom w:w="90" w:type="dxa"/>
+              <w:left w:w="120" w:type="dxa"/>
+              <w:right w:w="120" w:type="dxa"/>
+            </w:tcMar>
+            <w:vAlign w:val="center"/>
+          </w:tcPr>
+          <w:p>
+            <w:pPr>
+              <w:keepNext w:val="0"/>
+              <w:keepLines/>
+              <w:spacing w:before="20" w:after="20" w:line="280" w:lineRule="exact"/>
+              <w:jc w:val="center"/>
+            </w:pPr>
+            <w:r/>
+            <w:r>
+              <w:rPr>
+                <w:rFonts w:ascii="Times New Roman" w:hAnsi="Times New Roman" w:eastAsia="宋体"/>
+                <w:b w:val="0"/>
+                <w:sz w:val="21"/>
+              </w:rPr>
+              <w:t>1.0000</w:t>
+            </w:r>
+          </w:p>
+        </w:tc>
+        <w:tc>
+          <w:tcPr>
+            <w:tcW w:type="dxa" w:w="2138"/>
+            <w:tcBorders>
+              <w:top w:val="single" w:sz="4" w:space="0" w:color="000000"/>
+              <w:left w:val="single" w:sz="4" w:space="0" w:color="000000"/>
+              <w:bottom w:val="single" w:sz="4" w:space="0" w:color="000000"/>
+              <w:right w:val="single" w:sz="4" w:space="0" w:color="000000"/>
+            </w:tcBorders>
+            <w:tcMar>
+              <w:top w:w="90" w:type="dxa"/>
+              <w:bottom w:w="90" w:type="dxa"/>
+              <w:left w:w="120" w:type="dxa"/>
+              <w:right w:w="120" w:type="dxa"/>
+            </w:tcMar>
+            <w:vAlign w:val="center"/>
+          </w:tcPr>
+          <w:p>
+            <w:pPr>
+              <w:keepNext w:val="0"/>
+              <w:keepLines/>
+              <w:spacing w:before="20" w:after="20" w:line="280" w:lineRule="exact"/>
+              <w:jc w:val="left"/>
+            </w:pPr>
+            <w:r/>
+            <w:r>
+              <w:rPr>
+                <w:rFonts w:ascii="Times New Roman" w:hAnsi="Times New Roman" w:eastAsia="宋体"/>
+                <w:b w:val="0"/>
+                <w:sz w:val="21"/>
+              </w:rPr>
+              <w:t>0.0925</w:t>
+            </w:r>
+          </w:p>
+        </w:tc>
+      </w:tr>
+    </w:tbl>
+    <w:p>
+      <w:pPr>
+        <w:widowControl/>
+        <w:spacing w:line="20" w:lineRule="exact" w:before="0" w:after="120"/>
+      </w:pPr>
     </w:p>
     <w:p>
       <w:pPr>
@@ -39658,8 +40746,27 @@
           <w:b w:val="0"/>
           <w:sz w:val="24"/>
         </w:rPr>
-        <w:t>（2）功能测试覆盖第 3 章主要需求。用户与标签维护、画像构建、推荐生成、推荐解释、用户反馈和透明链路展示均有对应测试用例。</w:t>
-      </w:r>
+        <w:t>由表 6-14 可见，在固定种子扩展数据集上，A5 在三个用户规模下的 NDCG@K 均高于 A4，且覆盖率保持为 1.0000，说明场景规则重排在学习搭子场景中能够稳定改善排序位置，并避免推荐结果集中于少数候选。随着用户规模从 100 增加到 500，A5 平均响应时间从 0.0448 ms 增加到 0.0925 ms，仍处于毫秒级。该结果不能替代真实高并发压力测试，但能够说明系统已经具备可复现的数据扩展、批量评估和结果导出能力，为后续性能测试和线上数据接入提供了工程基础。</w:t>
+      </w:r>
+    </w:p>
+    <w:p>
+      <w:bookmarkStart w:id="49" w:name="_TocLCJ049"/>
+      <w:pPr>
+        <w:pStyle w:val="2"/>
+        <w:keepNext/>
+        <w:keepLines/>
+        <w:widowControl/>
+      </w:pPr>
+      <w:r/>
+      <w:r>
+        <w:rPr>
+          <w:rFonts w:ascii="Times New Roman" w:hAnsi="Times New Roman" w:eastAsia="黑体"/>
+          <w:b w:val="0"/>
+          <w:sz w:val="30"/>
+        </w:rPr>
+        <w:t>测试结果分析</w:t>
+      </w:r>
+      <w:bookmarkEnd w:id="49"/>
     </w:p>
     <w:p>
       <w:pPr>
@@ -39675,7 +40782,7 @@
           <w:b w:val="0"/>
           <w:sz w:val="24"/>
         </w:rPr>
-        <w:t>（3）推荐解释具有可追溯性。解释文本基于标签贡献、规则命中和可信连接原因生成，外部服务仅用于可选改写，不改变推荐计算结果。</w:t>
+        <w:t>综合功能性需求测试、非功能性需求测试、离线评估和扩展评估结果，可以得到以下结论：</w:t>
       </w:r>
     </w:p>
     <w:p>
@@ -39692,7 +40799,7 @@
           <w:b w:val="0"/>
           <w:sz w:val="24"/>
         </w:rPr>
-        <w:t>（4）非功能性需求得到验证。倒排索引和缓存机制支撑响应可用性，模块边界和评估材料支撑可维护性与可验证性。</w:t>
+        <w:t>（1）系统主链路已经闭环。用户标签可以生成画像，画像可以驱动召回、排序、重排和解释，用户反馈可以回到画像更新环节。</w:t>
       </w:r>
     </w:p>
     <w:p>
@@ -39709,7 +40816,7 @@
           <w:b w:val="0"/>
           <w:sz w:val="24"/>
         </w:rPr>
-        <w:t>（5）离线评估结果与算法选择一致。A1 能作为强基线说明共同标签的有效性，A2 说明集合相似度能够改善简单计数的覆盖范围，A3 和 A4 说明画像向量排序具备稳定效率，A5 在覆盖率、场景适配和解释证据方面更符合本文系统目标。</w:t>
+        <w:t>（2）功能测试覆盖第 3 章主要需求。用户与标签维护、画像构建、推荐生成、推荐解释、用户反馈和透明链路展示均有对应测试用例。</w:t>
       </w:r>
     </w:p>
     <w:p>
@@ -39726,10 +40833,79 @@
           <w:b w:val="0"/>
           <w:sz w:val="24"/>
         </w:rPr>
-        <w:t>因此，本章测试结果能够支撑工程型毕业设计中的“系统实现完整、功能可运行、推荐链路可解释、测试材料可重复”结论。</w:t>
-      </w:r>
-    </w:p>
-    <w:p>
+        <w:t>（3）推荐解释具有可追溯性。解释文本基于标签贡献、规则命中和可信连接原因生成，外部服务仅用于可选改写，不改变推荐计算结果。</w:t>
+      </w:r>
+    </w:p>
+    <w:p>
+      <w:pPr>
+        <w:widowControl/>
+        <w:spacing w:line="400" w:lineRule="exact" w:before="0" w:after="0"/>
+        <w:ind w:firstLine="480"/>
+        <w:jc w:val="both"/>
+      </w:pPr>
+      <w:r/>
+      <w:r>
+        <w:rPr>
+          <w:rFonts w:ascii="Times New Roman" w:hAnsi="Times New Roman" w:eastAsia="宋体"/>
+          <w:b w:val="0"/>
+          <w:sz w:val="24"/>
+        </w:rPr>
+        <w:t>（4）非功能性需求得到验证。倒排索引和缓存机制支撑响应可用性，模块边界和评估材料支撑可维护性与可验证性。</w:t>
+      </w:r>
+    </w:p>
+    <w:p>
+      <w:pPr>
+        <w:widowControl/>
+        <w:spacing w:line="400" w:lineRule="exact" w:before="0" w:after="0"/>
+        <w:ind w:firstLine="480"/>
+        <w:jc w:val="both"/>
+      </w:pPr>
+      <w:r/>
+      <w:r>
+        <w:rPr>
+          <w:rFonts w:ascii="Times New Roman" w:hAnsi="Times New Roman" w:eastAsia="宋体"/>
+          <w:b w:val="0"/>
+          <w:sz w:val="24"/>
+        </w:rPr>
+        <w:t>（5）离线评估结果与算法选择一致。A1 能作为强基线说明共同标签的有效性，A2 说明集合相似度能够改善简单计数的覆盖范围，A3 和 A4 说明画像向量排序具备稳定效率，A5 在覆盖率、场景适配和解释证据方面更符合系统目标。</w:t>
+      </w:r>
+    </w:p>
+    <w:p>
+      <w:pPr>
+        <w:widowControl/>
+        <w:spacing w:line="400" w:lineRule="exact" w:before="0" w:after="0"/>
+        <w:ind w:firstLine="480"/>
+        <w:jc w:val="both"/>
+      </w:pPr>
+      <w:r/>
+      <w:r>
+        <w:rPr>
+          <w:rFonts w:ascii="Times New Roman" w:hAnsi="Times New Roman" w:eastAsia="宋体"/>
+          <w:b w:val="0"/>
+          <w:sz w:val="24"/>
+        </w:rPr>
+        <w:t>（6）扩展评估链路提升了工程化验证能力。系统可以在不污染业务数据库的前提下生成固定种子数据集，并对不同用户规模进行批量评估和结果导出。</w:t>
+      </w:r>
+    </w:p>
+    <w:p>
+      <w:pPr>
+        <w:widowControl/>
+        <w:spacing w:line="400" w:lineRule="exact" w:before="0" w:after="0"/>
+        <w:ind w:firstLine="480"/>
+        <w:jc w:val="both"/>
+      </w:pPr>
+      <w:r/>
+      <w:r>
+        <w:rPr>
+          <w:rFonts w:ascii="Times New Roman" w:hAnsi="Times New Roman" w:eastAsia="宋体"/>
+          <w:b w:val="0"/>
+          <w:sz w:val="24"/>
+        </w:rPr>
+        <w:t>因此，测试结果能够支撑“系统实现完整、功能可运行、推荐链路可解释、测试材料可重复”结论。</w:t>
+      </w:r>
+    </w:p>
+    <w:p>
+      <w:bookmarkStart w:id="50" w:name="_TocLCJ050"/>
       <w:pPr>
         <w:pStyle w:val="2"/>
         <w:keepNext/>
@@ -39745,6 +40921,7 @@
         </w:rPr>
         <w:t>本章小结</w:t>
       </w:r>
+      <w:bookmarkEnd w:id="50"/>
     </w:p>
     <w:p>
       <w:pPr>
@@ -39760,7 +40937,7 @@
           <w:b w:val="0"/>
           <w:sz w:val="24"/>
         </w:rPr>
-        <w:t>本章从测试目标、测试环境、测试用例设计思路、功能性需求测试、非功能性需求测试和离线评估等方面对系统进行了验证。测试结果表明，系统已经实现校园社交匹配推荐的主要功能，推荐主链路能够稳定运行，解释与反馈机制具备工程可验证性。多算法对比实验说明，最终采用的“改进 TF-IDF + 场景规则重排”方案能够在保持结果可用的基础上提供更完整的场景适配和解释证据。后续可进一步增加真实用户反馈、并发测试和更多场景数据，以增强测试结论的完整性。</w:t>
+        <w:t>本章从测试目标、测试环境、测试用例设计思路、功能性需求测试、非功能性需求测试、离线评估和扩展评估等方面对系统进行了验证。测试结果表明，系统已经实现校园社交匹配推荐的主要功能，推荐主链路能够稳定运行，解释与反馈机制具备工程可验证性。多算法对比实验说明，最终采用的“改进 TF-IDF + 场景规则重排”方案能够在保持结果可用的基础上提供更完整的场景适配和解释证据。扩展评估链路进一步补充了固定种子数据生成、规模参数配置和结果导出能力，使后续性能测试和数据接入具备可复现基础。后续可进一步增加真实用户反馈、并发测试和更多场景数据，以增强测试结论的完整性。</w:t>
       </w:r>
     </w:p>
     <w:p>
@@ -39769,6 +40946,7 @@
       </w:r>
     </w:p>
     <w:p>
+      <w:bookmarkStart w:id="51" w:name="_TocLCJ051"/>
       <w:pPr>
         <w:pStyle w:val="1"/>
         <w:keepNext/>
@@ -39784,8 +40962,10 @@
         </w:rPr>
         <w:t>总结与展望</w:t>
       </w:r>
-    </w:p>
-    <w:p>
+      <w:bookmarkEnd w:id="51"/>
+    </w:p>
+    <w:p>
+      <w:bookmarkStart w:id="52" w:name="_TocLCJ052"/>
       <w:pPr>
         <w:pStyle w:val="2"/>
         <w:keepNext/>
@@ -39801,6 +40981,7 @@
         </w:rPr>
         <w:t>全文总结</w:t>
       </w:r>
+      <w:bookmarkEnd w:id="52"/>
     </w:p>
     <w:p>
       <w:pPr>
@@ -39833,7 +41014,7 @@
           <w:b w:val="0"/>
           <w:sz w:val="24"/>
         </w:rPr>
-        <w:t>围绕这一观点，系统采用分层后端架构组织实现，将接口层、应用服务层、领域能力层、数据访问层和基础设施层分离。用户、标签、用户标签关系、用户画像、推荐结果、推荐解释和用户反馈等数据模型构成了系统的数据基础。画像构建阶段以用户标签为输入，引入 TF-IDF 权重、时间衰减和 Top-K 裁剪，形成能够反映学生兴趣重点的画像向量。推荐生成阶段通过标签倒排索引召回候选用户，使用余弦相似度计算基础兴趣匹配分，并结合年级差、专业相关性、社团重合度、可信连接分和轻量探索机制完成场景化重排。推荐解释阶段不将解释文本作为孤立的自然语言生成任务，而是在排序和重排过程中保留共同标签、贡献值、规则命中和可信连接原因，再由解释模块根据这些证据生成推荐理由。反馈更新阶段记录用户对推荐对象的关注或忽略行为，并依据推荐证据对画像进行轻量调整，形成从画像构建、候选召回、排序重排、解释生成到反馈更新的闭环。</w:t>
+        <w:t>围绕这一观点，系统采用分层后端架构组织实现，将接口层、应用服务层、领域能力层、数据访问层和基础设施层分离。用户、标签、用户标签关系、用户画像、推荐结果、推荐解释和用户反馈等数据模型构成了系统的数据基础。画像构建阶段以用户标签为输入，引入 TF-IDF 权重、时间衰减和 Top-K 裁剪，形成能够反映学生兴趣重点的画像向量。推荐生成阶段通过标签倒排索引召回候选用户，使用余弦相似度计算基础兴趣匹配分，并结合年级差、专业相关性、社团重合度、可信连接分和轻量探索机制完成场景化重排。推荐解释阶段以排序和重排证据为基础，保留共同标签、贡献值、规则命中和可信连接原因，再由解释模块根据这些证据生成推荐理由。反馈更新阶段记录用户对推荐对象的关注或忽略行为，并依据推荐证据对画像进行轻量调整，形成从画像构建、候选召回、排序重排、解释生成到反馈更新的闭环。</w:t>
       </w:r>
     </w:p>
     <w:p>
@@ -39850,7 +41031,7 @@
           <w:b w:val="0"/>
           <w:sz w:val="24"/>
         </w:rPr>
-        <w:t>从工程实现结果看，本文系统已经覆盖校园社交匹配推荐的主要业务链路。系统能够维护用户与标签关系，生成用户画像，产生推荐候选，保存推荐结果，展示推荐解释，并记录用户反馈。透明链路页面、双视图对比和离线评估材料使推荐过程能够被观察和分析，测试用例、Maven 测试和治理检查则从功能正确性、模块边界、接口稳定性和构建可重复性等角度支撑系统验证。算法选择方面，系统对标签重叠匹配、Jaccard 标签集合相似度、普通 TF-IDF 画像余弦相似度、改进 TF-IDF 画像算法以及改进 TF-IDF + 场景规则重排五类方案进行了对比，最终选择能够同时保留画像权重、校园规则、可信连接和解释证据的完整链路方案。与简单的标签匹配原型相比，本文系统更加重视推荐依据的结构化记录和工程链路的完整性；与以大语言模型直接生成推荐理由的做法相比，本文系统将大语言模型限制在基于证据的解释文本改写环节，避免外部模型改变推荐排序依据，从而降低解释与推荐结果不一致的风险。</w:t>
+        <w:t>从工程实现结果看，本系统已经覆盖校园社交匹配推荐的主要业务链路。系统能够维护用户与标签关系，生成用户画像，产生推荐候选，保存推荐结果，展示推荐解释，并记录用户反馈。透明链路页面、双视图对比和离线评估材料使推荐过程能够被观察和分析，测试用例、Maven 测试和治理检查则从功能正确性、模块边界、接口稳定性和构建可重复性等角度支撑系统验证。算法选择方面，系统对标签重叠匹配、Jaccard 标签集合相似度、普通 TF-IDF 画像余弦相似度、改进 TF-IDF 画像算法以及改进 TF-IDF + 场景规则重排五类方案进行了对比，最终选择能够同时保留画像权重、校园规则、可信连接和解释证据的完整链路方案。系统还补充了固定种子的扩展评估能力，可以在不写入业务数据库的前提下生成 100、300 和 500 用户规模的评估数据，并导出规模化算法指标。与简单的标签匹配原型相比，本系统更加重视推荐依据的结构化记录和工程链路的完整性；与以大语言模型直接生成推荐理由的做法相比，本系统将大语言模型限制在基于证据的解释文本改写环节，避免外部模型改变推荐排序依据，从而降低解释与推荐结果不一致的风险。</w:t>
       </w:r>
     </w:p>
     <w:p>
@@ -39867,7 +41048,7 @@
           <w:b w:val="0"/>
           <w:sz w:val="24"/>
         </w:rPr>
-        <w:t>本文工作的局限也需要明确说明。首先，系统当前重点解决校园用户匹配推荐的核心链路，尚未扩展到即时通信、消息通知、关系链运营和长期活跃度维护等完整社交产品能力。其次，年级差、专业相关性、可信连接分和探索比例等参数主要基于规则配置，虽然便于解释和调试，但参数实验的覆盖范围仍有限，尚不能充分说明不同校园群体、不同活动场景下的最优取值。再次，系统验证以功能性测试、非功能性测试用例和离线评估为主，对高并发访问、大规模用户画像更新和长周期在线反馈效果的测试仍不充分。最后，当前演示数据和评估材料能够支撑毕业设计场景下的功能验证，但与真实校园长期运行环境相比，数据规模、行为噪声和用户反馈复杂度仍有差距，离线评估中使用的代理相关性规则也不能完全替代真实用户满意度。</w:t>
+        <w:t>系统仍存在以下局限。首先，系统当前重点解决校园用户匹配推荐的核心链路，尚未扩展到即时通信、消息通知、关系链运营和长期活跃度维护等完整社交产品能力。其次，年级差、专业相关性、可信连接分和探索比例等参数主要基于规则配置，虽然便于解释和调试，但参数实验的覆盖范围仍有限，尚不能充分说明不同校园群体、不同活动场景下的最优取值。再次，系统验证以功能性测试、非功能性测试用例、离线评估和固定种子扩展评估为主，对高并发访问、大规模用户画像更新和长周期在线反馈效果的测试仍不充分。最后，当前演示数据和扩展评估材料能够支撑功能验证与规模复核，但与真实校园长期运行环境相比，行为噪声、数据授权、用户反馈复杂度和在线满意度仍有差距，离线评估中使用的代理相关性规则也不能完全替代真实用户满意度。</w:t>
       </w:r>
     </w:p>
     <w:p>
@@ -39888,6 +41069,7 @@
       </w:r>
     </w:p>
     <w:p>
+      <w:bookmarkStart w:id="53" w:name="_TocLCJ053"/>
       <w:pPr>
         <w:pStyle w:val="2"/>
         <w:keepNext/>
@@ -39903,6 +41085,7 @@
         </w:rPr>
         <w:t>系统展望</w:t>
       </w:r>
+      <w:bookmarkEnd w:id="53"/>
     </w:p>
     <w:p>
       <w:pPr>
@@ -39969,7 +41152,7 @@
           <w:b w:val="0"/>
           <w:sz w:val="24"/>
         </w:rPr>
-        <w:t>在性能和工程化方面，后续可以补充更完整的压力测试与监控能力。随着用户规模扩大，画像重建、倒排集合维护、推荐结果持久化和解释生成都可能成为性能瓶颈。系统可以进一步引入定时画像刷新、异步反馈处理、推荐结果缓存和关键接口监控，减少实时请求路径上的计算压力。构建流程也可以继续完善，将治理检查、单元测试、接口测试、文档生成和演示数据校验纳入统一流水线，使系统在持续迭代中保持可验证状态。</w:t>
+        <w:t>在性能和工程化方面，后续可以在现有扩展评估链路基础上补充更完整的压力测试与监控能力。随着用户规模扩大，画像重建、倒排集合维护、推荐结果持久化和解释生成都可能成为性能瓶颈。系统可以进一步引入定时画像刷新、异步反馈处理、推荐结果缓存和关键接口监控，减少实时请求路径上的计算压力。构建流程也可以继续完善，将治理检查、单元测试、接口测试、扩展数据生成、评估导出、文档生成和演示数据校验纳入统一流水线，使系统在持续迭代中保持可验证状态。</w:t>
       </w:r>
     </w:p>
     <w:p>
@@ -40003,7 +41186,7 @@
           <w:b w:val="0"/>
           <w:sz w:val="24"/>
         </w:rPr>
-        <w:t>从长期建设角度看，后续还可以将系统沉淀为校园数字化服务中的可复用推荐能力，而不是只服务单一演示入口。推荐链路中的画像生成、候选召回、规则重排、解释证据和反馈更新可以通过清晰接口向课程搭子、社团招新、竞赛组队和项目协作等场景复用，各业务场景只需要配置不同的规则权重、数据边界和解释模板。这样既能够保持系统实现的一致性，也便于在真实运行过程中统一观察推荐质量、用户反馈和异常结果。</w:t>
+        <w:t>从长期建设角度看，系统可以沉淀为校园数字化服务中的可复用推荐能力。推荐链路中的画像生成、候选召回、规则重排、解释证据和反馈更新可以通过清晰接口向课程搭子、社团招新、竞赛组队和项目协作等场景复用，各业务场景只需要配置不同的规则权重、数据边界和解释模板。这样既能够保持系统实现的一致性，也便于在真实运行过程中统一观察推荐质量、用户反馈和异常结果。</w:t>
       </w:r>
     </w:p>
     <w:p>
@@ -40042,6 +41225,7 @@
       </w:pPr>
     </w:p>
     <w:p>
+      <w:bookmarkStart w:id="54" w:name="_TocLCJ054"/>
       <w:pPr>
         <w:pStyle w:val="af0"/>
         <w:keepNext/>
@@ -40058,6 +41242,7 @@
         </w:rPr>
         <w:t>参考文献</w:t>
       </w:r>
+      <w:bookmarkEnd w:id="54"/>
     </w:p>
     <w:p>
       <w:pPr>
@@ -40073,7 +41258,7 @@
           <w:b w:val="0"/>
           <w:sz w:val="21"/>
         </w:rPr>
-        <w:t>[1] Tang J, Hu X, Liu H. Social recommendation: a review [J]. Social Network Analysis and Mining, 2013, 3(4): 1113-1133.</w:t>
+        <w:t>[1] TANG J, HU X, LIU H. Social recommendation: a review[J]. Social Network Analysis and Mining, 2013, 3(4): 1113-1133.</w:t>
       </w:r>
     </w:p>
     <w:p>
@@ -40090,7 +41275,7 @@
           <w:b w:val="0"/>
           <w:sz w:val="21"/>
         </w:rPr>
-        <w:t>[2] Liben-Nowell D, Kleinberg J. The link-prediction problem for social networks [J]. Journal of the American Society for Information Science and Technology, 2007, 58(7): 1019-1031.</w:t>
+        <w:t>[2] LIBEN-NOWELL D, KLEINBERG J. The link-prediction problem for social networks[J]. Journal of the American Society for Information Science and Technology, 2007, 58(7): 1019-1031.</w:t>
       </w:r>
     </w:p>
     <w:p>
@@ -40107,7 +41292,7 @@
           <w:b w:val="0"/>
           <w:sz w:val="21"/>
         </w:rPr>
-        <w:t>[3] Guy I, Ronen I, Wilcox E. Do you know? Recommending people to invite into your social network [C]// Proceedings of the 13th International Conference on Intelligent User Interfaces. New York: ACM, 2009: 77-86.</w:t>
+        <w:t>[3] GUY I, RONEN I, WILCOX E. Do you know? Recommending people to invite into your social network[C]//Proceedings of the 13th International Conference on Intelligent User Interfaces. New York: ACM, 2009: 77-86.</w:t>
       </w:r>
     </w:p>
     <w:p>
@@ -40124,7 +41309,7 @@
           <w:b w:val="0"/>
           <w:sz w:val="21"/>
         </w:rPr>
-        <w:t>[4] Drachsler H, Verbert K, Santos O C, Manouselis N. Panorama of recommender systems to support learning [M]// Ricci F, Rokach L, Shapira B. Recommender Systems Handbook. 2nd ed. Boston: Springer, 2015: 421-451.</w:t>
+        <w:t>[4] DRACHSLER H, VERBERT K, SANTOS O C, et al. Panorama of recommender systems to support learning[M]//RICCI F, ROKACH L, SHAPIRA B, et al. Recommender Systems Handbook. 2nd ed. Boston: Springer, 2015: 421-451.</w:t>
       </w:r>
     </w:p>
     <w:p>
@@ -40141,7 +41326,7 @@
           <w:b w:val="0"/>
           <w:sz w:val="21"/>
         </w:rPr>
-        <w:t>[5] Klašnja-Milićević A, Ivanović M, Nanopoulos A. Recommender systems in e-learning environments: a survey of the state-of-the-art and possible extensions [J]. Artificial Intelligence Review, 2015, 44(4): 571-604.</w:t>
+        <w:t>[5] KLAŠNJA-MILIĆEVIĆ A, IVANOVIĆ M, NANOPOULOS A. Recommender systems in e-learning environments: a survey of the state-of-the-art and possible extensions[J]. Artificial Intelligence Review, 2015, 44(4): 571-604.</w:t>
       </w:r>
     </w:p>
     <w:p>
@@ -40158,7 +41343,7 @@
           <w:b w:val="0"/>
           <w:sz w:val="21"/>
         </w:rPr>
-        <w:t>[6] 彭舰, 王屯屯, 陈瑜, 等. 基于跨平台的在线社交网络用户推荐研究 [J]. 通信学报, 2018, 39(3): 147-158.</w:t>
+        <w:t>[6] 彭舰, 王屯屯, 陈瑜, 等. 基于跨平台的在线社交网络用户推荐研究[J]. 通信学报, 2018, 39(3): 147-158.</w:t>
       </w:r>
     </w:p>
     <w:p>
@@ -40175,7 +41360,7 @@
           <w:b w:val="0"/>
           <w:sz w:val="21"/>
         </w:rPr>
-        <w:t>[7] 刘芳, 田枫, 李欣, 等. 融入学习者模型在线学习资源协同过滤推荐方法 [J]. 智能系统学报, 2021, 16(6): 1117-1125.</w:t>
+        <w:t>[7] 刘芳, 田枫, 李欣, 等. 融入学习者模型在线学习资源协同过滤推荐方法[J]. 智能系统学报, 2021, 16(6): 1117-1125.</w:t>
       </w:r>
     </w:p>
     <w:p>
@@ -40192,7 +41377,7 @@
           <w:b w:val="0"/>
           <w:sz w:val="21"/>
         </w:rPr>
-        <w:t>[8] 王刚, 郭雪梅. 社交网络环境下基于用户响应的推荐方法研究 [J]. 情报工程, 2019, 5(1): 37-44.</w:t>
+        <w:t>[8] 王刚, 郭雪梅. 社交网络环境下基于用户响应的推荐方法研究[J]. 情报工程, 2019, 5(1): 37-44.</w:t>
       </w:r>
     </w:p>
     <w:p>
@@ -40209,7 +41394,7 @@
           <w:b w:val="0"/>
           <w:sz w:val="21"/>
         </w:rPr>
-        <w:t>[9] Roy D, Dutta M. A systematic review and research perspective on recommender systems [J]. Journal of Big Data, 2022, 9(1): 59.</w:t>
+        <w:t>[9] ROY D, DUTTA M. A systematic review and research perspective on recommender systems[J]. Journal of Big Data, 2022, 9(1): 59.</w:t>
       </w:r>
     </w:p>
     <w:p>
@@ -40226,7 +41411,7 @@
           <w:b w:val="0"/>
           <w:sz w:val="21"/>
         </w:rPr>
-        <w:t>[10] 余江龙, 宋腾飞, 汪德超, 等. 个性化推荐系统研究方法综述 [J]. 电脑知识与技术, 2024, 20(10): 46-49.</w:t>
+        <w:t>[10] 余江龙, 宋腾飞, 汪德超, 等. 个性化推荐系统研究方法综述[J]. 电脑知识与技术, 2024, 20(10): 46-49.</w:t>
       </w:r>
     </w:p>
     <w:p>
@@ -40243,7 +41428,7 @@
           <w:b w:val="0"/>
           <w:sz w:val="21"/>
         </w:rPr>
-        <w:t>[11] Lops P, de Gemmis M, Semeraro G. Content-based recommender systems: State of the art and trends [M]// Ricci F, Rokach L, Shapira B, Kantor P B. Recommender Systems Handbook. Boston: Springer, 2011: 73-105.</w:t>
+        <w:t>[11] LOPS P, DE GEMMIS M, SEMERARO G. Content-based recommender systems: state of the art and trends[M]//RICCI F, ROKACH L, SHAPIRA B, et al. Recommender Systems Handbook. Boston: Springer, 2011: 73-105.</w:t>
       </w:r>
     </w:p>
     <w:p>
@@ -40260,7 +41445,7 @@
           <w:b w:val="0"/>
           <w:sz w:val="21"/>
         </w:rPr>
-        <w:t>[12] Salton G, Buckley C. Term-weighting approaches in automatic text retrieval [J]. Information Processing &amp; Management, 1988, 24(5): 513-523.</w:t>
+        <w:t>[12] SALTON G, BUCKLEY C. Term-weighting approaches in automatic text retrieval[J]. Information Processing &amp; Management, 1988, 24(5): 513-523.</w:t>
       </w:r>
     </w:p>
     <w:p>
@@ -40277,7 +41462,7 @@
           <w:b w:val="0"/>
           <w:sz w:val="21"/>
         </w:rPr>
-        <w:t>[13] 白雨珂, 卢胜男. 基于改进的 TF-IDF 标签权重算法的电商用户画像构建 [J]. 信息技术与信息化, 2024(8): 48-51.</w:t>
+        <w:t>[13] 白雨珂, 卢胜男. 基于改进的 TF-IDF 标签权重算法的电商用户画像构建[J]. 信息技术与信息化, 2024(8): 48-51.</w:t>
       </w:r>
     </w:p>
     <w:p>
@@ -40294,7 +41479,7 @@
           <w:b w:val="0"/>
           <w:sz w:val="21"/>
         </w:rPr>
-        <w:t>[14] Resnick P, Iacovou N, Suchak M, Bergstrom P, Riedl J. GroupLens: An open architecture for collaborative filtering of netnews [C]// Proceedings of the 1994 ACM Conference on Computer Supported Cooperative Work. Chapel Hill: ACM, 1994: 175-186.</w:t>
+        <w:t>[14] RESNICK P, IACOVOU N, SUCHAK M, et al. GroupLens: an open architecture for collaborative filtering of netnews[C]//Proceedings of the 1994 ACM Conference on Computer Supported Cooperative Work. Chapel Hill: ACM, 1994: 175-186.</w:t>
       </w:r>
     </w:p>
     <w:p>
@@ -40311,7 +41496,7 @@
           <w:b w:val="0"/>
           <w:sz w:val="21"/>
         </w:rPr>
-        <w:t>[15] Hu Y, Koren Y, Volinsky C. Collaborative filtering for implicit feedback datasets [C]// Proceedings of the 8th IEEE International Conference on Data Mining. Pisa: IEEE, 2008: 263-272.</w:t>
+        <w:t>[15] HU Y, KOREN Y, VOLINSKY C. Collaborative filtering for implicit feedback datasets[C]//Proceedings of the 8th IEEE International Conference on Data Mining. Pisa: IEEE, 2008: 263-272.</w:t>
       </w:r>
     </w:p>
     <w:p>
@@ -40328,7 +41513,7 @@
           <w:b w:val="0"/>
           <w:sz w:val="21"/>
         </w:rPr>
-        <w:t>[16] Koren Y, Bell R, Volinsky C. Matrix factorization techniques for recommender systems [J]. Computer, 2009, 42(8): 30-37.</w:t>
+        <w:t>[16] KOREN Y, BELL R, VOLINSKY C. Matrix factorization techniques for recommender systems[J]. Computer, 2009, 42(8): 30-37.</w:t>
       </w:r>
     </w:p>
     <w:p>
@@ -40345,7 +41530,7 @@
           <w:b w:val="0"/>
           <w:sz w:val="21"/>
         </w:rPr>
-        <w:t>[17] 俞军. 基于协同过滤的推荐系统方法研究 [D]. 大连: 大连交通大学, 2024.</w:t>
+        <w:t>[17] 俞军. 基于协同过滤的推荐系统方法研究[D]. 大连: 大连交通大学, 2024.</w:t>
       </w:r>
     </w:p>
     <w:p>
@@ -40362,7 +41547,7 @@
           <w:b w:val="0"/>
           <w:sz w:val="21"/>
         </w:rPr>
-        <w:t>[18] 刘珣. 基于协同过滤算法的书籍推荐系统的研究与实现 [D]. 大连: 大连交通大学, 2024.</w:t>
+        <w:t>[18] 刘珣. 基于协同过滤算法的书籍推荐系统的研究与实现[D]. 大连: 大连交通大学, 2024.</w:t>
       </w:r>
     </w:p>
     <w:p>
@@ -40379,7 +41564,7 @@
           <w:b w:val="0"/>
           <w:sz w:val="21"/>
         </w:rPr>
-        <w:t>[19] 邢艳芳. 基于协同过滤算法的电影推荐系统设计与实现 [J]. 信息技术, 2025(5): 9-14.</w:t>
+        <w:t>[19] 邢艳芳. 基于协同过滤算法的电影推荐系统设计与实现[J]. 信息技术, 2025(5): 9-14.</w:t>
       </w:r>
     </w:p>
     <w:p>
@@ -40396,7 +41581,7 @@
           <w:b w:val="0"/>
           <w:sz w:val="21"/>
         </w:rPr>
-        <w:t>[20] Zhang Y, Chen X. Explainable recommendation: A survey and new perspectives [J]. Foundations and Trends in Information Retrieval, 2020, 14(1): 1-101.</w:t>
+        <w:t>[20] ZHANG Y, CHEN X. Explainable recommendation: a survey and new perspectives[J]. Foundations and Trends in Information Retrieval, 2020, 14(1): 1-101.</w:t>
       </w:r>
     </w:p>
     <w:p>
@@ -40413,7 +41598,7 @@
           <w:b w:val="0"/>
           <w:sz w:val="21"/>
         </w:rPr>
-        <w:t>[21] 吕学强, 王夏雨, 马登豪. 面向推荐系统的用户兴趣建模综述 [J]. 计算机工程与应用, 2025, 61(21): 15.</w:t>
+        <w:t>[21] 吕学强, 王夏雨, 马登豪. 面向推荐系统的用户兴趣建模综述[J]. 计算机工程与应用, 2025, 61(21): 15.</w:t>
       </w:r>
     </w:p>
     <w:p>
@@ -40430,7 +41615,7 @@
           <w:b w:val="0"/>
           <w:sz w:val="21"/>
         </w:rPr>
-        <w:t>[22] 史鸿旭, 刘艺, 刘坤. 基于大语言模型的推荐系统综述 [J/OL]. 计算机科学, 2026-02-05.</w:t>
+        <w:t>[22] 谢广明, 白彦冰, 吴子昂, 等. 基于大语言模型的推荐系统综述[J]. 智能系统学报, 2025, 20(6): 1520-1533.</w:t>
       </w:r>
     </w:p>
     <w:p>
@@ -40447,7 +41632,7 @@
           <w:b w:val="0"/>
           <w:sz w:val="21"/>
         </w:rPr>
-        <w:t>[23] Burke R. Hybrid recommender systems: Survey and experiments [J]. User Modeling and User-Adapted Interaction, 2002, 12(4): 331-370.</w:t>
+        <w:t>[23] BURKE R. Hybrid recommender systems: survey and experiments[J]. User Modeling and User-Adapted Interaction, 2002, 12(4): 331-370.</w:t>
       </w:r>
     </w:p>
     <w:p>
@@ -40464,7 +41649,7 @@
           <w:b w:val="0"/>
           <w:sz w:val="21"/>
         </w:rPr>
-        <w:t>[24] Adomavicius G, Tuzhilin A. Toward the next generation of recommender systems: a survey of the state-of-the-art and possible extensions [J]. IEEE Transactions on Knowledge and Data Engineering, 2005, 17(6): 734-749.</w:t>
+        <w:t>[24] ADOMAVICIUS G, TUZHILIN A. Toward the next generation of recommender systems: a survey of the state-of-the-art and possible extensions[J]. IEEE Transactions on Knowledge and Data Engineering, 2005, 17(6): 734-749.</w:t>
       </w:r>
     </w:p>
     <w:p>
@@ -40481,7 +41666,7 @@
           <w:b w:val="0"/>
           <w:sz w:val="21"/>
         </w:rPr>
-        <w:t>[25] Bobadilla J, Ortega F, Hernando A, Gutiérrez A. Recommender systems survey [J]. Knowledge-Based Systems, 2013, 46: 109-132.</w:t>
+        <w:t>[25] BOBADILLA J, ORTEGA F, HERNANDO A, et al. Recommender systems survey[J]. Knowledge-Based Systems, 2013, 46: 109-132.</w:t>
       </w:r>
     </w:p>
     <w:p>
@@ -40498,7 +41683,7 @@
           <w:b w:val="0"/>
           <w:sz w:val="21"/>
         </w:rPr>
-        <w:t>[26] Konstan J A, Riedl J. Recommender systems: from algorithms to user experience [J]. User Modeling and User-Adapted Interaction, 2012, 22(1-2): 101-123.</w:t>
+        <w:t>[26] KONSTAN J A, RIEDL J. Recommender systems: from algorithms to user experience[J]. User Modeling and User-Adapted Interaction, 2012, 22(1/2): 101-123.</w:t>
       </w:r>
     </w:p>
     <w:p>
@@ -40515,7 +41700,7 @@
           <w:b w:val="0"/>
           <w:sz w:val="21"/>
         </w:rPr>
-        <w:t>[27] Pu P, Chen L, Hu R. Evaluating recommender systems from the user's perspective: survey of the state of the art [J]. User Modeling and User-Adapted Interaction, 2012, 22(4-5): 317-355.</w:t>
+        <w:t>[27] PU P, CHEN L, HU R. Evaluating recommender systems from the user's perspective: survey of the state of the art[J]. User Modeling and User-Adapted Interaction, 2012, 22(4/5): 317-355.</w:t>
       </w:r>
     </w:p>
     <w:p>
@@ -40532,7 +41717,7 @@
           <w:b w:val="0"/>
           <w:sz w:val="21"/>
         </w:rPr>
-        <w:t>[28] Ma H, King I, Lyu M R. Learning to recommend with social trust ensemble [C]// Proceedings of the 32nd International ACM SIGIR Conference on Research and Development in Information Retrieval. New York: ACM, 2009: 203-210.</w:t>
+        <w:t>[28] MA H, KING I, LYU M R. Learning to recommend with social trust ensemble[C]//Proceedings of the 32nd International ACM SIGIR Conference on Research and Development in Information Retrieval. New York: ACM, 2009: 203-210.</w:t>
       </w:r>
     </w:p>
     <w:p>
@@ -40549,7 +41734,7 @@
           <w:b w:val="0"/>
           <w:sz w:val="21"/>
         </w:rPr>
-        <w:t>[29] Guo G, Zhang J, Yorke-Smith N. TrustSVD: collaborative filtering with both the explicit and implicit influence of user trust and of item ratings [C]// Proceedings of the Twenty-Ninth AAAI Conference on Artificial Intelligence. Palo Alto: AAAI Press, 2015: 123-129.</w:t>
+        <w:t>[29] GUO G, ZHANG J, YORKE-SMITH N. TrustSVD: collaborative filtering with both the explicit and implicit influence of user trust and of item ratings[C]//Proceedings of the Twenty-Ninth AAAI Conference on Artificial Intelligence. Palo Alto: AAAI Press, 2015: 123-129.</w:t>
       </w:r>
     </w:p>
     <w:p>
@@ -40566,7 +41751,7 @@
           <w:b w:val="0"/>
           <w:sz w:val="21"/>
         </w:rPr>
-        <w:t>[30] Palomares I, Porcel C, Pizzato L, Guy I, Herrera-Viedma E. Reciprocal recommender systems: analysis of state-of-art literature, challenges and opportunities towards social recommendation [J]. Information Fusion, 2021, 69: 103-127.</w:t>
+        <w:t>[30] PALOMARES I, PORCEL C, PIZZATO L, et al. Reciprocal recommender systems: analysis of state-of-art literature, challenges and opportunities towards social recommendation[J]. Information Fusion, 2021, 69: 103-127.</w:t>
       </w:r>
     </w:p>
     <w:p>
@@ -40583,7 +41768,7 @@
           <w:b w:val="0"/>
           <w:sz w:val="21"/>
         </w:rPr>
-        <w:t>[31] Wu L, Zheng Z, Qiu Z, Wang H, Gu H, Shen T, Qin C, Zhu C, Zhu H, Liu Q, Xiong H, Chen E. A survey on large language models for recommendation [J/OL]. arXiv, 2023.</w:t>
+        <w:t>[31] WU L, ZHENG Z, QIU Z, et al. A survey on large language models for recommendation[J]. World Wide Web, 2024, 27(5): 60.</w:t>
       </w:r>
     </w:p>
     <w:p>
@@ -40603,6 +41788,7 @@
       </w:pPr>
     </w:p>
     <w:p>
+      <w:bookmarkStart w:id="55" w:name="_TocLCJ055"/>
       <w:pPr>
         <w:pStyle w:val="af0"/>
         <w:keepNext/>
@@ -40619,6 +41805,7 @@
         </w:rPr>
         <w:t>致    谢</w:t>
       </w:r>
+      <w:bookmarkEnd w:id="55"/>
     </w:p>
     <w:sectPr>
       <w:headerReference w:type="default" r:id="rId41"/>

</xml_diff>